<commit_message>
Assignment 4: RandomForest pt1
</commit_message>
<xml_diff>
--- a/Assignment-4/CGS4144_Assn4.docx
+++ b/Assignment-4/CGS4144_Assn4.docx
@@ -1,6 +1,6 @@
 
 <file path=word/document.xml><?xml version="1.0" encoding="utf-8"?>
-<w:document xmlns:wpc="http://schemas.microsoft.com/office/word/2010/wordprocessingCanvas" xmlns:cx="http://schemas.microsoft.com/office/drawing/2014/chartex" xmlns:cx1="http://schemas.microsoft.com/office/drawing/2015/9/8/chartex" xmlns:cx2="http://schemas.microsoft.com/office/drawing/2015/10/21/chartex" xmlns:cx3="http://schemas.microsoft.com/office/drawing/2016/5/9/chartex" xmlns:cx4="http://schemas.microsoft.com/office/drawing/2016/5/10/chartex" xmlns:cx5="http://schemas.microsoft.com/office/drawing/2016/5/11/chartex" xmlns:cx6="http://schemas.microsoft.com/office/drawing/2016/5/12/chartex" xmlns:cx7="http://schemas.microsoft.com/office/drawing/2016/5/13/chartex" xmlns:cx8="http://schemas.microsoft.com/office/drawing/2016/5/14/chartex" xmlns:mc="http://schemas.openxmlformats.org/markup-compatibility/2006" xmlns:aink="http://schemas.microsoft.com/office/drawing/2016/ink" xmlns:am3d="http://schemas.microsoft.com/office/drawing/2017/model3d" xmlns:o="urn:schemas-microsoft-com:office:office" xmlns:oel="http://schemas.microsoft.com/office/2019/extlst" xmlns:r="http://schemas.openxmlformats.org/officeDocument/2006/relationships" xmlns:m="http://schemas.openxmlformats.org/officeDocument/2006/math" xmlns:v="urn:schemas-microsoft-com:vml" xmlns:wp14="http://schemas.microsoft.com/office/word/2010/wordprocessingDrawing" xmlns:wp="http://schemas.openxmlformats.org/drawingml/2006/wordprocessingDrawing" xmlns:w10="urn:schemas-microsoft-com:office:word" xmlns:w="http://schemas.openxmlformats.org/wordprocessingml/2006/main" xmlns:w14="http://schemas.microsoft.com/office/word/2010/wordml" xmlns:w15="http://schemas.microsoft.com/office/word/2012/wordml" xmlns:w16cex="http://schemas.microsoft.com/office/word/2018/wordml/cex" xmlns:w16cid="http://schemas.microsoft.com/office/word/2016/wordml/cid" xmlns:w16="http://schemas.microsoft.com/office/word/2018/wordml" xmlns:w16du="http://schemas.microsoft.com/office/word/2023/wordml/word16du" xmlns:w16sdtdh="http://schemas.microsoft.com/office/word/2020/wordml/sdtdatahash" xmlns:w16sdtfl="http://schemas.microsoft.com/office/word/2024/wordml/sdtformatlock" xmlns:w16se="http://schemas.microsoft.com/office/word/2015/wordml/symex" xmlns:wpg="http://schemas.microsoft.com/office/word/2010/wordprocessingGroup" xmlns:wpi="http://schemas.microsoft.com/office/word/2010/wordprocessingInk" xmlns:wne="http://schemas.microsoft.com/office/word/2006/wordml" xmlns:wps="http://schemas.microsoft.com/office/word/2010/wordprocessingShape" mc:Ignorable="w14 w15 w16se w16cid w16 w16cex w16sdtdh w16sdtfl w16du wp14">
+<w:document xmlns:wpc="http://schemas.microsoft.com/office/word/2010/wordprocessingCanvas" xmlns:cx="http://schemas.microsoft.com/office/drawing/2014/chartex" xmlns:cx1="http://schemas.microsoft.com/office/drawing/2015/9/8/chartex" xmlns:cx2="http://schemas.microsoft.com/office/drawing/2015/10/21/chartex" xmlns:cx3="http://schemas.microsoft.com/office/drawing/2016/5/9/chartex" xmlns:cx4="http://schemas.microsoft.com/office/drawing/2016/5/10/chartex" xmlns:cx5="http://schemas.microsoft.com/office/drawing/2016/5/11/chartex" xmlns:cx6="http://schemas.microsoft.com/office/drawing/2016/5/12/chartex" xmlns:cx7="http://schemas.microsoft.com/office/drawing/2016/5/13/chartex" xmlns:cx8="http://schemas.microsoft.com/office/drawing/2016/5/14/chartex" xmlns:mc="http://schemas.openxmlformats.org/markup-compatibility/2006" xmlns:aink="http://schemas.microsoft.com/office/drawing/2016/ink" xmlns:am3d="http://schemas.microsoft.com/office/drawing/2017/model3d" xmlns:o="urn:schemas-microsoft-com:office:office" xmlns:oel="http://schemas.microsoft.com/office/2019/extlst" xmlns:r="http://schemas.openxmlformats.org/officeDocument/2006/relationships" xmlns:m="http://schemas.openxmlformats.org/officeDocument/2006/math" xmlns:v="urn:schemas-microsoft-com:vml" xmlns:wp14="http://schemas.microsoft.com/office/word/2010/wordprocessingDrawing" xmlns:wp="http://schemas.openxmlformats.org/drawingml/2006/wordprocessingDrawing" xmlns:w10="urn:schemas-microsoft-com:office:word" xmlns:w="http://schemas.openxmlformats.org/wordprocessingml/2006/main" xmlns:w14="http://schemas.microsoft.com/office/word/2010/wordml" xmlns:w15="http://schemas.microsoft.com/office/word/2012/wordml" xmlns:w16cex="http://schemas.microsoft.com/office/word/2018/wordml/cex" xmlns:w16cid="http://schemas.microsoft.com/office/word/2016/wordml/cid" xmlns:w16="http://schemas.microsoft.com/office/word/2018/wordml" xmlns:w16du="http://schemas.microsoft.com/office/word/2023/wordml/word16du" xmlns:w16sdtdh="http://schemas.microsoft.com/office/word/2020/wordml/sdtdatahash" xmlns:w16se="http://schemas.microsoft.com/office/word/2015/wordml/symex" xmlns:wpg="http://schemas.microsoft.com/office/word/2010/wordprocessingGroup" xmlns:wpi="http://schemas.microsoft.com/office/word/2010/wordprocessingInk" xmlns:wne="http://schemas.microsoft.com/office/word/2006/wordml" xmlns:wps="http://schemas.microsoft.com/office/word/2010/wordprocessingShape" mc:Ignorable="w14 w15 w16se w16cid w16 w16cex w16sdtdh w16du wp14">
   <w:body>
     <w:p>
       <w:pPr>
@@ -278,7 +278,7 @@
               </wp:anchor>
             </w:drawing>
           </mc:Choice>
-          <mc:Fallback xmlns:w16cei="http://schemas.microsoft.com/office/word/2026/wordml/cei">
+          <mc:Fallback xmlns:w16cei="http://schemas.microsoft.com/office/word/2026/wordml/cei" xmlns:w16sdtfl="http://schemas.microsoft.com/office/word/2024/wordml/sdtformatlock">
             <w:pict>
               <v:line w14:anchorId="7AAC89D5" id="Straight Connector 3" o:spid="_x0000_s1026" style="position:absolute;z-index:251663360;visibility:visible;mso-wrap-style:square;mso-wrap-distance-left:9pt;mso-wrap-distance-top:0;mso-wrap-distance-right:9pt;mso-wrap-distance-bottom:0;mso-position-horizontal:absolute;mso-position-horizontal-relative:text;mso-position-vertical:absolute;mso-position-vertical-relative:text" from="0,-.05pt" to="542.2pt,-.05pt" o:gfxdata="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" strokecolor="#bdd6ee [1300]" strokeweight="1pt">
                 <v:stroke joinstyle="miter"/>
@@ -807,7 +807,7 @@
               </wp:anchor>
             </w:drawing>
           </mc:Choice>
-          <mc:Fallback xmlns:w16cei="http://schemas.microsoft.com/office/word/2026/wordml/cei">
+          <mc:Fallback xmlns:w16cei="http://schemas.microsoft.com/office/word/2026/wordml/cei" xmlns:w16sdtfl="http://schemas.microsoft.com/office/word/2024/wordml/sdtformatlock">
             <w:pict>
               <v:line w14:anchorId="53C7DDC2" id="Straight Connector 1" o:spid="_x0000_s1026" style="position:absolute;z-index:251665408;visibility:visible;mso-wrap-style:square;mso-wrap-distance-left:9pt;mso-wrap-distance-top:0;mso-wrap-distance-right:9pt;mso-wrap-distance-bottom:0;mso-position-horizontal:absolute;mso-position-horizontal-relative:text;mso-position-vertical:absolute;mso-position-vertical-relative:text" from="-.3pt,14.45pt" to="541.9pt,14.45pt" o:gfxdata="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" strokecolor="#bdd6ee [1300]" strokeweight="1pt">
                 <v:stroke joinstyle="miter"/>
@@ -837,25 +837,7 @@
           <w:iCs/>
           <w:color w:val="064462"/>
         </w:rPr>
-        <w:t xml:space="preserve">Load the expression data and </w:t>
-      </w:r>
-      <w:proofErr w:type="gramStart"/>
-      <w:r>
-        <w:rPr>
-          <w:i/>
-          <w:iCs/>
-          <w:color w:val="064462"/>
-        </w:rPr>
-        <w:t>matching</w:t>
-      </w:r>
-      <w:proofErr w:type="gramEnd"/>
-      <w:r>
-        <w:rPr>
-          <w:i/>
-          <w:iCs/>
-          <w:color w:val="064462"/>
-        </w:rPr>
-        <w:t xml:space="preserve"> metadata that you processed in Assignment 2. </w:t>
+        <w:t xml:space="preserve">Load the expression data and matching metadata that you processed in Assignment 2. </w:t>
       </w:r>
     </w:p>
     <w:p>
@@ -1351,23 +1333,13 @@
           <w:color w:val="064462"/>
         </w:rPr>
       </w:pPr>
-      <w:proofErr w:type="gramStart"/>
-      <w:r>
-        <w:rPr>
-          <w:i/>
-          <w:iCs/>
-          <w:color w:val="064462"/>
-        </w:rPr>
-        <w:t>Have</w:t>
-      </w:r>
-      <w:proofErr w:type="gramEnd"/>
-      <w:r>
-        <w:rPr>
-          <w:i/>
-          <w:iCs/>
-          <w:color w:val="064462"/>
-        </w:rPr>
-        <w:t xml:space="preserve"> the algorithm</w:t>
+      <w:r>
+        <w:rPr>
+          <w:i/>
+          <w:iCs/>
+          <w:color w:val="064462"/>
+        </w:rPr>
+        <w:t>Have the algorithm</w:t>
       </w:r>
       <w:r>
         <w:rPr>
@@ -1513,95 +1485,27 @@
         <w:rPr>
           <w:color w:val="EE0000"/>
         </w:rPr>
-        <w:t xml:space="preserve">The K-means clustering approach from Assignment 3 was reproduced using k=2 and the 1,000 most variable genes. This configuration was selected because it showed the strongest association with TB versus </w:t>
+        <w:t xml:space="preserve">The K-means clustering approach from Assignment 3 was reproduced using k=2 and the 1,000 most variable genes. This configuration was selected because it showed the strongest association with TB versus healthy-control status in Assignment </w:t>
       </w:r>
       <w:proofErr w:type="gramStart"/>
       <w:r>
         <w:rPr>
           <w:color w:val="EE0000"/>
         </w:rPr>
-        <w:t>healthy</w:t>
+        <w:t xml:space="preserve">3 </w:t>
+      </w:r>
+      <w:r>
+        <w:rPr>
+          <w:color w:val="EE0000"/>
+        </w:rPr>
+        <w:t xml:space="preserve"> (</w:t>
       </w:r>
       <w:proofErr w:type="gramEnd"/>
       <w:r>
         <w:rPr>
           <w:color w:val="EE0000"/>
         </w:rPr>
-        <w:t xml:space="preserve">-control status in Assignment </w:t>
-      </w:r>
-      <w:proofErr w:type="gramStart"/>
-      <w:r>
-        <w:rPr>
-          <w:color w:val="EE0000"/>
-        </w:rPr>
-        <w:t>3</w:t>
-      </w:r>
-      <w:r>
-        <w:rPr>
-          <w:color w:val="EE0000"/>
-        </w:rPr>
-        <w:t xml:space="preserve"> </w:t>
-      </w:r>
-      <w:r>
-        <w:rPr>
-          <w:color w:val="EE0000"/>
-        </w:rPr>
-        <w:t xml:space="preserve"> </w:t>
-      </w:r>
-      <w:r>
-        <w:rPr>
-          <w:color w:val="EE0000"/>
-        </w:rPr>
-        <w:t>(</w:t>
-      </w:r>
-      <w:proofErr w:type="gramEnd"/>
-      <w:r>
-        <w:rPr>
-          <w:color w:val="EE0000"/>
-        </w:rPr>
-        <w:t>X^2</w:t>
-      </w:r>
-      <w:r>
-        <w:rPr>
-          <w:color w:val="EE0000"/>
-        </w:rPr>
-        <w:t xml:space="preserve"> = 46.00, adjusted </w:t>
-      </w:r>
-      <w:r>
-        <w:rPr>
-          <w:color w:val="EE0000"/>
-        </w:rPr>
-        <w:t>p</w:t>
-      </w:r>
-      <w:r>
-        <w:rPr>
-          <w:color w:val="EE0000"/>
-        </w:rPr>
-        <w:t xml:space="preserve"> </w:t>
-      </w:r>
-      <w:r>
-        <w:rPr>
-          <w:color w:val="EE0000"/>
-        </w:rPr>
-        <w:t>=</w:t>
-      </w:r>
-      <w:r>
-        <w:rPr>
-          <w:color w:val="EE0000"/>
-        </w:rPr>
-        <w:t xml:space="preserve"> 4.73 × 10</w:t>
-      </w:r>
-      <w:r>
-        <w:rPr>
-          <w:color w:val="EE0000"/>
-        </w:rPr>
-        <w:t>^-11</w:t>
-      </w:r>
-      <w:r>
-        <w:rPr>
-          <w:color w:val="EE0000"/>
-        </w:rPr>
-        <w:t>). The resulting clusters contained 430 and 389 samples.</w:t>
+        <w:t>X^2 = 46.00, adjusted p = 4.73 × 10^-11). The resulting clusters contained 430 and 389 samples.</w:t>
       </w:r>
     </w:p>
     <w:p>
@@ -1879,25 +1783,7 @@
           <w:iCs/>
           <w:color w:val="064462"/>
         </w:rPr>
-        <w:t xml:space="preserve">Calculate sample-specific </w:t>
-      </w:r>
-      <w:proofErr w:type="gramStart"/>
-      <w:r>
-        <w:rPr>
-          <w:i/>
-          <w:iCs/>
-          <w:color w:val="064462"/>
-        </w:rPr>
-        <w:t>area</w:t>
-      </w:r>
-      <w:proofErr w:type="gramEnd"/>
-      <w:r>
-        <w:rPr>
-          <w:i/>
-          <w:iCs/>
-          <w:color w:val="064462"/>
-        </w:rPr>
-        <w:t xml:space="preserve"> under the ROC curve (AUC)</w:t>
+        <w:t>Calculate sample-specific area under the ROC curve (AUC)</w:t>
       </w:r>
       <w:r>
         <w:rPr>
@@ -1921,43 +1807,7 @@
           <w:iCs/>
           <w:color w:val="064462"/>
         </w:rPr>
-        <w:t xml:space="preserve">To do this, generate a matrix of samples by models, where each cell is </w:t>
-      </w:r>
-      <w:proofErr w:type="gramStart"/>
-      <w:r>
-        <w:rPr>
-          <w:i/>
-          <w:iCs/>
-          <w:color w:val="064462"/>
-        </w:rPr>
-        <w:t>what class</w:t>
-      </w:r>
-      <w:proofErr w:type="gramEnd"/>
-      <w:r>
-        <w:rPr>
-          <w:i/>
-          <w:iCs/>
-          <w:color w:val="064462"/>
-        </w:rPr>
-        <w:t xml:space="preserve"> </w:t>
-      </w:r>
-      <w:proofErr w:type="gramStart"/>
-      <w:r>
-        <w:rPr>
-          <w:i/>
-          <w:iCs/>
-          <w:color w:val="064462"/>
-        </w:rPr>
-        <w:t>label</w:t>
-      </w:r>
-      <w:proofErr w:type="gramEnd"/>
-      <w:r>
-        <w:rPr>
-          <w:i/>
-          <w:iCs/>
-          <w:color w:val="064462"/>
-        </w:rPr>
-        <w:t xml:space="preserve"> the given model assigned to the given sample. </w:t>
+        <w:t xml:space="preserve">To do this, generate a matrix of samples by models, where each cell is what class label the given model assigned to the given sample. </w:t>
       </w:r>
       <w:r>
         <w:rPr>
@@ -2033,13 +1883,29 @@
     </w:p>
     <w:p>
       <w:pPr>
-        <w:ind w:left="1080"/>
         <w:rPr>
           <w:i/>
           <w:iCs/>
           <w:color w:val="EE0000"/>
         </w:rPr>
       </w:pPr>
+    </w:p>
+    <w:p>
+      <w:pPr>
+        <w:rPr>
+          <w:i/>
+          <w:iCs/>
+          <w:color w:val="EE0000"/>
+        </w:rPr>
+      </w:pPr>
+      <w:r>
+        <w:rPr>
+          <w:i/>
+          <w:iCs/>
+          <w:color w:val="EE0000"/>
+        </w:rPr>
+        <w:t xml:space="preserve">For the Random Forest model, it predicted whether a sample belonged to the healthy group or the tuberculosis group. In this case, 1 represents tuberculosis and 0 represents healthy. 164 samples were predicted to be tuberculosis while 1 sample was predicted to be healthy. </w:t>
+      </w:r>
     </w:p>
     <w:p>
       <w:pPr>
@@ -2339,6 +2205,7 @@
                 <w:iCs/>
                 <w:color w:val="EE0000"/>
               </w:rPr>
+              <w:lastRenderedPageBreak/>
               <w:t>Number of genes</w:t>
             </w:r>
           </w:p>
@@ -2410,7 +2277,6 @@
                 <w:iCs/>
                 <w:color w:val="EE0000"/>
               </w:rPr>
-              <w:lastRenderedPageBreak/>
               <w:t>10</w:t>
             </w:r>
           </w:p>
@@ -2694,6 +2560,407 @@
     </w:p>
     <w:p>
       <w:pPr>
+        <w:rPr>
+          <w:i/>
+          <w:iCs/>
+          <w:color w:val="EE0000"/>
+        </w:rPr>
+      </w:pPr>
+      <w:r>
+        <w:rPr>
+          <w:i/>
+          <w:iCs/>
+          <w:color w:val="EE0000"/>
+        </w:rPr>
+        <w:t>For the Random Forest classifier that uses 100 decision trees, testing with 10,100,1000, and 10,000 of the most variable genes produced the results in the table below. The accuracy increased from 93.3 percent to 94.4 percent going from 10 to 100 genes but only decreased from there. It went down to 93.9 percent then 92 percent from 1,000 genes to 10,000. Therefore, increasing the number of genes only increases the accuracy when going from 10, 100. The results suggest that drastically increasing the number of genes from there only decreases accuracy, but not by a significant amount.</w:t>
+      </w:r>
+    </w:p>
+    <w:tbl>
+      <w:tblPr>
+        <w:tblStyle w:val="TableGrid"/>
+        <w:tblW w:w="0" w:type="auto"/>
+        <w:tblLook w:val="04A0" w:firstRow="1" w:lastRow="0" w:firstColumn="1" w:lastColumn="0" w:noHBand="0" w:noVBand="1"/>
+      </w:tblPr>
+      <w:tblGrid>
+        <w:gridCol w:w="3385"/>
+        <w:gridCol w:w="3360"/>
+        <w:gridCol w:w="3630"/>
+      </w:tblGrid>
+      <w:tr>
+        <w:trPr>
+          <w:trHeight w:val="64"/>
+        </w:trPr>
+        <w:tc>
+          <w:tcPr>
+            <w:tcW w:w="3385" w:type="dxa"/>
+          </w:tcPr>
+          <w:p>
+            <w:pPr>
+              <w:rPr>
+                <w:i/>
+                <w:iCs/>
+                <w:color w:val="EE0000"/>
+              </w:rPr>
+            </w:pPr>
+            <w:r>
+              <w:rPr>
+                <w:i/>
+                <w:iCs/>
+                <w:color w:val="EE0000"/>
+              </w:rPr>
+              <w:t>Number of genes</w:t>
+            </w:r>
+          </w:p>
+        </w:tc>
+        <w:tc>
+          <w:tcPr>
+            <w:tcW w:w="3360" w:type="dxa"/>
+          </w:tcPr>
+          <w:p>
+            <w:pPr>
+              <w:rPr>
+                <w:i/>
+                <w:iCs/>
+                <w:color w:val="EE0000"/>
+              </w:rPr>
+            </w:pPr>
+            <w:r>
+              <w:rPr>
+                <w:i/>
+                <w:iCs/>
+                <w:color w:val="EE0000"/>
+              </w:rPr>
+              <w:t>Accuracy</w:t>
+            </w:r>
+          </w:p>
+        </w:tc>
+        <w:tc>
+          <w:tcPr>
+            <w:tcW w:w="3630" w:type="dxa"/>
+          </w:tcPr>
+          <w:p>
+            <w:pPr>
+              <w:rPr>
+                <w:i/>
+                <w:iCs/>
+                <w:color w:val="EE0000"/>
+              </w:rPr>
+            </w:pPr>
+            <w:r>
+              <w:rPr>
+                <w:i/>
+                <w:iCs/>
+                <w:color w:val="EE0000"/>
+              </w:rPr>
+              <w:t>AUC-ROC</w:t>
+            </w:r>
+          </w:p>
+        </w:tc>
+      </w:tr>
+      <w:tr>
+        <w:trPr>
+          <w:trHeight w:val="64"/>
+        </w:trPr>
+        <w:tc>
+          <w:tcPr>
+            <w:tcW w:w="3385" w:type="dxa"/>
+          </w:tcPr>
+          <w:p>
+            <w:pPr>
+              <w:rPr>
+                <w:i/>
+                <w:iCs/>
+                <w:color w:val="EE0000"/>
+              </w:rPr>
+            </w:pPr>
+            <w:r>
+              <w:rPr>
+                <w:i/>
+                <w:iCs/>
+                <w:color w:val="EE0000"/>
+              </w:rPr>
+              <w:t>10</w:t>
+            </w:r>
+          </w:p>
+        </w:tc>
+        <w:tc>
+          <w:tcPr>
+            <w:tcW w:w="3360" w:type="dxa"/>
+          </w:tcPr>
+          <w:p>
+            <w:pPr>
+              <w:rPr>
+                <w:i/>
+                <w:iCs/>
+                <w:color w:val="EE0000"/>
+              </w:rPr>
+            </w:pPr>
+            <w:r>
+              <w:rPr>
+                <w:i/>
+                <w:iCs/>
+                <w:color w:val="EE0000"/>
+              </w:rPr>
+              <w:t>0.9329268292682927</w:t>
+            </w:r>
+          </w:p>
+        </w:tc>
+        <w:tc>
+          <w:tcPr>
+            <w:tcW w:w="3630" w:type="dxa"/>
+          </w:tcPr>
+          <w:p>
+            <w:pPr>
+              <w:rPr>
+                <w:i/>
+                <w:iCs/>
+                <w:color w:val="EE0000"/>
+              </w:rPr>
+            </w:pPr>
+            <w:r>
+              <w:rPr>
+                <w:i/>
+                <w:iCs/>
+                <w:color w:val="EE0000"/>
+              </w:rPr>
+              <w:t>0.9668903803131991</w:t>
+            </w:r>
+          </w:p>
+        </w:tc>
+      </w:tr>
+      <w:tr>
+        <w:trPr>
+          <w:trHeight w:val="64"/>
+        </w:trPr>
+        <w:tc>
+          <w:tcPr>
+            <w:tcW w:w="3385" w:type="dxa"/>
+          </w:tcPr>
+          <w:p>
+            <w:pPr>
+              <w:rPr>
+                <w:i/>
+                <w:iCs/>
+                <w:color w:val="EE0000"/>
+              </w:rPr>
+            </w:pPr>
+            <w:r>
+              <w:rPr>
+                <w:i/>
+                <w:iCs/>
+                <w:color w:val="EE0000"/>
+              </w:rPr>
+              <w:t>100</w:t>
+            </w:r>
+          </w:p>
+        </w:tc>
+        <w:tc>
+          <w:tcPr>
+            <w:tcW w:w="3360" w:type="dxa"/>
+          </w:tcPr>
+          <w:p>
+            <w:pPr>
+              <w:rPr>
+                <w:i/>
+                <w:iCs/>
+                <w:color w:val="EE0000"/>
+              </w:rPr>
+            </w:pPr>
+            <w:r>
+              <w:rPr>
+                <w:i/>
+                <w:iCs/>
+                <w:color w:val="EE0000"/>
+              </w:rPr>
+              <w:t>0.9451219512195121</w:t>
+            </w:r>
+          </w:p>
+        </w:tc>
+        <w:tc>
+          <w:tcPr>
+            <w:tcW w:w="3630" w:type="dxa"/>
+          </w:tcPr>
+          <w:p>
+            <w:pPr>
+              <w:rPr>
+                <w:i/>
+                <w:iCs/>
+                <w:color w:val="EE0000"/>
+              </w:rPr>
+            </w:pPr>
+            <w:r>
+              <w:rPr>
+                <w:i/>
+                <w:iCs/>
+                <w:color w:val="EE0000"/>
+              </w:rPr>
+              <w:t xml:space="preserve"> 0.9939597315436242</w:t>
+            </w:r>
+          </w:p>
+        </w:tc>
+      </w:tr>
+      <w:tr>
+        <w:trPr>
+          <w:trHeight w:val="64"/>
+        </w:trPr>
+        <w:tc>
+          <w:tcPr>
+            <w:tcW w:w="3385" w:type="dxa"/>
+          </w:tcPr>
+          <w:p>
+            <w:pPr>
+              <w:rPr>
+                <w:i/>
+                <w:iCs/>
+                <w:color w:val="EE0000"/>
+              </w:rPr>
+            </w:pPr>
+            <w:r>
+              <w:rPr>
+                <w:i/>
+                <w:iCs/>
+                <w:color w:val="EE0000"/>
+              </w:rPr>
+              <w:t>1,000</w:t>
+            </w:r>
+          </w:p>
+        </w:tc>
+        <w:tc>
+          <w:tcPr>
+            <w:tcW w:w="3360" w:type="dxa"/>
+          </w:tcPr>
+          <w:p>
+            <w:pPr>
+              <w:rPr>
+                <w:i/>
+                <w:iCs/>
+                <w:color w:val="EE0000"/>
+              </w:rPr>
+            </w:pPr>
+            <w:r>
+              <w:rPr>
+                <w:i/>
+                <w:iCs/>
+                <w:color w:val="EE0000"/>
+              </w:rPr>
+              <w:t>0.9390243902439024</w:t>
+            </w:r>
+          </w:p>
+        </w:tc>
+        <w:tc>
+          <w:tcPr>
+            <w:tcW w:w="3630" w:type="dxa"/>
+          </w:tcPr>
+          <w:p>
+            <w:pPr>
+              <w:rPr>
+                <w:i/>
+                <w:iCs/>
+                <w:color w:val="EE0000"/>
+              </w:rPr>
+            </w:pPr>
+            <w:r>
+              <w:rPr>
+                <w:i/>
+                <w:iCs/>
+                <w:color w:val="EE0000"/>
+              </w:rPr>
+              <w:t>0.9939597315436242</w:t>
+            </w:r>
+          </w:p>
+        </w:tc>
+      </w:tr>
+      <w:tr>
+        <w:trPr>
+          <w:trHeight w:val="64"/>
+        </w:trPr>
+        <w:tc>
+          <w:tcPr>
+            <w:tcW w:w="3385" w:type="dxa"/>
+          </w:tcPr>
+          <w:p>
+            <w:pPr>
+              <w:rPr>
+                <w:i/>
+                <w:iCs/>
+                <w:color w:val="EE0000"/>
+              </w:rPr>
+            </w:pPr>
+            <w:r>
+              <w:rPr>
+                <w:i/>
+                <w:iCs/>
+                <w:color w:val="EE0000"/>
+              </w:rPr>
+              <w:t>10,000</w:t>
+            </w:r>
+          </w:p>
+        </w:tc>
+        <w:tc>
+          <w:tcPr>
+            <w:tcW w:w="3360" w:type="dxa"/>
+          </w:tcPr>
+          <w:p>
+            <w:pPr>
+              <w:rPr>
+                <w:i/>
+                <w:iCs/>
+                <w:color w:val="EE0000"/>
+              </w:rPr>
+            </w:pPr>
+            <w:r>
+              <w:rPr>
+                <w:i/>
+                <w:iCs/>
+                <w:color w:val="EE0000"/>
+              </w:rPr>
+              <w:t>0.9207317073170</w:t>
+            </w:r>
+            <w:r>
+              <w:rPr>
+                <w:i/>
+                <w:iCs/>
+                <w:color w:val="EE0000"/>
+              </w:rPr>
+              <w:t>732</w:t>
+            </w:r>
+          </w:p>
+        </w:tc>
+        <w:tc>
+          <w:tcPr>
+            <w:tcW w:w="3630" w:type="dxa"/>
+          </w:tcPr>
+          <w:p>
+            <w:pPr>
+              <w:rPr>
+                <w:i/>
+                <w:iCs/>
+                <w:color w:val="EE0000"/>
+              </w:rPr>
+            </w:pPr>
+            <w:r>
+              <w:rPr>
+                <w:i/>
+                <w:iCs/>
+                <w:color w:val="EE0000"/>
+              </w:rPr>
+              <w:t>0.9682326621923938</w:t>
+            </w:r>
+          </w:p>
+        </w:tc>
+      </w:tr>
+    </w:tbl>
+    <w:p>
+      <w:pPr>
+        <w:rPr>
+          <w:i/>
+          <w:iCs/>
+          <w:color w:val="EE0000"/>
+        </w:rPr>
+      </w:pPr>
+    </w:p>
+    <w:p>
+      <w:pPr>
         <w:pStyle w:val="ListParagraph"/>
         <w:numPr>
           <w:ilvl w:val="1"/>
@@ -2739,6 +3006,47 @@
           <w:color w:val="EE0000"/>
         </w:rPr>
       </w:pPr>
+    </w:p>
+    <w:p>
+      <w:pPr>
+        <w:rPr>
+          <w:i/>
+          <w:iCs/>
+          <w:color w:val="EE0000"/>
+        </w:rPr>
+      </w:pPr>
+      <w:r>
+        <w:rPr>
+          <w:i/>
+          <w:iCs/>
+          <w:color w:val="EE0000"/>
+        </w:rPr>
+        <w:t>For Random Forest classifier, t</w:t>
+      </w:r>
+      <w:r>
+        <w:rPr>
+          <w:i/>
+          <w:iCs/>
+          <w:color w:val="EE0000"/>
+        </w:rPr>
+        <w:t xml:space="preserve">he model with 100 genes produced the highest accuracy of 94.51, but the highest AUC-ROC score was from both 100 and 1,000 genes. </w:t>
+      </w:r>
+      <w:r>
+        <w:rPr>
+          <w:i/>
+          <w:iCs/>
+          <w:color w:val="EE0000"/>
+        </w:rPr>
+        <w:t xml:space="preserve">Both 10 genes and 10,000 genes had roughly the same AUC-ROC score of about 96%. </w:t>
+      </w:r>
+      <w:r>
+        <w:rPr>
+          <w:i/>
+          <w:iCs/>
+          <w:color w:val="EE0000"/>
+        </w:rPr>
+        <w:t>As a result, there is no clear indication that changing the number of genes significantly changes prediction performance for Random Forest.</w:t>
+      </w:r>
     </w:p>
     <w:p>
       <w:pPr>
@@ -3136,25 +3444,7 @@
           <w:iCs/>
           <w:color w:val="EE0000"/>
         </w:rPr>
-        <w:t xml:space="preserve">A heatmap was generated using the 50 genes with the largest absolute coefficients from the disease classification logistic regression model. Gene expression values were log2-transformed and standardized using Z-scores to compare expression patterns across samples. Samples were annotated according to their original disease groups, tuberculosis subjects and </w:t>
-      </w:r>
-      <w:proofErr w:type="gramStart"/>
-      <w:r>
-        <w:rPr>
-          <w:i/>
-          <w:iCs/>
-          <w:color w:val="EE0000"/>
-        </w:rPr>
-        <w:t>healthy</w:t>
-      </w:r>
-      <w:proofErr w:type="gramEnd"/>
-      <w:r>
-        <w:rPr>
-          <w:i/>
-          <w:iCs/>
-          <w:color w:val="EE0000"/>
-        </w:rPr>
-        <w:t xml:space="preserve"> controls. Hierarchical clustering was applied to both genes and samples, producing row and column dendrograms to visualize similarities in gene expression patterns. The heatmap includes a legend for the sample groups and standardized expression values.</w:t>
+        <w:t>A heatmap was generated using the 50 genes with the largest absolute coefficients from the disease classification logistic regression model. Gene expression values were log2-transformed and standardized using Z-scores to compare expression patterns across samples. Samples were annotated according to their original disease groups, tuberculosis subjects and healthy controls. Hierarchical clustering was applied to both genes and samples, producing row and column dendrograms to visualize similarities in gene expression patterns. The heatmap includes a legend for the sample groups and standardized expression values.</w:t>
       </w:r>
     </w:p>
     <w:p>
@@ -3295,25 +3585,7 @@
           <w:iCs/>
           <w:color w:val="064462"/>
         </w:rPr>
-        <w:t xml:space="preserve">Combine all results into a single file, </w:t>
-      </w:r>
-      <w:proofErr w:type="gramStart"/>
-      <w:r>
-        <w:rPr>
-          <w:i/>
-          <w:iCs/>
-          <w:color w:val="064462"/>
-        </w:rPr>
-        <w:t>submit</w:t>
-      </w:r>
-      <w:proofErr w:type="gramEnd"/>
-      <w:r>
-        <w:rPr>
-          <w:i/>
-          <w:iCs/>
-          <w:color w:val="064462"/>
-        </w:rPr>
-        <w:t xml:space="preserve"> on Canvas. Only one student on the team needs to submit. Make sure that all your code and results are added to your GitHub repository. </w:t>
+        <w:t xml:space="preserve">Combine all results into a single file, submit on Canvas. Only one student on the team needs to submit. Make sure that all your code and results are added to your GitHub repository. </w:t>
       </w:r>
     </w:p>
     <w:p>
@@ -3338,7 +3610,7 @@
 </file>
 
 <file path=word/endnotes.xml><?xml version="1.0" encoding="utf-8"?>
-<w:endnotes xmlns:wpc="http://schemas.microsoft.com/office/word/2010/wordprocessingCanvas" xmlns:cx="http://schemas.microsoft.com/office/drawing/2014/chartex" xmlns:cx1="http://schemas.microsoft.com/office/drawing/2015/9/8/chartex" xmlns:cx2="http://schemas.microsoft.com/office/drawing/2015/10/21/chartex" xmlns:cx3="http://schemas.microsoft.com/office/drawing/2016/5/9/chartex" xmlns:cx4="http://schemas.microsoft.com/office/drawing/2016/5/10/chartex" xmlns:cx5="http://schemas.microsoft.com/office/drawing/2016/5/11/chartex" xmlns:cx6="http://schemas.microsoft.com/office/drawing/2016/5/12/chartex" xmlns:cx7="http://schemas.microsoft.com/office/drawing/2016/5/13/chartex" xmlns:cx8="http://schemas.microsoft.com/office/drawing/2016/5/14/chartex" xmlns:mc="http://schemas.openxmlformats.org/markup-compatibility/2006" xmlns:aink="http://schemas.microsoft.com/office/drawing/2016/ink" xmlns:am3d="http://schemas.microsoft.com/office/drawing/2017/model3d" xmlns:o="urn:schemas-microsoft-com:office:office" xmlns:oel="http://schemas.microsoft.com/office/2019/extlst" xmlns:r="http://schemas.openxmlformats.org/officeDocument/2006/relationships" xmlns:m="http://schemas.openxmlformats.org/officeDocument/2006/math" xmlns:v="urn:schemas-microsoft-com:vml" xmlns:wp14="http://schemas.microsoft.com/office/word/2010/wordprocessingDrawing" xmlns:wp="http://schemas.openxmlformats.org/drawingml/2006/wordprocessingDrawing" xmlns:w10="urn:schemas-microsoft-com:office:word" xmlns:w="http://schemas.openxmlformats.org/wordprocessingml/2006/main" xmlns:w14="http://schemas.microsoft.com/office/word/2010/wordml" xmlns:w15="http://schemas.microsoft.com/office/word/2012/wordml" xmlns:w16cex="http://schemas.microsoft.com/office/word/2018/wordml/cex" xmlns:w16cid="http://schemas.microsoft.com/office/word/2016/wordml/cid" xmlns:w16="http://schemas.microsoft.com/office/word/2018/wordml" xmlns:w16du="http://schemas.microsoft.com/office/word/2023/wordml/word16du" xmlns:w16sdtdh="http://schemas.microsoft.com/office/word/2020/wordml/sdtdatahash" xmlns:w16sdtfl="http://schemas.microsoft.com/office/word/2024/wordml/sdtformatlock" xmlns:w16se="http://schemas.microsoft.com/office/word/2015/wordml/symex" xmlns:wpg="http://schemas.microsoft.com/office/word/2010/wordprocessingGroup" xmlns:wpi="http://schemas.microsoft.com/office/word/2010/wordprocessingInk" xmlns:wne="http://schemas.microsoft.com/office/word/2006/wordml" xmlns:wps="http://schemas.microsoft.com/office/word/2010/wordprocessingShape" mc:Ignorable="w14 w15 w16se w16cid w16 w16cex w16sdtdh w16sdtfl w16du wp14">
+<w:endnotes xmlns:wpc="http://schemas.microsoft.com/office/word/2010/wordprocessingCanvas" xmlns:cx="http://schemas.microsoft.com/office/drawing/2014/chartex" xmlns:cx1="http://schemas.microsoft.com/office/drawing/2015/9/8/chartex" xmlns:cx2="http://schemas.microsoft.com/office/drawing/2015/10/21/chartex" xmlns:cx3="http://schemas.microsoft.com/office/drawing/2016/5/9/chartex" xmlns:cx4="http://schemas.microsoft.com/office/drawing/2016/5/10/chartex" xmlns:cx5="http://schemas.microsoft.com/office/drawing/2016/5/11/chartex" xmlns:cx6="http://schemas.microsoft.com/office/drawing/2016/5/12/chartex" xmlns:cx7="http://schemas.microsoft.com/office/drawing/2016/5/13/chartex" xmlns:cx8="http://schemas.microsoft.com/office/drawing/2016/5/14/chartex" xmlns:mc="http://schemas.openxmlformats.org/markup-compatibility/2006" xmlns:aink="http://schemas.microsoft.com/office/drawing/2016/ink" xmlns:am3d="http://schemas.microsoft.com/office/drawing/2017/model3d" xmlns:o="urn:schemas-microsoft-com:office:office" xmlns:oel="http://schemas.microsoft.com/office/2019/extlst" xmlns:r="http://schemas.openxmlformats.org/officeDocument/2006/relationships" xmlns:m="http://schemas.openxmlformats.org/officeDocument/2006/math" xmlns:v="urn:schemas-microsoft-com:vml" xmlns:wp14="http://schemas.microsoft.com/office/word/2010/wordprocessingDrawing" xmlns:wp="http://schemas.openxmlformats.org/drawingml/2006/wordprocessingDrawing" xmlns:w10="urn:schemas-microsoft-com:office:word" xmlns:w="http://schemas.openxmlformats.org/wordprocessingml/2006/main" xmlns:w14="http://schemas.microsoft.com/office/word/2010/wordml" xmlns:w15="http://schemas.microsoft.com/office/word/2012/wordml" xmlns:w16cex="http://schemas.microsoft.com/office/word/2018/wordml/cex" xmlns:w16cid="http://schemas.microsoft.com/office/word/2016/wordml/cid" xmlns:w16="http://schemas.microsoft.com/office/word/2018/wordml" xmlns:w16du="http://schemas.microsoft.com/office/word/2023/wordml/word16du" xmlns:w16sdtdh="http://schemas.microsoft.com/office/word/2020/wordml/sdtdatahash" xmlns:w16se="http://schemas.microsoft.com/office/word/2015/wordml/symex" xmlns:wpg="http://schemas.microsoft.com/office/word/2010/wordprocessingGroup" xmlns:wpi="http://schemas.microsoft.com/office/word/2010/wordprocessingInk" xmlns:wne="http://schemas.microsoft.com/office/word/2006/wordml" xmlns:wps="http://schemas.microsoft.com/office/word/2010/wordprocessingShape" mc:Ignorable="w14 w15 w16se w16cid w16 w16cex w16sdtdh w16du wp14">
   <w:endnote w:type="separator" w:id="-1">
     <w:p>
       <w:r>
@@ -3357,7 +3629,7 @@
 </file>
 
 <file path=word/footer1.xml><?xml version="1.0" encoding="utf-8"?>
-<w:ftr xmlns:wpc="http://schemas.microsoft.com/office/word/2010/wordprocessingCanvas" xmlns:cx="http://schemas.microsoft.com/office/drawing/2014/chartex" xmlns:cx1="http://schemas.microsoft.com/office/drawing/2015/9/8/chartex" xmlns:cx2="http://schemas.microsoft.com/office/drawing/2015/10/21/chartex" xmlns:cx3="http://schemas.microsoft.com/office/drawing/2016/5/9/chartex" xmlns:cx4="http://schemas.microsoft.com/office/drawing/2016/5/10/chartex" xmlns:cx5="http://schemas.microsoft.com/office/drawing/2016/5/11/chartex" xmlns:cx6="http://schemas.microsoft.com/office/drawing/2016/5/12/chartex" xmlns:cx7="http://schemas.microsoft.com/office/drawing/2016/5/13/chartex" xmlns:cx8="http://schemas.microsoft.com/office/drawing/2016/5/14/chartex" xmlns:mc="http://schemas.openxmlformats.org/markup-compatibility/2006" xmlns:aink="http://schemas.microsoft.com/office/drawing/2016/ink" xmlns:am3d="http://schemas.microsoft.com/office/drawing/2017/model3d" xmlns:o="urn:schemas-microsoft-com:office:office" xmlns:oel="http://schemas.microsoft.com/office/2019/extlst" xmlns:r="http://schemas.openxmlformats.org/officeDocument/2006/relationships" xmlns:m="http://schemas.openxmlformats.org/officeDocument/2006/math" xmlns:v="urn:schemas-microsoft-com:vml" xmlns:wp14="http://schemas.microsoft.com/office/word/2010/wordprocessingDrawing" xmlns:wp="http://schemas.openxmlformats.org/drawingml/2006/wordprocessingDrawing" xmlns:w10="urn:schemas-microsoft-com:office:word" xmlns:w="http://schemas.openxmlformats.org/wordprocessingml/2006/main" xmlns:w14="http://schemas.microsoft.com/office/word/2010/wordml" xmlns:w15="http://schemas.microsoft.com/office/word/2012/wordml" xmlns:w16cex="http://schemas.microsoft.com/office/word/2018/wordml/cex" xmlns:w16cid="http://schemas.microsoft.com/office/word/2016/wordml/cid" xmlns:w16="http://schemas.microsoft.com/office/word/2018/wordml" xmlns:w16du="http://schemas.microsoft.com/office/word/2023/wordml/word16du" xmlns:w16sdtdh="http://schemas.microsoft.com/office/word/2020/wordml/sdtdatahash" xmlns:w16sdtfl="http://schemas.microsoft.com/office/word/2024/wordml/sdtformatlock" xmlns:w16se="http://schemas.microsoft.com/office/word/2015/wordml/symex" xmlns:wpg="http://schemas.microsoft.com/office/word/2010/wordprocessingGroup" xmlns:wpi="http://schemas.microsoft.com/office/word/2010/wordprocessingInk" xmlns:wne="http://schemas.microsoft.com/office/word/2006/wordml" xmlns:wps="http://schemas.microsoft.com/office/word/2010/wordprocessingShape" mc:Ignorable="w14 w15 w16se w16cid w16 w16cex w16sdtdh w16sdtfl w16du wp14">
+<w:ftr xmlns:wpc="http://schemas.microsoft.com/office/word/2010/wordprocessingCanvas" xmlns:cx="http://schemas.microsoft.com/office/drawing/2014/chartex" xmlns:cx1="http://schemas.microsoft.com/office/drawing/2015/9/8/chartex" xmlns:cx2="http://schemas.microsoft.com/office/drawing/2015/10/21/chartex" xmlns:cx3="http://schemas.microsoft.com/office/drawing/2016/5/9/chartex" xmlns:cx4="http://schemas.microsoft.com/office/drawing/2016/5/10/chartex" xmlns:cx5="http://schemas.microsoft.com/office/drawing/2016/5/11/chartex" xmlns:cx6="http://schemas.microsoft.com/office/drawing/2016/5/12/chartex" xmlns:cx7="http://schemas.microsoft.com/office/drawing/2016/5/13/chartex" xmlns:cx8="http://schemas.microsoft.com/office/drawing/2016/5/14/chartex" xmlns:mc="http://schemas.openxmlformats.org/markup-compatibility/2006" xmlns:aink="http://schemas.microsoft.com/office/drawing/2016/ink" xmlns:am3d="http://schemas.microsoft.com/office/drawing/2017/model3d" xmlns:o="urn:schemas-microsoft-com:office:office" xmlns:oel="http://schemas.microsoft.com/office/2019/extlst" xmlns:r="http://schemas.openxmlformats.org/officeDocument/2006/relationships" xmlns:m="http://schemas.openxmlformats.org/officeDocument/2006/math" xmlns:v="urn:schemas-microsoft-com:vml" xmlns:wp14="http://schemas.microsoft.com/office/word/2010/wordprocessingDrawing" xmlns:wp="http://schemas.openxmlformats.org/drawingml/2006/wordprocessingDrawing" xmlns:w10="urn:schemas-microsoft-com:office:word" xmlns:w="http://schemas.openxmlformats.org/wordprocessingml/2006/main" xmlns:w14="http://schemas.microsoft.com/office/word/2010/wordml" xmlns:w15="http://schemas.microsoft.com/office/word/2012/wordml" xmlns:w16cex="http://schemas.microsoft.com/office/word/2018/wordml/cex" xmlns:w16cid="http://schemas.microsoft.com/office/word/2016/wordml/cid" xmlns:w16="http://schemas.microsoft.com/office/word/2018/wordml" xmlns:w16du="http://schemas.microsoft.com/office/word/2023/wordml/word16du" xmlns:w16sdtdh="http://schemas.microsoft.com/office/word/2020/wordml/sdtdatahash" xmlns:w16se="http://schemas.microsoft.com/office/word/2015/wordml/symex" xmlns:wpg="http://schemas.microsoft.com/office/word/2010/wordprocessingGroup" xmlns:wpi="http://schemas.microsoft.com/office/word/2010/wordprocessingInk" xmlns:wne="http://schemas.microsoft.com/office/word/2006/wordml" xmlns:wps="http://schemas.microsoft.com/office/word/2010/wordprocessingShape" mc:Ignorable="w14 w15 w16se w16cid w16 w16cex w16sdtdh w16du wp14">
   <w:p>
     <w:pPr>
       <w:pStyle w:val="Footer"/>
@@ -3508,7 +3780,7 @@
 </file>
 
 <file path=word/footnotes.xml><?xml version="1.0" encoding="utf-8"?>
-<w:footnotes xmlns:wpc="http://schemas.microsoft.com/office/word/2010/wordprocessingCanvas" xmlns:cx="http://schemas.microsoft.com/office/drawing/2014/chartex" xmlns:cx1="http://schemas.microsoft.com/office/drawing/2015/9/8/chartex" xmlns:cx2="http://schemas.microsoft.com/office/drawing/2015/10/21/chartex" xmlns:cx3="http://schemas.microsoft.com/office/drawing/2016/5/9/chartex" xmlns:cx4="http://schemas.microsoft.com/office/drawing/2016/5/10/chartex" xmlns:cx5="http://schemas.microsoft.com/office/drawing/2016/5/11/chartex" xmlns:cx6="http://schemas.microsoft.com/office/drawing/2016/5/12/chartex" xmlns:cx7="http://schemas.microsoft.com/office/drawing/2016/5/13/chartex" xmlns:cx8="http://schemas.microsoft.com/office/drawing/2016/5/14/chartex" xmlns:mc="http://schemas.openxmlformats.org/markup-compatibility/2006" xmlns:aink="http://schemas.microsoft.com/office/drawing/2016/ink" xmlns:am3d="http://schemas.microsoft.com/office/drawing/2017/model3d" xmlns:o="urn:schemas-microsoft-com:office:office" xmlns:oel="http://schemas.microsoft.com/office/2019/extlst" xmlns:r="http://schemas.openxmlformats.org/officeDocument/2006/relationships" xmlns:m="http://schemas.openxmlformats.org/officeDocument/2006/math" xmlns:v="urn:schemas-microsoft-com:vml" xmlns:wp14="http://schemas.microsoft.com/office/word/2010/wordprocessingDrawing" xmlns:wp="http://schemas.openxmlformats.org/drawingml/2006/wordprocessingDrawing" xmlns:w10="urn:schemas-microsoft-com:office:word" xmlns:w="http://schemas.openxmlformats.org/wordprocessingml/2006/main" xmlns:w14="http://schemas.microsoft.com/office/word/2010/wordml" xmlns:w15="http://schemas.microsoft.com/office/word/2012/wordml" xmlns:w16cex="http://schemas.microsoft.com/office/word/2018/wordml/cex" xmlns:w16cid="http://schemas.microsoft.com/office/word/2016/wordml/cid" xmlns:w16="http://schemas.microsoft.com/office/word/2018/wordml" xmlns:w16du="http://schemas.microsoft.com/office/word/2023/wordml/word16du" xmlns:w16sdtdh="http://schemas.microsoft.com/office/word/2020/wordml/sdtdatahash" xmlns:w16sdtfl="http://schemas.microsoft.com/office/word/2024/wordml/sdtformatlock" xmlns:w16se="http://schemas.microsoft.com/office/word/2015/wordml/symex" xmlns:wpg="http://schemas.microsoft.com/office/word/2010/wordprocessingGroup" xmlns:wpi="http://schemas.microsoft.com/office/word/2010/wordprocessingInk" xmlns:wne="http://schemas.microsoft.com/office/word/2006/wordml" xmlns:wps="http://schemas.microsoft.com/office/word/2010/wordprocessingShape" mc:Ignorable="w14 w15 w16se w16cid w16 w16cex w16sdtdh w16sdtfl w16du wp14">
+<w:footnotes xmlns:wpc="http://schemas.microsoft.com/office/word/2010/wordprocessingCanvas" xmlns:cx="http://schemas.microsoft.com/office/drawing/2014/chartex" xmlns:cx1="http://schemas.microsoft.com/office/drawing/2015/9/8/chartex" xmlns:cx2="http://schemas.microsoft.com/office/drawing/2015/10/21/chartex" xmlns:cx3="http://schemas.microsoft.com/office/drawing/2016/5/9/chartex" xmlns:cx4="http://schemas.microsoft.com/office/drawing/2016/5/10/chartex" xmlns:cx5="http://schemas.microsoft.com/office/drawing/2016/5/11/chartex" xmlns:cx6="http://schemas.microsoft.com/office/drawing/2016/5/12/chartex" xmlns:cx7="http://schemas.microsoft.com/office/drawing/2016/5/13/chartex" xmlns:cx8="http://schemas.microsoft.com/office/drawing/2016/5/14/chartex" xmlns:mc="http://schemas.openxmlformats.org/markup-compatibility/2006" xmlns:aink="http://schemas.microsoft.com/office/drawing/2016/ink" xmlns:am3d="http://schemas.microsoft.com/office/drawing/2017/model3d" xmlns:o="urn:schemas-microsoft-com:office:office" xmlns:oel="http://schemas.microsoft.com/office/2019/extlst" xmlns:r="http://schemas.openxmlformats.org/officeDocument/2006/relationships" xmlns:m="http://schemas.openxmlformats.org/officeDocument/2006/math" xmlns:v="urn:schemas-microsoft-com:vml" xmlns:wp14="http://schemas.microsoft.com/office/word/2010/wordprocessingDrawing" xmlns:wp="http://schemas.openxmlformats.org/drawingml/2006/wordprocessingDrawing" xmlns:w10="urn:schemas-microsoft-com:office:word" xmlns:w="http://schemas.openxmlformats.org/wordprocessingml/2006/main" xmlns:w14="http://schemas.microsoft.com/office/word/2010/wordml" xmlns:w15="http://schemas.microsoft.com/office/word/2012/wordml" xmlns:w16cex="http://schemas.microsoft.com/office/word/2018/wordml/cex" xmlns:w16cid="http://schemas.microsoft.com/office/word/2016/wordml/cid" xmlns:w16="http://schemas.microsoft.com/office/word/2018/wordml" xmlns:w16du="http://schemas.microsoft.com/office/word/2023/wordml/word16du" xmlns:w16sdtdh="http://schemas.microsoft.com/office/word/2020/wordml/sdtdatahash" xmlns:w16se="http://schemas.microsoft.com/office/word/2015/wordml/symex" xmlns:wpg="http://schemas.microsoft.com/office/word/2010/wordprocessingGroup" xmlns:wpi="http://schemas.microsoft.com/office/word/2010/wordprocessingInk" xmlns:wne="http://schemas.microsoft.com/office/word/2006/wordml" xmlns:wps="http://schemas.microsoft.com/office/word/2010/wordprocessingShape" mc:Ignorable="w14 w15 w16se w16cid w16 w16cex w16sdtdh w16du wp14">
   <w:footnote w:type="separator" w:id="-1">
     <w:p>
       <w:r>
@@ -3527,7 +3799,7 @@
 </file>
 
 <file path=word/numbering.xml><?xml version="1.0" encoding="utf-8"?>
-<w:numbering xmlns:wpc="http://schemas.microsoft.com/office/word/2010/wordprocessingCanvas" xmlns:cx="http://schemas.microsoft.com/office/drawing/2014/chartex" xmlns:cx1="http://schemas.microsoft.com/office/drawing/2015/9/8/chartex" xmlns:cx2="http://schemas.microsoft.com/office/drawing/2015/10/21/chartex" xmlns:cx3="http://schemas.microsoft.com/office/drawing/2016/5/9/chartex" xmlns:cx4="http://schemas.microsoft.com/office/drawing/2016/5/10/chartex" xmlns:cx5="http://schemas.microsoft.com/office/drawing/2016/5/11/chartex" xmlns:cx6="http://schemas.microsoft.com/office/drawing/2016/5/12/chartex" xmlns:cx7="http://schemas.microsoft.com/office/drawing/2016/5/13/chartex" xmlns:cx8="http://schemas.microsoft.com/office/drawing/2016/5/14/chartex" xmlns:mc="http://schemas.openxmlformats.org/markup-compatibility/2006" xmlns:aink="http://schemas.microsoft.com/office/drawing/2016/ink" xmlns:am3d="http://schemas.microsoft.com/office/drawing/2017/model3d" xmlns:o="urn:schemas-microsoft-com:office:office" xmlns:oel="http://schemas.microsoft.com/office/2019/extlst" xmlns:r="http://schemas.openxmlformats.org/officeDocument/2006/relationships" xmlns:m="http://schemas.openxmlformats.org/officeDocument/2006/math" xmlns:v="urn:schemas-microsoft-com:vml" xmlns:wp14="http://schemas.microsoft.com/office/word/2010/wordprocessingDrawing" xmlns:wp="http://schemas.openxmlformats.org/drawingml/2006/wordprocessingDrawing" xmlns:w10="urn:schemas-microsoft-com:office:word" xmlns:w="http://schemas.openxmlformats.org/wordprocessingml/2006/main" xmlns:w14="http://schemas.microsoft.com/office/word/2010/wordml" xmlns:w15="http://schemas.microsoft.com/office/word/2012/wordml" xmlns:w16cex="http://schemas.microsoft.com/office/word/2018/wordml/cex" xmlns:w16cid="http://schemas.microsoft.com/office/word/2016/wordml/cid" xmlns:w16="http://schemas.microsoft.com/office/word/2018/wordml" xmlns:w16du="http://schemas.microsoft.com/office/word/2023/wordml/word16du" xmlns:w16sdtdh="http://schemas.microsoft.com/office/word/2020/wordml/sdtdatahash" xmlns:w16sdtfl="http://schemas.microsoft.com/office/word/2024/wordml/sdtformatlock" xmlns:w16se="http://schemas.microsoft.com/office/word/2015/wordml/symex" xmlns:wpg="http://schemas.microsoft.com/office/word/2010/wordprocessingGroup" xmlns:wpi="http://schemas.microsoft.com/office/word/2010/wordprocessingInk" xmlns:wne="http://schemas.microsoft.com/office/word/2006/wordml" xmlns:wps="http://schemas.microsoft.com/office/word/2010/wordprocessingShape" mc:Ignorable="w14 w15 w16se w16cid w16 w16cex w16sdtdh w16sdtfl w16du wp14">
+<w:numbering xmlns:wpc="http://schemas.microsoft.com/office/word/2010/wordprocessingCanvas" xmlns:cx="http://schemas.microsoft.com/office/drawing/2014/chartex" xmlns:cx1="http://schemas.microsoft.com/office/drawing/2015/9/8/chartex" xmlns:cx2="http://schemas.microsoft.com/office/drawing/2015/10/21/chartex" xmlns:cx3="http://schemas.microsoft.com/office/drawing/2016/5/9/chartex" xmlns:cx4="http://schemas.microsoft.com/office/drawing/2016/5/10/chartex" xmlns:cx5="http://schemas.microsoft.com/office/drawing/2016/5/11/chartex" xmlns:cx6="http://schemas.microsoft.com/office/drawing/2016/5/12/chartex" xmlns:cx7="http://schemas.microsoft.com/office/drawing/2016/5/13/chartex" xmlns:cx8="http://schemas.microsoft.com/office/drawing/2016/5/14/chartex" xmlns:mc="http://schemas.openxmlformats.org/markup-compatibility/2006" xmlns:aink="http://schemas.microsoft.com/office/drawing/2016/ink" xmlns:am3d="http://schemas.microsoft.com/office/drawing/2017/model3d" xmlns:o="urn:schemas-microsoft-com:office:office" xmlns:oel="http://schemas.microsoft.com/office/2019/extlst" xmlns:r="http://schemas.openxmlformats.org/officeDocument/2006/relationships" xmlns:m="http://schemas.openxmlformats.org/officeDocument/2006/math" xmlns:v="urn:schemas-microsoft-com:vml" xmlns:wp14="http://schemas.microsoft.com/office/word/2010/wordprocessingDrawing" xmlns:wp="http://schemas.openxmlformats.org/drawingml/2006/wordprocessingDrawing" xmlns:w10="urn:schemas-microsoft-com:office:word" xmlns:w="http://schemas.openxmlformats.org/wordprocessingml/2006/main" xmlns:w14="http://schemas.microsoft.com/office/word/2010/wordml" xmlns:w15="http://schemas.microsoft.com/office/word/2012/wordml" xmlns:w16cex="http://schemas.microsoft.com/office/word/2018/wordml/cex" xmlns:w16cid="http://schemas.microsoft.com/office/word/2016/wordml/cid" xmlns:w16="http://schemas.microsoft.com/office/word/2018/wordml" xmlns:w16du="http://schemas.microsoft.com/office/word/2023/wordml/word16du" xmlns:w16sdtdh="http://schemas.microsoft.com/office/word/2020/wordml/sdtdatahash" xmlns:w16se="http://schemas.microsoft.com/office/word/2015/wordml/symex" xmlns:wpg="http://schemas.microsoft.com/office/word/2010/wordprocessingGroup" xmlns:wpi="http://schemas.microsoft.com/office/word/2010/wordprocessingInk" xmlns:wne="http://schemas.microsoft.com/office/word/2006/wordml" xmlns:wps="http://schemas.microsoft.com/office/word/2010/wordprocessingShape" mc:Ignorable="w14 w15 w16se w16cid w16 w16cex w16sdtdh w16du wp14">
   <w:abstractNum w:abstractNumId="0" w15:restartNumberingAfterBreak="0">
     <w:nsid w:val="FFFFFF1D"/>
     <w:multiLevelType w:val="multilevel"/>
@@ -5920,7 +6192,7 @@
 </file>
 
 <file path=word/styles.xml><?xml version="1.0" encoding="utf-8"?>
-<w:styles xmlns:mc="http://schemas.openxmlformats.org/markup-compatibility/2006" xmlns:r="http://schemas.openxmlformats.org/officeDocument/2006/relationships" xmlns:w="http://schemas.openxmlformats.org/wordprocessingml/2006/main" xmlns:w14="http://schemas.microsoft.com/office/word/2010/wordml" xmlns:w15="http://schemas.microsoft.com/office/word/2012/wordml" xmlns:w16cex="http://schemas.microsoft.com/office/word/2018/wordml/cex" xmlns:w16cid="http://schemas.microsoft.com/office/word/2016/wordml/cid" xmlns:w16="http://schemas.microsoft.com/office/word/2018/wordml" xmlns:w16du="http://schemas.microsoft.com/office/word/2023/wordml/word16du" xmlns:w16sdtdh="http://schemas.microsoft.com/office/word/2020/wordml/sdtdatahash" xmlns:w16sdtfl="http://schemas.microsoft.com/office/word/2024/wordml/sdtformatlock" xmlns:w16se="http://schemas.microsoft.com/office/word/2015/wordml/symex" mc:Ignorable="w14 w15 w16se w16cid w16 w16cex w16sdtdh w16sdtfl w16du">
+<w:styles xmlns:mc="http://schemas.openxmlformats.org/markup-compatibility/2006" xmlns:r="http://schemas.openxmlformats.org/officeDocument/2006/relationships" xmlns:w="http://schemas.openxmlformats.org/wordprocessingml/2006/main" xmlns:w14="http://schemas.microsoft.com/office/word/2010/wordml" xmlns:w15="http://schemas.microsoft.com/office/word/2012/wordml" xmlns:w16cex="http://schemas.microsoft.com/office/word/2018/wordml/cex" xmlns:w16cid="http://schemas.microsoft.com/office/word/2016/wordml/cid" xmlns:w16="http://schemas.microsoft.com/office/word/2018/wordml" xmlns:w16du="http://schemas.microsoft.com/office/word/2023/wordml/word16du" xmlns:w16sdtdh="http://schemas.microsoft.com/office/word/2020/wordml/sdtdatahash" xmlns:w16se="http://schemas.microsoft.com/office/word/2015/wordml/symex" mc:Ignorable="w14 w15 w16se w16cid w16 w16cex w16sdtdh w16du">
   <w:docDefaults>
     <w:rPrDefault>
       <w:rPr>
@@ -6277,6 +6549,7 @@
   <w:style w:type="character" w:default="1" w:styleId="DefaultParagraphFont">
     <w:name w:val="Default Paragraph Font"/>
     <w:uiPriority w:val="1"/>
+    <w:semiHidden/>
     <w:unhideWhenUsed/>
   </w:style>
   <w:style w:type="table" w:default="1" w:styleId="TableNormal">

</xml_diff>

<commit_message>
Assignment 4: random forest  pt 1.5
</commit_message>
<xml_diff>
--- a/Assignment-4/CGS4144_Assn4.docx
+++ b/Assignment-4/CGS4144_Assn4.docx
@@ -278,7 +278,7 @@
               </wp:anchor>
             </w:drawing>
           </mc:Choice>
-          <mc:Fallback xmlns:w16cei="http://schemas.microsoft.com/office/word/2026/wordml/cei" xmlns:w16sdtfl="http://schemas.microsoft.com/office/word/2024/wordml/sdtformatlock">
+          <mc:Fallback xmlns:w16sdtfl="http://schemas.microsoft.com/office/word/2024/wordml/sdtformatlock" xmlns:w16cei="http://schemas.microsoft.com/office/word/2026/wordml/cei">
             <w:pict>
               <v:line w14:anchorId="7AAC89D5" id="Straight Connector 3" o:spid="_x0000_s1026" style="position:absolute;z-index:251663360;visibility:visible;mso-wrap-style:square;mso-wrap-distance-left:9pt;mso-wrap-distance-top:0;mso-wrap-distance-right:9pt;mso-wrap-distance-bottom:0;mso-position-horizontal:absolute;mso-position-horizontal-relative:text;mso-position-vertical:absolute;mso-position-vertical-relative:text" from="0,-.05pt" to="542.2pt,-.05pt" o:gfxdata="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" strokecolor="#bdd6ee [1300]" strokeweight="1pt">
                 <v:stroke joinstyle="miter"/>
@@ -506,7 +506,7 @@
               <w:rPr>
                 <w:color w:val="054361"/>
               </w:rPr>
-              <w:t>&lt;student2 name&gt;</w:t>
+              <w:t>Timothy Wang</w:t>
             </w:r>
           </w:p>
         </w:tc>
@@ -525,7 +525,7 @@
               <w:rPr>
                 <w:color w:val="054361"/>
               </w:rPr>
-              <w:t>&lt;student2@ufl.edu&gt;</w:t>
+              <w:t>timothy.wang@ufl.edu</w:t>
             </w:r>
           </w:p>
         </w:tc>
@@ -544,7 +544,7 @@
               <w:rPr>
                 <w:color w:val="054361"/>
               </w:rPr>
-              <w:t>&lt;github.com/student2&gt;</w:t>
+              <w:t>github.com/timothyw8</w:t>
             </w:r>
           </w:p>
         </w:tc>
@@ -807,7 +807,7 @@
               </wp:anchor>
             </w:drawing>
           </mc:Choice>
-          <mc:Fallback xmlns:w16cei="http://schemas.microsoft.com/office/word/2026/wordml/cei" xmlns:w16sdtfl="http://schemas.microsoft.com/office/word/2024/wordml/sdtformatlock">
+          <mc:Fallback xmlns:w16sdtfl="http://schemas.microsoft.com/office/word/2024/wordml/sdtformatlock" xmlns:w16cei="http://schemas.microsoft.com/office/word/2026/wordml/cei">
             <w:pict>
               <v:line w14:anchorId="53C7DDC2" id="Straight Connector 1" o:spid="_x0000_s1026" style="position:absolute;z-index:251665408;visibility:visible;mso-wrap-style:square;mso-wrap-distance-left:9pt;mso-wrap-distance-top:0;mso-wrap-distance-right:9pt;mso-wrap-distance-bottom:0;mso-position-horizontal:absolute;mso-position-horizontal-relative:text;mso-position-vertical:absolute;mso-position-vertical-relative:text" from="-.3pt,14.45pt" to="541.9pt,14.45pt" o:gfxdata="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" strokecolor="#bdd6ee [1300]" strokeweight="1pt">
                 <v:stroke joinstyle="miter"/>
@@ -1026,6 +1026,22 @@
           <w:color w:val="064462"/>
         </w:rPr>
         <w:t>Random forest</w:t>
+      </w:r>
+      <w:r>
+        <w:rPr>
+          <w:i/>
+          <w:iCs/>
+          <w:color w:val="064462"/>
+        </w:rPr>
+        <w:t xml:space="preserve"> </w:t>
+      </w:r>
+      <w:r>
+        <w:rPr>
+          <w:i/>
+          <w:iCs/>
+          <w:color w:val="EE0000"/>
+        </w:rPr>
+        <w:t>Tim</w:t>
       </w:r>
     </w:p>
     <w:p>
@@ -1388,6 +1404,20 @@
     </w:p>
     <w:p>
       <w:pPr>
+        <w:ind w:left="1080"/>
+        <w:rPr>
+          <w:color w:val="EE0000"/>
+        </w:rPr>
+      </w:pPr>
+      <w:r>
+        <w:rPr>
+          <w:color w:val="EE0000"/>
+        </w:rPr>
+        <w:t xml:space="preserve">For Random Forest, it predicted whether the samples were in the tuberculosis or healthy group. Using 100 decision trees, the model achieved an accuracy of 91.46 percent. This suggests that Random Forest was able to determine which group the samples belonged in with high accuracy. </w:t>
+      </w:r>
+    </w:p>
+    <w:p>
+      <w:pPr>
         <w:pStyle w:val="ListParagraph"/>
         <w:numPr>
           <w:ilvl w:val="1"/>
@@ -1485,6 +1515,7 @@
         <w:rPr>
           <w:color w:val="EE0000"/>
         </w:rPr>
+        <w:lastRenderedPageBreak/>
         <w:t xml:space="preserve">The K-means clustering approach from Assignment 3 was reproduced using k=2 and the 1,000 most variable genes. This configuration was selected because it showed the strongest association with TB versus healthy-control status in Assignment </w:t>
       </w:r>
       <w:proofErr w:type="gramStart"/>
@@ -1546,11 +1577,29 @@
       <w:pPr>
         <w:ind w:left="1080"/>
         <w:rPr>
-          <w:i/>
-          <w:iCs/>
           <w:color w:val="EE0000"/>
         </w:rPr>
       </w:pPr>
+      <w:r>
+        <w:rPr>
+          <w:color w:val="EE0000"/>
+        </w:rPr>
+        <w:t xml:space="preserve">For Random Forest, I used three clusters from Gaussian Mixture and got a 98.17% accuracy when it used 80% of samples for training and the remaining 20 for testing. This high accuracy suggests that Random Forest </w:t>
+      </w:r>
+      <w:proofErr w:type="gramStart"/>
+      <w:r>
+        <w:rPr>
+          <w:color w:val="EE0000"/>
+        </w:rPr>
+        <w:t>is able to</w:t>
+      </w:r>
+      <w:proofErr w:type="gramEnd"/>
+      <w:r>
+        <w:rPr>
+          <w:color w:val="EE0000"/>
+        </w:rPr>
+        <w:t xml:space="preserve"> reproduce the clusters from gaussian Mixture. </w:t>
+      </w:r>
     </w:p>
     <w:p>
       <w:pPr>
@@ -2160,6 +2209,7 @@
           <w:iCs/>
           <w:color w:val="EE0000"/>
         </w:rPr>
+        <w:lastRenderedPageBreak/>
         <w:t>The number of genes affected logistic regression performance for both disease and cluster classification. For disease classification, accuracy increased from 90.85% with 10 genes to 98.78% with 1,000 genes, before decreasing to 90.85% with 10,000 genes. For cluster classification, accuracy increased from 68.90% with 10 genes to 100% with 1,000 genes, then decreased slightly to 98.78% with 10,000 genes. Overall, using more genes initially improved classification performance, but adding genes beyond 1,000 did not consistently improve accuracy.</w:t>
       </w:r>
     </w:p>
@@ -2205,7 +2255,6 @@
                 <w:iCs/>
                 <w:color w:val="EE0000"/>
               </w:rPr>
-              <w:lastRenderedPageBreak/>
               <w:t>Number of genes</w:t>
             </w:r>
           </w:p>
@@ -3021,31 +3070,7 @@
           <w:iCs/>
           <w:color w:val="EE0000"/>
         </w:rPr>
-        <w:t>For Random Forest classifier, t</w:t>
-      </w:r>
-      <w:r>
-        <w:rPr>
-          <w:i/>
-          <w:iCs/>
-          <w:color w:val="EE0000"/>
-        </w:rPr>
-        <w:t xml:space="preserve">he model with 100 genes produced the highest accuracy of 94.51, but the highest AUC-ROC score was from both 100 and 1,000 genes. </w:t>
-      </w:r>
-      <w:r>
-        <w:rPr>
-          <w:i/>
-          <w:iCs/>
-          <w:color w:val="EE0000"/>
-        </w:rPr>
-        <w:t xml:space="preserve">Both 10 genes and 10,000 genes had roughly the same AUC-ROC score of about 96%. </w:t>
-      </w:r>
-      <w:r>
-        <w:rPr>
-          <w:i/>
-          <w:iCs/>
-          <w:color w:val="EE0000"/>
-        </w:rPr>
-        <w:t>As a result, there is no clear indication that changing the number of genes significantly changes prediction performance for Random Forest.</w:t>
+        <w:t>For Random Forest classifier, the model with 100 genes produced the highest accuracy of 94.51, but the highest AUC-ROC score was from both 100 and 1,000 genes. Both 10 genes and 10,000 genes had roughly the same AUC-ROC score of about 96%. As a result, there is no clear indication that changing the number of genes significantly changes prediction performance for Random Forest.</w:t>
       </w:r>
     </w:p>
     <w:p>
@@ -3097,6 +3122,7 @@
           <w:iCs/>
           <w:color w:val="064462"/>
         </w:rPr>
+        <w:lastRenderedPageBreak/>
         <w:t>Create a h</w:t>
       </w:r>
       <w:r>
@@ -3370,7 +3396,6 @@
         <w:rPr>
           <w:noProof/>
         </w:rPr>
-        <w:lastRenderedPageBreak/>
         <w:drawing>
           <wp:inline distT="0" distB="0" distL="0" distR="0" wp14:anchorId="3B4AFCA0" wp14:editId="785D41B6">
             <wp:extent cx="6858000" cy="5373370"/>

</xml_diff>

<commit_message>
Assignment 4: incoporated random forest to heatmap, updated docx
</commit_message>
<xml_diff>
--- a/Assignment-4/CGS4144_Assn4.docx
+++ b/Assignment-4/CGS4144_Assn4.docx
@@ -1,11 +1,10 @@
 
 <file path=word/document.xml><?xml version="1.0" encoding="utf-8"?>
-<w:document xmlns:o="urn:schemas-microsoft-com:office:office" xmlns:r="http://schemas.openxmlformats.org/officeDocument/2006/relationships" xmlns:v="urn:schemas-microsoft-com:vml" xmlns:w="http://schemas.openxmlformats.org/wordprocessingml/2006/main" xmlns:w10="urn:schemas-microsoft-com:office:word" xmlns:wp="http://schemas.openxmlformats.org/drawingml/2006/wordprocessingDrawing" xmlns:pic="http://schemas.openxmlformats.org/drawingml/2006/picture" xmlns:wps="http://schemas.microsoft.com/office/word/2010/wordprocessingShape" xmlns:wpg="http://schemas.microsoft.com/office/word/2010/wordprocessingGroup" xmlns:mc="http://schemas.openxmlformats.org/markup-compatibility/2006" xmlns:wp14="http://schemas.microsoft.com/office/word/2010/wordprocessingDrawing" xmlns:w14="http://schemas.microsoft.com/office/word/2010/wordml" xmlns:w15="http://schemas.microsoft.com/office/word/2012/wordml" mc:Ignorable="w14 wp14 w15">
+<w:document xmlns:wpc="http://schemas.microsoft.com/office/word/2010/wordprocessingCanvas" xmlns:cx="http://schemas.microsoft.com/office/drawing/2014/chartex" xmlns:cx1="http://schemas.microsoft.com/office/drawing/2015/9/8/chartex" xmlns:cx2="http://schemas.microsoft.com/office/drawing/2015/10/21/chartex" xmlns:cx3="http://schemas.microsoft.com/office/drawing/2016/5/9/chartex" xmlns:cx4="http://schemas.microsoft.com/office/drawing/2016/5/10/chartex" xmlns:cx5="http://schemas.microsoft.com/office/drawing/2016/5/11/chartex" xmlns:cx6="http://schemas.microsoft.com/office/drawing/2016/5/12/chartex" xmlns:cx7="http://schemas.microsoft.com/office/drawing/2016/5/13/chartex" xmlns:cx8="http://schemas.microsoft.com/office/drawing/2016/5/14/chartex" xmlns:mc="http://schemas.openxmlformats.org/markup-compatibility/2006" xmlns:aink="http://schemas.microsoft.com/office/drawing/2016/ink" xmlns:am3d="http://schemas.microsoft.com/office/drawing/2017/model3d" xmlns:o="urn:schemas-microsoft-com:office:office" xmlns:oel="http://schemas.microsoft.com/office/2019/extlst" xmlns:r="http://schemas.openxmlformats.org/officeDocument/2006/relationships" xmlns:m="http://schemas.openxmlformats.org/officeDocument/2006/math" xmlns:v="urn:schemas-microsoft-com:vml" xmlns:wp14="http://schemas.microsoft.com/office/word/2010/wordprocessingDrawing" xmlns:wp="http://schemas.openxmlformats.org/drawingml/2006/wordprocessingDrawing" xmlns:w10="urn:schemas-microsoft-com:office:word" xmlns:w="http://schemas.openxmlformats.org/wordprocessingml/2006/main" xmlns:w14="http://schemas.microsoft.com/office/word/2010/wordml" xmlns:w15="http://schemas.microsoft.com/office/word/2012/wordml" xmlns:w16cex="http://schemas.microsoft.com/office/word/2018/wordml/cex" xmlns:w16cid="http://schemas.microsoft.com/office/word/2016/wordml/cid" xmlns:w16="http://schemas.microsoft.com/office/word/2018/wordml" xmlns:w16du="http://schemas.microsoft.com/office/word/2023/wordml/word16du" xmlns:w16sdtdh="http://schemas.microsoft.com/office/word/2020/wordml/sdtdatahash" xmlns:w16se="http://schemas.microsoft.com/office/word/2015/wordml/symex" xmlns:wpg="http://schemas.microsoft.com/office/word/2010/wordprocessingGroup" xmlns:wpi="http://schemas.microsoft.com/office/word/2010/wordprocessingInk" xmlns:wne="http://schemas.microsoft.com/office/word/2006/wordml" xmlns:wps="http://schemas.microsoft.com/office/word/2010/wordprocessingShape" mc:Ignorable="w14 w15 w16se w16cid w16 w16cex w16sdtdh w16du wp14">
   <w:body>
     <w:p>
       <w:pPr>
         <w:pStyle w:val="Heading1"/>
-        <w:spacing w:before="160" w:after="0"/>
         <w:jc w:val="center"/>
         <w:rPr>
           <w:color w:val="054361"/>
@@ -22,31 +21,22 @@
         <w:t>CGS4144 Bioinformatics - Assignment 4</w:t>
       </w:r>
     </w:p>
-    <w:p>
-      <w:pPr>
-        <w:pStyle w:val="Normal"/>
-        <w:rPr/>
-      </w:pPr>
-      <w:r>
-        <w:rPr/>
-      </w:r>
-    </w:p>
+    <w:p/>
     <w:p>
       <w:pPr>
         <w:pStyle w:val="Heading1"/>
         <w:rPr>
-          <w:b w:val="false"/>
+          <w:b w:val="0"/>
           <w:bCs/>
           <w:color w:val="054361"/>
         </w:rPr>
       </w:pPr>
       <w:r>
-        <w:rPr/>
         <w:t>Directions:</w:t>
       </w:r>
       <w:r>
         <w:rPr>
-          <w:b w:val="false"/>
+          <w:b w:val="0"/>
           <w:bCs/>
           <w:color w:val="054361"/>
         </w:rPr>
@@ -60,33 +50,23 @@
       </w:r>
       <w:r>
         <w:rPr>
-          <w:b w:val="false"/>
+          <w:b w:val="0"/>
           <w:bCs/>
           <w:color w:val="054361"/>
         </w:rPr>
         <w:t xml:space="preserve"> Create a work document with your teammates names at the top followed by your results, to be submitted on Canvas. </w:t>
       </w:r>
     </w:p>
-    <w:p>
-      <w:pPr>
-        <w:pStyle w:val="Normal"/>
-        <w:rPr/>
-      </w:pPr>
-      <w:r>
-        <w:rPr/>
-      </w:r>
-    </w:p>
-    <w:p>
-      <w:pPr>
-        <w:pStyle w:val="Normal"/>
-        <w:rPr/>
-      </w:pPr>
-      <w:r>
-        <w:rPr/>
+    <w:p/>
+    <w:p>
+      <w:r>
+        <w:rPr>
+          <w:noProof/>
+        </w:rPr>
         <mc:AlternateContent>
           <mc:Choice Requires="wps">
             <w:drawing>
-              <wp:anchor distT="0" distB="12700" distL="0" distR="10795" simplePos="0" relativeHeight="3" behindDoc="0" locked="0" layoutInCell="1" allowOverlap="1" wp14:anchorId="3F3D3C7B">
+              <wp:anchor distT="0" distB="12700" distL="0" distR="10795" simplePos="0" relativeHeight="3" behindDoc="0" locked="0" layoutInCell="1" allowOverlap="1" wp14:anchorId="053501B8" wp14:editId="5D8F917C">
                 <wp:simplePos x="0" y="0"/>
                 <wp:positionH relativeFrom="column">
                   <wp:posOffset>0</wp:posOffset>
@@ -98,10 +78,11 @@
                 <wp:effectExtent l="635" t="6985" r="0" b="6985"/>
                 <wp:wrapNone/>
                 <wp:docPr id="1" name="Straight Connector 3"/>
+                <wp:cNvGraphicFramePr/>
                 <a:graphic xmlns:a="http://schemas.openxmlformats.org/drawingml/2006/main">
                   <a:graphicData uri="http://schemas.microsoft.com/office/word/2010/wordprocessingShape">
                     <wps:wsp>
-                      <wps:cNvSpPr/>
+                      <wps:cNvCnPr/>
                       <wps:spPr>
                         <a:xfrm>
                           <a:off x="0" y="0"/>
@@ -138,7 +119,7 @@
               </wp:anchor>
             </w:drawing>
           </mc:Choice>
-          <mc:Fallback>
+          <mc:Fallback xmlns:pic="http://schemas.openxmlformats.org/drawingml/2006/picture">
             <w:pict>
               <v:line id="shape_0" from="0pt,-0.05pt" to="542.15pt,-0.05pt" stroked="t" o:allowincell="f" style="position:absolute" wp14:anchorId="3F3D3C7B">
                 <v:stroke color="#bdd7ee" weight="12600" joinstyle="miter" endcap="flat"/>
@@ -152,7 +133,6 @@
     </w:p>
     <w:p>
       <w:pPr>
-        <w:pStyle w:val="Normal"/>
         <w:rPr>
           <w:color w:val="044361"/>
         </w:rPr>
@@ -165,13 +145,11 @@
         <w:t>Team:</w:t>
       </w:r>
       <w:r>
-        <w:rPr/>
         <w:t xml:space="preserve"> </w:t>
       </w:r>
     </w:p>
     <w:p>
       <w:pPr>
-        <w:pStyle w:val="Normal"/>
         <w:rPr>
           <w:color w:val="044361"/>
         </w:rPr>
@@ -187,16 +165,8 @@
       <w:tblPr>
         <w:tblStyle w:val="TableGrid"/>
         <w:tblW w:w="10975" w:type="dxa"/>
-        <w:jc w:val="start"/>
-        <w:tblInd w:w="0" w:type="dxa"/>
         <w:tblLayout w:type="fixed"/>
-        <w:tblCellMar>
-          <w:top w:w="0" w:type="dxa"/>
-          <w:start w:w="108" w:type="dxa"/>
-          <w:bottom w:w="0" w:type="dxa"/>
-          <w:end w:w="108" w:type="dxa"/>
-        </w:tblCellMar>
-        <w:tblLook w:noHBand="0" w:noVBand="1" w:firstColumn="1" w:lastRow="0" w:lastColumn="0" w:firstRow="1" w:val="04a0"/>
+        <w:tblLook w:val="04A0" w:firstRow="1" w:lastRow="0" w:firstColumn="1" w:lastColumn="0" w:noHBand="0" w:noVBand="1"/>
       </w:tblPr>
       <w:tblGrid>
         <w:gridCol w:w="3865"/>
@@ -205,29 +175,17 @@
       </w:tblGrid>
       <w:tr>
         <w:trPr>
-          <w:tblHeader w:val="true"/>
+          <w:tblHeader/>
         </w:trPr>
         <w:tc>
           <w:tcPr>
             <w:tcW w:w="3865" w:type="dxa"/>
-            <w:tcBorders/>
           </w:tcPr>
           <w:p>
             <w:pPr>
               <w:pStyle w:val="Heading1"/>
-              <w:widowControl/>
-              <w:spacing w:before="160" w:after="0"/>
-              <w:jc w:val="start"/>
-              <w:rPr>
-                <w:kern w:val="0"/>
-                <w:lang w:val="en-US" w:eastAsia="en-US" w:bidi="ar-SA"/>
-              </w:rPr>
             </w:pPr>
             <w:r>
-              <w:rPr>
-                <w:kern w:val="0"/>
-                <w:lang w:val="en-US" w:eastAsia="en-US" w:bidi="ar-SA"/>
-              </w:rPr>
               <w:t>Name</w:t>
             </w:r>
           </w:p>
@@ -235,24 +193,12 @@
         <w:tc>
           <w:tcPr>
             <w:tcW w:w="3060" w:type="dxa"/>
-            <w:tcBorders/>
           </w:tcPr>
           <w:p>
             <w:pPr>
               <w:pStyle w:val="Heading1"/>
-              <w:widowControl/>
-              <w:spacing w:before="160" w:after="0"/>
-              <w:jc w:val="start"/>
-              <w:rPr>
-                <w:kern w:val="0"/>
-                <w:lang w:val="en-US" w:eastAsia="en-US" w:bidi="ar-SA"/>
-              </w:rPr>
             </w:pPr>
             <w:r>
-              <w:rPr>
-                <w:kern w:val="0"/>
-                <w:lang w:val="en-US" w:eastAsia="en-US" w:bidi="ar-SA"/>
-              </w:rPr>
               <w:t>Email</w:t>
             </w:r>
           </w:p>
@@ -260,67 +206,51 @@
         <w:tc>
           <w:tcPr>
             <w:tcW w:w="4050" w:type="dxa"/>
-            <w:tcBorders/>
           </w:tcPr>
           <w:p>
             <w:pPr>
               <w:pStyle w:val="Heading1"/>
-              <w:widowControl/>
-              <w:spacing w:before="160" w:after="0"/>
               <w:jc w:val="center"/>
-              <w:rPr>
-                <w:kern w:val="0"/>
-                <w:lang w:val="en-US" w:eastAsia="en-US" w:bidi="ar-SA"/>
-              </w:rPr>
             </w:pPr>
             <w:r>
-              <w:rPr>
-                <w:kern w:val="0"/>
-                <w:lang w:val="en-US" w:eastAsia="en-US" w:bidi="ar-SA"/>
-              </w:rPr>
               <w:t>GitHub</w:t>
             </w:r>
           </w:p>
         </w:tc>
       </w:tr>
       <w:tr>
-        <w:trPr/>
         <w:tc>
           <w:tcPr>
             <w:tcW w:w="3865" w:type="dxa"/>
-            <w:tcBorders/>
           </w:tcPr>
           <w:p>
             <w:pPr>
-              <w:pStyle w:val="Normal"/>
-              <w:widowControl/>
-              <w:spacing w:before="0" w:after="0"/>
-              <w:jc w:val="start"/>
               <w:rPr>
                 <w:color w:val="054361"/>
               </w:rPr>
             </w:pPr>
             <w:r>
               <w:rPr>
-                <w:rFonts w:eastAsia="Times New Roman" w:cs="Times New Roman"/>
                 <w:color w:val="054361"/>
-                <w:kern w:val="0"/>
-                <w:lang w:val="en-US" w:eastAsia="en-US" w:bidi="ar-SA"/>
-              </w:rPr>
-              <w:t>Ethan Klasky</w:t>
-            </w:r>
+              </w:rPr>
+              <w:t xml:space="preserve">Ethan </w:t>
+            </w:r>
+            <w:proofErr w:type="spellStart"/>
+            <w:r>
+              <w:rPr>
+                <w:color w:val="054361"/>
+              </w:rPr>
+              <w:t>Klasky</w:t>
+            </w:r>
+            <w:proofErr w:type="spellEnd"/>
           </w:p>
         </w:tc>
         <w:tc>
           <w:tcPr>
             <w:tcW w:w="3060" w:type="dxa"/>
-            <w:tcBorders/>
           </w:tcPr>
           <w:p>
             <w:pPr>
-              <w:pStyle w:val="Normal"/>
-              <w:widowControl/>
-              <w:spacing w:before="0" w:after="0"/>
               <w:jc w:val="center"/>
               <w:rPr>
                 <w:color w:val="054361"/>
@@ -328,10 +258,7 @@
             </w:pPr>
             <w:r>
               <w:rPr>
-                <w:rFonts w:eastAsia="Times New Roman" w:cs="Times New Roman"/>
                 <w:color w:val="054361"/>
-                <w:kern w:val="0"/>
-                <w:lang w:val="en-US" w:eastAsia="en-US" w:bidi="ar-SA"/>
               </w:rPr>
               <w:t>eklasky@ufl.edu</w:t>
             </w:r>
@@ -340,90 +267,65 @@
         <w:tc>
           <w:tcPr>
             <w:tcW w:w="4050" w:type="dxa"/>
-            <w:tcBorders/>
           </w:tcPr>
           <w:p>
             <w:pPr>
-              <w:pStyle w:val="Normal"/>
-              <w:widowControl/>
-              <w:spacing w:before="0" w:after="0"/>
-              <w:jc w:val="start"/>
               <w:rPr>
                 <w:color w:val="054361"/>
               </w:rPr>
             </w:pPr>
             <w:r>
               <w:rPr>
-                <w:rFonts w:eastAsia="Times New Roman" w:cs="Times New Roman"/>
                 <w:color w:val="054361"/>
-                <w:kern w:val="0"/>
-                <w:lang w:val="en-US" w:eastAsia="en-US" w:bidi="ar-SA"/>
-              </w:rPr>
-              <w:t xml:space="preserve">                </w:t>
-            </w:r>
-            <w:r>
-              <w:rPr>
-                <w:rFonts w:eastAsia="Times New Roman" w:cs="Times New Roman"/>
-                <w:color w:val="054361"/>
-                <w:kern w:val="0"/>
-                <w:lang w:val="en-US" w:eastAsia="en-US" w:bidi="ar-SA"/>
-              </w:rPr>
-              <w:t>github.com/E53klasky</w:t>
+              </w:rPr>
+              <w:t xml:space="preserve">                github.com/E53klasky</w:t>
             </w:r>
           </w:p>
         </w:tc>
       </w:tr>
       <w:tr>
-        <w:trPr/>
         <w:tc>
           <w:tcPr>
             <w:tcW w:w="3865" w:type="dxa"/>
-            <w:tcBorders/>
           </w:tcPr>
           <w:p>
             <w:pPr>
-              <w:pStyle w:val="Normal"/>
-              <w:widowControl/>
-              <w:spacing w:before="0" w:after="0"/>
-              <w:jc w:val="start"/>
               <w:rPr>
                 <w:color w:val="054361"/>
               </w:rPr>
             </w:pPr>
             <w:r>
               <w:rPr>
-                <w:rFonts w:eastAsia="Times New Roman" w:cs="Times New Roman"/>
                 <w:color w:val="054361"/>
-                <w:kern w:val="0"/>
-                <w:lang w:val="en-US" w:eastAsia="en-US" w:bidi="ar-SA"/>
-              </w:rPr>
-              <w:t>Amit Athi Kesavan</w:t>
-            </w:r>
+              </w:rPr>
+              <w:t xml:space="preserve">Amit Athi </w:t>
+            </w:r>
+            <w:proofErr w:type="spellStart"/>
+            <w:r>
+              <w:rPr>
+                <w:color w:val="054361"/>
+              </w:rPr>
+              <w:t>Kesavan</w:t>
+            </w:r>
+            <w:proofErr w:type="spellEnd"/>
           </w:p>
         </w:tc>
         <w:tc>
           <w:tcPr>
             <w:tcW w:w="3060" w:type="dxa"/>
-            <w:tcBorders/>
           </w:tcPr>
           <w:p>
             <w:pPr>
-              <w:pStyle w:val="Normal"/>
-              <w:widowControl/>
-              <w:spacing w:before="0" w:after="0"/>
               <w:jc w:val="center"/>
               <w:rPr>
                 <w:color w:val="054361"/>
               </w:rPr>
             </w:pPr>
-            <w:hyperlink r:id="rId2">
+            <w:hyperlink r:id="rId8">
               <w:r>
                 <w:rPr>
                   <w:rStyle w:val="Hyperlink"/>
-                  <w:rFonts w:eastAsia="Times New Roman" w:cs="Times New Roman"/>
                   <w:color w:val="054361"/>
-                  <w:kern w:val="0"/>
-                  <w:lang w:val="en-US" w:eastAsia="en-US" w:bidi="ar-SA"/>
                 </w:rPr>
                 <w:t>Amit.athikesavan@ufl.edu</w:t>
               </w:r>
@@ -433,13 +335,9 @@
         <w:tc>
           <w:tcPr>
             <w:tcW w:w="4050" w:type="dxa"/>
-            <w:tcBorders/>
           </w:tcPr>
           <w:p>
             <w:pPr>
-              <w:pStyle w:val="Normal"/>
-              <w:widowControl/>
-              <w:spacing w:before="0" w:after="0"/>
               <w:jc w:val="center"/>
               <w:rPr>
                 <w:color w:val="054361"/>
@@ -447,10 +345,7 @@
             </w:pPr>
             <w:r>
               <w:rPr>
-                <w:rFonts w:eastAsia="Times New Roman" w:cs="Times New Roman"/>
                 <w:color w:val="054361"/>
-                <w:kern w:val="0"/>
-                <w:lang w:val="en-US" w:eastAsia="en-US" w:bidi="ar-SA"/>
               </w:rPr>
               <w:t>Github.com/amitathik7</w:t>
             </w:r>
@@ -458,43 +353,30 @@
         </w:tc>
       </w:tr>
       <w:tr>
-        <w:trPr/>
         <w:tc>
           <w:tcPr>
             <w:tcW w:w="3865" w:type="dxa"/>
-            <w:tcBorders/>
           </w:tcPr>
           <w:p>
             <w:pPr>
-              <w:pStyle w:val="Normal"/>
-              <w:widowControl/>
-              <w:spacing w:before="0" w:after="0"/>
-              <w:jc w:val="start"/>
               <w:rPr>
                 <w:color w:val="054361"/>
               </w:rPr>
             </w:pPr>
             <w:r>
               <w:rPr>
-                <w:rFonts w:eastAsia="Times New Roman" w:cs="Times New Roman"/>
                 <w:color w:val="054361"/>
-                <w:kern w:val="0"/>
-                <w:lang w:val="en-US" w:eastAsia="en-US" w:bidi="ar-SA"/>
-              </w:rPr>
-              <w:t>&lt;student3 name&gt;</w:t>
+              </w:rPr>
+              <w:t>Timothy Wang</w:t>
             </w:r>
           </w:p>
         </w:tc>
         <w:tc>
           <w:tcPr>
             <w:tcW w:w="3060" w:type="dxa"/>
-            <w:tcBorders/>
           </w:tcPr>
           <w:p>
             <w:pPr>
-              <w:pStyle w:val="Normal"/>
-              <w:widowControl/>
-              <w:spacing w:before="0" w:after="0"/>
               <w:jc w:val="center"/>
               <w:rPr>
                 <w:color w:val="054361"/>
@@ -502,25 +384,18 @@
             </w:pPr>
             <w:r>
               <w:rPr>
-                <w:rFonts w:eastAsia="Times New Roman" w:cs="Times New Roman"/>
                 <w:color w:val="054361"/>
-                <w:kern w:val="0"/>
-                <w:lang w:val="en-US" w:eastAsia="en-US" w:bidi="ar-SA"/>
-              </w:rPr>
-              <w:t>&lt;student3@ufl.edu&gt;</w:t>
+              </w:rPr>
+              <w:t>timothy.wang@ufl.edu</w:t>
             </w:r>
           </w:p>
         </w:tc>
         <w:tc>
           <w:tcPr>
             <w:tcW w:w="4050" w:type="dxa"/>
-            <w:tcBorders/>
           </w:tcPr>
           <w:p>
             <w:pPr>
-              <w:pStyle w:val="Normal"/>
-              <w:widowControl/>
-              <w:spacing w:before="0" w:after="0"/>
               <w:jc w:val="center"/>
               <w:rPr>
                 <w:color w:val="054361"/>
@@ -528,29 +403,17 @@
             </w:pPr>
             <w:r>
               <w:rPr>
-                <w:rFonts w:eastAsia="Times New Roman" w:cs="Times New Roman"/>
                 <w:color w:val="054361"/>
-                <w:kern w:val="0"/>
-                <w:lang w:val="en-US" w:eastAsia="en-US" w:bidi="ar-SA"/>
-              </w:rPr>
-              <w:t>&lt;github.com/student3&gt;</w:t>
+              </w:rPr>
+              <w:t>github.com/timothyw8</w:t>
             </w:r>
           </w:p>
         </w:tc>
       </w:tr>
     </w:tbl>
-    <w:p>
-      <w:pPr>
-        <w:pStyle w:val="Normal"/>
-        <w:rPr/>
-      </w:pPr>
-      <w:r>
-        <w:rPr/>
-      </w:r>
-    </w:p>
-    <w:p>
-      <w:pPr>
-        <w:pStyle w:val="Normal"/>
+    <w:p/>
+    <w:p>
+      <w:pPr>
         <w:rPr>
           <w:color w:val="054361"/>
         </w:rPr>
@@ -563,7 +426,6 @@
         <w:t>Data:</w:t>
       </w:r>
       <w:r>
-        <w:rPr/>
         <w:t xml:space="preserve"> </w:t>
       </w:r>
       <w:r>
@@ -573,18 +435,9 @@
         <w:t>&lt;Link to your dataset &gt;</w:t>
       </w:r>
     </w:p>
-    <w:p>
-      <w:pPr>
-        <w:pStyle w:val="Normal"/>
-        <w:rPr/>
-      </w:pPr>
-      <w:r>
-        <w:rPr/>
-      </w:r>
-    </w:p>
-    <w:p>
-      <w:pPr>
-        <w:pStyle w:val="Normal"/>
+    <w:p/>
+    <w:p>
+      <w:pPr>
         <w:rPr>
           <w:color w:val="054361"/>
         </w:rPr>
@@ -597,7 +450,6 @@
         <w:t>Scientific Question:</w:t>
       </w:r>
       <w:r>
-        <w:rPr/>
         <w:t xml:space="preserve"> </w:t>
       </w:r>
       <w:r>
@@ -607,20 +459,8 @@
         <w:t>&lt; Question you will answer using the data you’ve selected &gt;</w:t>
       </w:r>
     </w:p>
-    <w:p>
-      <w:pPr>
-        <w:pStyle w:val="Normal"/>
-        <w:rPr/>
-      </w:pPr>
-      <w:r>
-        <w:rPr/>
-      </w:r>
-    </w:p>
-    <w:p>
-      <w:pPr>
-        <w:pStyle w:val="Normal"/>
-        <w:rPr/>
-      </w:pPr>
+    <w:p/>
+    <w:p>
       <w:r>
         <w:rPr>
           <w:b/>
@@ -629,7 +469,6 @@
         <w:t>GitHub Repository for Project:</w:t>
       </w:r>
       <w:r>
-        <w:rPr/>
         <w:t xml:space="preserve"> </w:t>
       </w:r>
       <w:r>
@@ -642,14 +481,15 @@
     <w:p>
       <w:pPr>
         <w:pStyle w:val="Heading1"/>
-        <w:rPr/>
-      </w:pPr>
-      <w:r>
-        <w:rPr/>
+      </w:pPr>
+      <w:r>
+        <w:rPr>
+          <w:noProof/>
+        </w:rPr>
         <mc:AlternateContent>
           <mc:Choice Requires="wps">
             <w:drawing>
-              <wp:anchor distT="0" distB="12700" distL="0" distR="10795" simplePos="0" relativeHeight="4" behindDoc="0" locked="0" layoutInCell="1" allowOverlap="1" wp14:anchorId="10075158">
+              <wp:anchor distT="0" distB="12700" distL="0" distR="10795" simplePos="0" relativeHeight="4" behindDoc="0" locked="0" layoutInCell="1" allowOverlap="1" wp14:anchorId="67CD313D" wp14:editId="45E6E047">
                 <wp:simplePos x="0" y="0"/>
                 <wp:positionH relativeFrom="column">
                   <wp:posOffset>-3810</wp:posOffset>
@@ -661,10 +501,11 @@
                 <wp:effectExtent l="635" t="6350" r="0" b="6350"/>
                 <wp:wrapNone/>
                 <wp:docPr id="2" name="Straight Connector 1"/>
+                <wp:cNvGraphicFramePr/>
                 <a:graphic xmlns:a="http://schemas.openxmlformats.org/drawingml/2006/main">
                   <a:graphicData uri="http://schemas.microsoft.com/office/word/2010/wordprocessingShape">
                     <wps:wsp>
-                      <wps:cNvSpPr/>
+                      <wps:cNvCnPr/>
                       <wps:spPr>
                         <a:xfrm>
                           <a:off x="0" y="0"/>
@@ -701,7 +542,7 @@
               </wp:anchor>
             </w:drawing>
           </mc:Choice>
-          <mc:Fallback>
+          <mc:Fallback xmlns:pic="http://schemas.openxmlformats.org/drawingml/2006/picture">
             <w:pict>
               <v:line id="shape_0" from="-0.3pt,14.4pt" to="541.85pt,14.4pt" stroked="t" o:allowincell="f" style="position:absolute" wp14:anchorId="10075158">
                 <v:stroke color="#bdd7ee" weight="12600" joinstyle="miter" endcap="flat"/>
@@ -713,15 +554,7 @@
         </mc:AlternateContent>
       </w:r>
     </w:p>
-    <w:p>
-      <w:pPr>
-        <w:pStyle w:val="Normal"/>
-        <w:rPr/>
-      </w:pPr>
-      <w:r>
-        <w:rPr/>
-      </w:r>
-    </w:p>
+    <w:p/>
     <w:p>
       <w:pPr>
         <w:pStyle w:val="ListParagraph"/>
@@ -883,6 +716,22 @@
         </w:rPr>
         <w:t>Random forest</w:t>
       </w:r>
+      <w:r>
+        <w:rPr>
+          <w:i/>
+          <w:iCs/>
+          <w:color w:val="064462"/>
+        </w:rPr>
+        <w:t xml:space="preserve"> </w:t>
+      </w:r>
+      <w:r>
+        <w:rPr>
+          <w:i/>
+          <w:iCs/>
+          <w:color w:val="EE0000"/>
+        </w:rPr>
+        <w:t>Tim</w:t>
+      </w:r>
     </w:p>
     <w:p>
       <w:pPr>
@@ -938,7 +787,7 @@
         <w:rPr>
           <w:i/>
           <w:iCs/>
-          <w:color w:themeColor="text2" w:val="44546A"/>
+          <w:color w:val="44546A" w:themeColor="text2"/>
         </w:rPr>
       </w:pPr>
       <w:r>
@@ -946,7 +795,7 @@
           <w:rStyle w:val="Hyperlink"/>
           <w:i/>
           <w:iCs/>
-          <w:color w:themeColor="text2" w:val="44546A"/>
+          <w:color w:val="44546A" w:themeColor="text2"/>
           <w:u w:val="none"/>
         </w:rPr>
         <w:t>another method (with instructor permission only)</w:t>
@@ -971,7 +820,25 @@
           <w:iCs/>
           <w:color w:val="064462"/>
         </w:rPr>
-        <w:t>I recommend using the TidyModels, mlr3, or scikit-learn packages. Tutorials:</w:t>
+        <w:t xml:space="preserve">I recommend using the </w:t>
+      </w:r>
+      <w:proofErr w:type="spellStart"/>
+      <w:r>
+        <w:rPr>
+          <w:i/>
+          <w:iCs/>
+          <w:color w:val="064462"/>
+        </w:rPr>
+        <w:t>TidyModels</w:t>
+      </w:r>
+      <w:proofErr w:type="spellEnd"/>
+      <w:r>
+        <w:rPr>
+          <w:i/>
+          <w:iCs/>
+          <w:color w:val="064462"/>
+        </w:rPr>
+        <w:t>, mlr3, or scikit-learn packages. Tutorials:</w:t>
       </w:r>
     </w:p>
     <w:p>
@@ -987,7 +854,7 @@
           <w:color w:val="064462"/>
         </w:rPr>
       </w:pPr>
-      <w:hyperlink r:id="rId3">
+      <w:hyperlink r:id="rId9">
         <w:r>
           <w:rPr>
             <w:rStyle w:val="Hyperlink"/>
@@ -1011,7 +878,7 @@
           <w:color w:val="064462"/>
         </w:rPr>
       </w:pPr>
-      <w:hyperlink r:id="rId4">
+      <w:hyperlink r:id="rId10">
         <w:r>
           <w:rPr>
             <w:rStyle w:val="Hyperlink"/>
@@ -1043,7 +910,7 @@
           <w:color w:val="064462"/>
         </w:rPr>
       </w:pPr>
-      <w:hyperlink r:id="rId5">
+      <w:hyperlink r:id="rId11">
         <w:r>
           <w:rPr>
             <w:rStyle w:val="Hyperlink"/>
@@ -1075,7 +942,7 @@
           <w:color w:val="064462"/>
         </w:rPr>
       </w:pPr>
-      <w:hyperlink r:id="rId6">
+      <w:hyperlink r:id="rId12">
         <w:r>
           <w:rPr>
             <w:rStyle w:val="Hyperlink"/>
@@ -1118,8 +985,7 @@
     </w:p>
     <w:p>
       <w:pPr>
-        <w:pStyle w:val="Normal"/>
-        <w:ind w:start="1080"/>
+        <w:ind w:left="1080"/>
         <w:rPr>
           <w:i/>
           <w:iCs/>
@@ -1137,21 +1003,47 @@
     </w:p>
     <w:p>
       <w:pPr>
-        <w:pStyle w:val="Normal"/>
-        <w:ind w:start="1080"/>
-        <w:rPr>
-          <w:i/>
-          <w:iCs/>
-          <w:color w:val="EE0000"/>
-        </w:rPr>
-      </w:pPr>
-      <w:r>
-        <w:rPr>
-          <w:i/>
-          <w:iCs/>
-          <w:color w:val="EE0000"/>
-        </w:rPr>
-      </w:r>
+        <w:ind w:left="1080"/>
+        <w:rPr>
+          <w:i/>
+          <w:iCs/>
+          <w:color w:val="EE0000"/>
+        </w:rPr>
+      </w:pPr>
+    </w:p>
+    <w:p>
+      <w:pPr>
+        <w:ind w:left="1080"/>
+        <w:rPr>
+          <w:color w:val="EE0000"/>
+        </w:rPr>
+      </w:pPr>
+      <w:r>
+        <w:rPr>
+          <w:color w:val="EE0000"/>
+        </w:rPr>
+        <w:t xml:space="preserve">For Random Forest, it predicted whether the samples were in the tuberculosis or healthy group. Using 100 decision trees, the model achieved an accuracy of 91.46 percent. This suggests that Random Forest was able to determine which group the samples belonged in with high accuracy. </w:t>
+      </w:r>
+    </w:p>
+    <w:p>
+      <w:pPr>
+        <w:ind w:left="1080"/>
+        <w:rPr>
+          <w:i/>
+          <w:iCs/>
+          <w:color w:val="EE0000"/>
+        </w:rPr>
+      </w:pPr>
+    </w:p>
+    <w:p>
+      <w:pPr>
+        <w:ind w:left="1080"/>
+        <w:rPr>
+          <w:i/>
+          <w:iCs/>
+          <w:color w:val="EE0000"/>
+        </w:rPr>
+      </w:pPr>
     </w:p>
     <w:p>
       <w:pPr>
@@ -1177,59 +1069,55 @@
     </w:p>
     <w:p>
       <w:pPr>
-        <w:pStyle w:val="Normal"/>
-        <w:ind w:start="1080"/>
-        <w:rPr>
-          <w:i/>
-          <w:iCs/>
-          <w:color w:val="EE0000"/>
-        </w:rPr>
-      </w:pPr>
-      <w:r>
-        <w:rPr>
-          <w:i/>
-          <w:iCs/>
-          <w:color w:val="EE0000"/>
-        </w:rPr>
-      </w:r>
-    </w:p>
-    <w:p>
-      <w:pPr>
-        <w:pStyle w:val="Normal"/>
-        <w:ind w:start="1080"/>
-        <w:rPr>
-          <w:color w:val="EE0000"/>
-        </w:rPr>
-      </w:pPr>
-      <w:r>
-        <w:rPr>
-          <w:color w:val="EE0000"/>
-        </w:rPr>
-        <w:t>The K-means clustering approach from Assignment 3 was reproduced using k=2 and the 1,000 most variable genes. This configuration was selected because it showed the strongest association with TB versus healthy-control status in Assignment 3  (X^2 = 46.00, adjusted p = 4.73 × 10^-11). The resulting clusters contained 430 and 389 samples.</w:t>
-      </w:r>
-    </w:p>
-    <w:p>
-      <w:pPr>
-        <w:pStyle w:val="Normal"/>
-        <w:ind w:start="1080"/>
-        <w:rPr>
-          <w:i/>
-          <w:iCs/>
-          <w:color w:val="EE0000"/>
-        </w:rPr>
-      </w:pPr>
-      <w:r>
-        <w:rPr>
-          <w:i/>
-          <w:iCs/>
-          <w:color w:val="EE0000"/>
-        </w:rPr>
-      </w:r>
-    </w:p>
-    <w:p>
-      <w:pPr>
-        <w:pStyle w:val="Normal"/>
-        <w:ind w:start="1080"/>
+        <w:ind w:left="1080"/>
+        <w:rPr>
+          <w:i/>
+          <w:iCs/>
+          <w:color w:val="EE0000"/>
+        </w:rPr>
+      </w:pPr>
+    </w:p>
+    <w:p>
+      <w:pPr>
+        <w:ind w:left="1080"/>
+        <w:rPr>
+          <w:color w:val="EE0000"/>
+        </w:rPr>
+      </w:pPr>
+      <w:r>
+        <w:rPr>
+          <w:color w:val="EE0000"/>
+        </w:rPr>
+        <w:t xml:space="preserve">The K-means clustering approach from Assignment 3 was reproduced using k=2 and the 1,000 most variable genes. This configuration was selected because it showed the strongest association with TB versus healthy-control status in Assignment </w:t>
+      </w:r>
+      <w:proofErr w:type="gramStart"/>
+      <w:r>
+        <w:rPr>
+          <w:color w:val="EE0000"/>
+        </w:rPr>
+        <w:t>3  (</w:t>
+      </w:r>
+      <w:proofErr w:type="gramEnd"/>
+      <w:r>
+        <w:rPr>
+          <w:color w:val="EE0000"/>
+        </w:rPr>
+        <w:t>X^2 = 46.00, adjusted p = 4.73 × 10^-11). The resulting clusters contained 430 and 389 samples.</w:t>
+      </w:r>
+    </w:p>
+    <w:p>
+      <w:pPr>
+        <w:ind w:left="1080"/>
+        <w:rPr>
+          <w:i/>
+          <w:iCs/>
+          <w:color w:val="EE0000"/>
+        </w:rPr>
+      </w:pPr>
+    </w:p>
+    <w:p>
+      <w:pPr>
+        <w:ind w:left="1080"/>
         <w:rPr>
           <w:color w:val="EE0000"/>
         </w:rPr>
@@ -1243,57 +1131,61 @@
     </w:p>
     <w:p>
       <w:pPr>
-        <w:pStyle w:val="Normal"/>
-        <w:ind w:start="1080"/>
-        <w:rPr>
-          <w:i/>
-          <w:iCs/>
-          <w:color w:val="EE0000"/>
-        </w:rPr>
-      </w:pPr>
-      <w:r>
-        <w:rPr>
-          <w:i/>
-          <w:iCs/>
-          <w:color w:val="EE0000"/>
-        </w:rPr>
-      </w:r>
-    </w:p>
-    <w:p>
-      <w:pPr>
-        <w:pStyle w:val="Normal"/>
-        <w:ind w:start="1080"/>
-        <w:rPr>
-          <w:i/>
-          <w:iCs/>
-          <w:color w:val="EE0000"/>
-        </w:rPr>
-      </w:pPr>
-      <w:r>
-        <w:rPr>
-          <w:i/>
-          <w:iCs/>
-          <w:color w:val="EE0000"/>
-        </w:rPr>
-      </w:r>
-    </w:p>
-    <w:p>
-      <w:pPr>
-        <w:pStyle w:val="Normal"/>
-        <w:ind w:start="1080"/>
-        <w:rPr>
-          <w:i/>
-          <w:iCs/>
-          <w:color w:val="EE0000"/>
-        </w:rPr>
-      </w:pPr>
-      <w:r>
-        <w:rPr>
-          <w:i/>
-          <w:iCs/>
-          <w:color w:val="EE0000"/>
-        </w:rPr>
-      </w:r>
+        <w:ind w:left="1080"/>
+        <w:rPr>
+          <w:i/>
+          <w:iCs/>
+          <w:color w:val="EE0000"/>
+        </w:rPr>
+      </w:pPr>
+    </w:p>
+    <w:p>
+      <w:pPr>
+        <w:ind w:left="1080"/>
+        <w:rPr>
+          <w:color w:val="EE0000"/>
+        </w:rPr>
+      </w:pPr>
+      <w:r>
+        <w:rPr>
+          <w:color w:val="EE0000"/>
+        </w:rPr>
+        <w:t xml:space="preserve">For Random Forest, I used three clusters from Gaussian Mixture and got a 98.17% accuracy when it used 80% of samples for training and the remaining 20 for testing. This high accuracy suggests that Random Forest </w:t>
+      </w:r>
+      <w:proofErr w:type="gramStart"/>
+      <w:r>
+        <w:rPr>
+          <w:color w:val="EE0000"/>
+        </w:rPr>
+        <w:t>is able to</w:t>
+      </w:r>
+      <w:proofErr w:type="gramEnd"/>
+      <w:r>
+        <w:rPr>
+          <w:color w:val="EE0000"/>
+        </w:rPr>
+        <w:t xml:space="preserve"> reproduce the clusters from gaussian Mixture. </w:t>
+      </w:r>
+    </w:p>
+    <w:p>
+      <w:pPr>
+        <w:ind w:left="1080"/>
+        <w:rPr>
+          <w:i/>
+          <w:iCs/>
+          <w:color w:val="EE0000"/>
+        </w:rPr>
+      </w:pPr>
+    </w:p>
+    <w:p>
+      <w:pPr>
+        <w:ind w:left="1080"/>
+        <w:rPr>
+          <w:i/>
+          <w:iCs/>
+          <w:color w:val="EE0000"/>
+        </w:rPr>
+      </w:pPr>
     </w:p>
     <w:p>
       <w:pPr>
@@ -1330,7 +1222,7 @@
     <w:p>
       <w:pPr>
         <w:pStyle w:val="ListParagraph"/>
-        <w:ind w:start="1440"/>
+        <w:ind w:left="1440"/>
         <w:rPr>
           <w:color w:val="EE0000"/>
         </w:rPr>
@@ -1345,16 +1237,11 @@
     <w:p>
       <w:pPr>
         <w:pStyle w:val="ListParagraph"/>
-        <w:ind w:start="1440"/>
-        <w:rPr>
-          <w:color w:val="EE0000"/>
-        </w:rPr>
-      </w:pPr>
-      <w:r>
-        <w:rPr>
-          <w:color w:val="EE0000"/>
-        </w:rPr>
-      </w:r>
+        <w:ind w:left="1440"/>
+        <w:rPr>
+          <w:color w:val="EE0000"/>
+        </w:rPr>
+      </w:pPr>
     </w:p>
     <w:p>
       <w:pPr>
@@ -1402,50 +1289,32 @@
     </w:p>
     <w:p>
       <w:pPr>
-        <w:pStyle w:val="Normal"/>
-        <w:rPr>
-          <w:i/>
-          <w:iCs/>
-          <w:color w:val="EE0000"/>
-        </w:rPr>
-      </w:pPr>
-      <w:r>
-        <w:rPr>
-          <w:i/>
-          <w:iCs/>
-          <w:color w:val="EE0000"/>
-        </w:rPr>
-        <w:t xml:space="preserve"> </w:t>
-      </w:r>
-      <w:r>
-        <w:rPr>
-          <w:i/>
-          <w:iCs/>
-          <w:color w:val="EE0000"/>
-        </w:rPr>
-        <w:t>Logistic regression was used to predict disease labels for 164 test samples using the 5,000 most variable genes. Each sample was classified as either a healthy control (0) or a tuberculosis subject (1). The model correctly classified 157 out of 164 samples, achieving 95.73% accuracy and an AUC of 1.000. The predicted labels were saved for each sample so they could be combined with the other supervised learning models to count how many models predicted each class.</w:t>
-      </w:r>
-    </w:p>
-    <w:p>
-      <w:pPr>
-        <w:pStyle w:val="Normal"/>
-        <w:rPr>
-          <w:i/>
-          <w:iCs/>
-          <w:color w:val="EE0000"/>
-        </w:rPr>
-      </w:pPr>
-      <w:r>
-        <w:rPr>
-          <w:i/>
-          <w:iCs/>
-          <w:color w:val="EE0000"/>
-        </w:rPr>
-      </w:r>
-    </w:p>
-    <w:p>
-      <w:pPr>
-        <w:pStyle w:val="Normal"/>
+        <w:rPr>
+          <w:i/>
+          <w:iCs/>
+          <w:color w:val="EE0000"/>
+        </w:rPr>
+      </w:pPr>
+      <w:r>
+        <w:rPr>
+          <w:i/>
+          <w:iCs/>
+          <w:color w:val="EE0000"/>
+        </w:rPr>
+        <w:t xml:space="preserve"> Logistic regression was used to predict disease labels for 164 test samples using the 5,000 most variable genes. Each sample was classified as either a healthy control (0) or a tuberculosis subject (1). The model correctly classified 157 out of 164 samples, achieving 95.73% accuracy and an AUC of 1.000. The predicted labels were saved for each sample so they could be combined with the other supervised learning models to count how many models predicted each class.</w:t>
+      </w:r>
+    </w:p>
+    <w:p>
+      <w:pPr>
+        <w:rPr>
+          <w:i/>
+          <w:iCs/>
+          <w:color w:val="EE0000"/>
+        </w:rPr>
+      </w:pPr>
+    </w:p>
+    <w:p>
+      <w:pPr>
         <w:rPr>
           <w:i/>
           <w:iCs/>
@@ -1485,7 +1354,6 @@
     </w:p>
     <w:p>
       <w:pPr>
-        <w:pStyle w:val="Normal"/>
         <w:rPr>
           <w:i/>
           <w:iCs/>
@@ -1503,20 +1371,12 @@
     </w:p>
     <w:p>
       <w:pPr>
-        <w:pStyle w:val="Normal"/>
-        <w:rPr>
-          <w:i/>
-          <w:iCs/>
-          <w:color w:val="EE0000"/>
-        </w:rPr>
-      </w:pPr>
-      <w:r>
-        <w:rPr>
-          <w:i/>
-          <w:iCs/>
-          <w:color w:val="EE0000"/>
-        </w:rPr>
-      </w:r>
+        <w:rPr>
+          <w:i/>
+          <w:iCs/>
+          <w:color w:val="EE0000"/>
+        </w:rPr>
+      </w:pPr>
     </w:p>
     <w:p>
       <w:pPr>
@@ -1542,57 +1402,58 @@
     </w:p>
     <w:p>
       <w:pPr>
-        <w:pStyle w:val="Normal"/>
-        <w:rPr>
-          <w:i/>
-          <w:iCs/>
-          <w:color w:val="EE0000"/>
-        </w:rPr>
-      </w:pPr>
-      <w:r>
-        <w:rPr>
-          <w:i/>
-          <w:iCs/>
-          <w:color w:val="EE0000"/>
-        </w:rPr>
-        <w:t>To evaluate prediction stability, we generated disease and cluster predictions for the same 164 test samples using logistic regression. The predictions were saved so they could be compared with the other supervised learning methods. Once all models are combined, we will calculate the proportion of models agreeing on each sample's disease and cluster labels. Spearman's correlation test will then be used to determine whether disease prediction stability correlates with cluster prediction stability. If multiple statistical tests are performed, p-values will be adjusted using the Benjamini–Hochberg method. The correlation results will be reported after combining all team members' predictions.</w:t>
-      </w:r>
-    </w:p>
-    <w:p>
-      <w:pPr>
-        <w:pStyle w:val="Normal"/>
-        <w:ind w:start="1080"/>
-        <w:rPr>
-          <w:i/>
-          <w:iCs/>
-          <w:color w:val="EE0000"/>
-        </w:rPr>
-      </w:pPr>
-      <w:r>
-        <w:rPr>
-          <w:i/>
-          <w:iCs/>
-          <w:color w:val="EE0000"/>
-        </w:rPr>
-      </w:r>
-    </w:p>
-    <w:p>
-      <w:pPr>
-        <w:pStyle w:val="Normal"/>
-        <w:ind w:start="1080"/>
-        <w:rPr>
-          <w:i/>
-          <w:iCs/>
-          <w:color w:val="064462"/>
-        </w:rPr>
-      </w:pPr>
-      <w:r>
-        <w:rPr>
-          <w:i/>
-          <w:iCs/>
-          <w:color w:val="064462"/>
-        </w:rPr>
-      </w:r>
+        <w:rPr>
+          <w:i/>
+          <w:iCs/>
+          <w:color w:val="EE0000"/>
+        </w:rPr>
+      </w:pPr>
+      <w:r>
+        <w:rPr>
+          <w:i/>
+          <w:iCs/>
+          <w:color w:val="EE0000"/>
+        </w:rPr>
+        <w:t xml:space="preserve">To evaluate prediction stability, we generated disease and cluster predictions for the same 164 test samples using logistic regression. The predictions were saved so they could be compared with the other supervised learning methods. Once all models are combined, we will calculate the proportion of models agreeing on each sample's disease and cluster labels. Spearman's correlation test will then be used to determine whether disease prediction stability correlates with cluster prediction stability. If multiple statistical tests are performed, p-values will be adjusted using the </w:t>
+      </w:r>
+      <w:proofErr w:type="spellStart"/>
+      <w:r>
+        <w:rPr>
+          <w:i/>
+          <w:iCs/>
+          <w:color w:val="EE0000"/>
+        </w:rPr>
+        <w:t>Benjamini</w:t>
+      </w:r>
+      <w:proofErr w:type="spellEnd"/>
+      <w:r>
+        <w:rPr>
+          <w:i/>
+          <w:iCs/>
+          <w:color w:val="EE0000"/>
+        </w:rPr>
+        <w:t>–Hochberg method. The correlation results will be reported after combining all team members' predictions.</w:t>
+      </w:r>
+    </w:p>
+    <w:p>
+      <w:pPr>
+        <w:ind w:left="1080"/>
+        <w:rPr>
+          <w:i/>
+          <w:iCs/>
+          <w:color w:val="EE0000"/>
+        </w:rPr>
+      </w:pPr>
+    </w:p>
+    <w:p>
+      <w:pPr>
+        <w:ind w:left="1080"/>
+        <w:rPr>
+          <w:i/>
+          <w:iCs/>
+          <w:color w:val="064462"/>
+        </w:rPr>
+      </w:pPr>
     </w:p>
     <w:p>
       <w:pPr>
@@ -1635,12 +1496,12 @@
           <w:iCs/>
           <w:color w:val="064462"/>
         </w:rPr>
+        <w:lastRenderedPageBreak/>
         <w:t xml:space="preserve">How did the number of genes affect the results? </w:t>
       </w:r>
     </w:p>
     <w:p>
       <w:pPr>
-        <w:pStyle w:val="Normal"/>
         <w:rPr>
           <w:i/>
           <w:iCs/>
@@ -1658,35 +1519,19 @@
     </w:p>
     <w:p>
       <w:pPr>
-        <w:pStyle w:val="Normal"/>
-        <w:rPr>
-          <w:i/>
-          <w:iCs/>
-          <w:color w:val="EE0000"/>
-        </w:rPr>
-      </w:pPr>
-      <w:r>
-        <w:rPr>
-          <w:i/>
-          <w:iCs/>
-          <w:color w:val="EE0000"/>
-        </w:rPr>
-      </w:r>
+        <w:rPr>
+          <w:i/>
+          <w:iCs/>
+          <w:color w:val="EE0000"/>
+        </w:rPr>
+      </w:pPr>
     </w:p>
     <w:tbl>
       <w:tblPr>
         <w:tblStyle w:val="TableGrid"/>
         <w:tblW w:w="5443" w:type="dxa"/>
-        <w:jc w:val="start"/>
-        <w:tblInd w:w="0" w:type="dxa"/>
         <w:tblLayout w:type="fixed"/>
-        <w:tblCellMar>
-          <w:top w:w="0" w:type="dxa"/>
-          <w:start w:w="108" w:type="dxa"/>
-          <w:bottom w:w="0" w:type="dxa"/>
-          <w:end w:w="108" w:type="dxa"/>
-        </w:tblCellMar>
-        <w:tblLook w:noHBand="0" w:noVBand="1" w:firstColumn="1" w:lastRow="0" w:lastColumn="0" w:firstRow="1" w:val="04a0"/>
+        <w:tblLook w:val="04A0" w:firstRow="1" w:lastRow="0" w:firstColumn="1" w:lastColumn="0" w:noHBand="0" w:noVBand="1"/>
       </w:tblPr>
       <w:tblGrid>
         <w:gridCol w:w="1814"/>
@@ -1695,19 +1540,14 @@
       </w:tblGrid>
       <w:tr>
         <w:trPr>
-          <w:trHeight w:val="1002" w:hRule="atLeast"/>
+          <w:trHeight w:val="1002"/>
         </w:trPr>
         <w:tc>
           <w:tcPr>
             <w:tcW w:w="1814" w:type="dxa"/>
-            <w:tcBorders/>
           </w:tcPr>
           <w:p>
             <w:pPr>
-              <w:pStyle w:val="Normal"/>
-              <w:widowControl/>
-              <w:spacing w:before="0" w:after="0"/>
-              <w:jc w:val="start"/>
               <w:rPr>
                 <w:i/>
                 <w:iCs/>
@@ -1716,12 +1556,9 @@
             </w:pPr>
             <w:r>
               <w:rPr>
-                <w:rFonts w:eastAsia="Times New Roman" w:cs="Times New Roman"/>
-                <w:i/>
-                <w:iCs/>
-                <w:color w:val="EE0000"/>
-                <w:kern w:val="0"/>
-                <w:lang w:val="en-US" w:eastAsia="en-US" w:bidi="ar-SA"/>
+                <w:i/>
+                <w:iCs/>
+                <w:color w:val="EE0000"/>
               </w:rPr>
               <w:t>Number of genes</w:t>
             </w:r>
@@ -1730,14 +1567,9 @@
         <w:tc>
           <w:tcPr>
             <w:tcW w:w="1814" w:type="dxa"/>
-            <w:tcBorders/>
           </w:tcPr>
           <w:p>
             <w:pPr>
-              <w:pStyle w:val="Normal"/>
-              <w:widowControl/>
-              <w:spacing w:before="0" w:after="0"/>
-              <w:jc w:val="start"/>
               <w:rPr>
                 <w:i/>
                 <w:iCs/>
@@ -1746,12 +1578,9 @@
             </w:pPr>
             <w:r>
               <w:rPr>
-                <w:rFonts w:eastAsia="Times New Roman" w:cs="Times New Roman"/>
-                <w:i/>
-                <w:iCs/>
-                <w:color w:val="EE0000"/>
-                <w:kern w:val="0"/>
-                <w:lang w:val="en-US" w:eastAsia="en-US" w:bidi="ar-SA"/>
+                <w:i/>
+                <w:iCs/>
+                <w:color w:val="EE0000"/>
               </w:rPr>
               <w:t>Disease AUC</w:t>
             </w:r>
@@ -1760,14 +1589,9 @@
         <w:tc>
           <w:tcPr>
             <w:tcW w:w="1815" w:type="dxa"/>
-            <w:tcBorders/>
           </w:tcPr>
           <w:p>
             <w:pPr>
-              <w:pStyle w:val="Normal"/>
-              <w:widowControl/>
-              <w:spacing w:before="0" w:after="0"/>
-              <w:jc w:val="start"/>
               <w:rPr>
                 <w:i/>
                 <w:iCs/>
@@ -1776,12 +1600,9 @@
             </w:pPr>
             <w:r>
               <w:rPr>
-                <w:rFonts w:eastAsia="Times New Roman" w:cs="Times New Roman"/>
-                <w:i/>
-                <w:iCs/>
-                <w:color w:val="EE0000"/>
-                <w:kern w:val="0"/>
-                <w:lang w:val="en-US" w:eastAsia="en-US" w:bidi="ar-SA"/>
+                <w:i/>
+                <w:iCs/>
+                <w:color w:val="EE0000"/>
               </w:rPr>
               <w:t>Cluster AUC</w:t>
             </w:r>
@@ -1790,19 +1611,14 @@
       </w:tr>
       <w:tr>
         <w:trPr>
-          <w:trHeight w:val="1002" w:hRule="atLeast"/>
+          <w:trHeight w:val="1002"/>
         </w:trPr>
         <w:tc>
           <w:tcPr>
             <w:tcW w:w="1814" w:type="dxa"/>
-            <w:tcBorders/>
           </w:tcPr>
           <w:p>
             <w:pPr>
-              <w:pStyle w:val="Normal"/>
-              <w:widowControl/>
-              <w:spacing w:before="0" w:after="0"/>
-              <w:jc w:val="start"/>
               <w:rPr>
                 <w:i/>
                 <w:iCs/>
@@ -1811,12 +1627,9 @@
             </w:pPr>
             <w:r>
               <w:rPr>
-                <w:rFonts w:eastAsia="Times New Roman" w:cs="Times New Roman"/>
-                <w:i/>
-                <w:iCs/>
-                <w:color w:val="EE0000"/>
-                <w:kern w:val="0"/>
-                <w:lang w:val="en-US" w:eastAsia="en-US" w:bidi="ar-SA"/>
+                <w:i/>
+                <w:iCs/>
+                <w:color w:val="EE0000"/>
               </w:rPr>
               <w:t>10</w:t>
             </w:r>
@@ -1825,14 +1638,9 @@
         <w:tc>
           <w:tcPr>
             <w:tcW w:w="1814" w:type="dxa"/>
-            <w:tcBorders/>
           </w:tcPr>
           <w:p>
             <w:pPr>
-              <w:pStyle w:val="Normal"/>
-              <w:widowControl/>
-              <w:spacing w:before="0" w:after="0"/>
-              <w:jc w:val="start"/>
               <w:rPr>
                 <w:i/>
                 <w:iCs/>
@@ -1841,12 +1649,9 @@
             </w:pPr>
             <w:r>
               <w:rPr>
-                <w:rFonts w:eastAsia="Times New Roman" w:cs="Times New Roman"/>
-                <w:i/>
-                <w:iCs/>
-                <w:color w:val="EE0000"/>
-                <w:kern w:val="0"/>
-                <w:lang w:val="en-US" w:eastAsia="en-US" w:bidi="ar-SA"/>
+                <w:i/>
+                <w:iCs/>
+                <w:color w:val="EE0000"/>
               </w:rPr>
               <w:t>0.8336</w:t>
             </w:r>
@@ -1855,14 +1660,9 @@
         <w:tc>
           <w:tcPr>
             <w:tcW w:w="1815" w:type="dxa"/>
-            <w:tcBorders/>
           </w:tcPr>
           <w:p>
             <w:pPr>
-              <w:pStyle w:val="Normal"/>
-              <w:widowControl/>
-              <w:spacing w:before="0" w:after="0"/>
-              <w:jc w:val="start"/>
               <w:rPr>
                 <w:i/>
                 <w:iCs/>
@@ -1871,12 +1671,9 @@
             </w:pPr>
             <w:r>
               <w:rPr>
-                <w:rFonts w:eastAsia="Times New Roman" w:cs="Times New Roman"/>
-                <w:i/>
-                <w:iCs/>
-                <w:color w:val="EE0000"/>
-                <w:kern w:val="0"/>
-                <w:lang w:val="en-US" w:eastAsia="en-US" w:bidi="ar-SA"/>
+                <w:i/>
+                <w:iCs/>
+                <w:color w:val="EE0000"/>
               </w:rPr>
               <w:t>0.7791</w:t>
             </w:r>
@@ -1885,19 +1682,14 @@
       </w:tr>
       <w:tr>
         <w:trPr>
-          <w:trHeight w:val="1002" w:hRule="atLeast"/>
+          <w:trHeight w:val="1002"/>
         </w:trPr>
         <w:tc>
           <w:tcPr>
             <w:tcW w:w="1814" w:type="dxa"/>
-            <w:tcBorders/>
           </w:tcPr>
           <w:p>
             <w:pPr>
-              <w:pStyle w:val="Normal"/>
-              <w:widowControl/>
-              <w:spacing w:before="0" w:after="0"/>
-              <w:jc w:val="start"/>
               <w:rPr>
                 <w:i/>
                 <w:iCs/>
@@ -1906,12 +1698,9 @@
             </w:pPr>
             <w:r>
               <w:rPr>
-                <w:rFonts w:eastAsia="Times New Roman" w:cs="Times New Roman"/>
-                <w:i/>
-                <w:iCs/>
-                <w:color w:val="EE0000"/>
-                <w:kern w:val="0"/>
-                <w:lang w:val="en-US" w:eastAsia="en-US" w:bidi="ar-SA"/>
+                <w:i/>
+                <w:iCs/>
+                <w:color w:val="EE0000"/>
               </w:rPr>
               <w:t>100</w:t>
             </w:r>
@@ -1920,14 +1709,9 @@
         <w:tc>
           <w:tcPr>
             <w:tcW w:w="1814" w:type="dxa"/>
-            <w:tcBorders/>
           </w:tcPr>
           <w:p>
             <w:pPr>
-              <w:pStyle w:val="Normal"/>
-              <w:widowControl/>
-              <w:spacing w:before="0" w:after="0"/>
-              <w:jc w:val="start"/>
               <w:rPr>
                 <w:i/>
                 <w:iCs/>
@@ -1936,12 +1720,9 @@
             </w:pPr>
             <w:r>
               <w:rPr>
-                <w:rFonts w:eastAsia="Times New Roman" w:cs="Times New Roman"/>
-                <w:i/>
-                <w:iCs/>
-                <w:color w:val="EE0000"/>
-                <w:kern w:val="0"/>
-                <w:lang w:val="en-US" w:eastAsia="en-US" w:bidi="ar-SA"/>
+                <w:i/>
+                <w:iCs/>
+                <w:color w:val="EE0000"/>
               </w:rPr>
               <w:t>0.9911</w:t>
             </w:r>
@@ -1950,14 +1731,9 @@
         <w:tc>
           <w:tcPr>
             <w:tcW w:w="1815" w:type="dxa"/>
-            <w:tcBorders/>
           </w:tcPr>
           <w:p>
             <w:pPr>
-              <w:pStyle w:val="Normal"/>
-              <w:widowControl/>
-              <w:spacing w:before="0" w:after="0"/>
-              <w:jc w:val="start"/>
               <w:rPr>
                 <w:i/>
                 <w:iCs/>
@@ -1966,12 +1742,9 @@
             </w:pPr>
             <w:r>
               <w:rPr>
-                <w:rFonts w:eastAsia="Times New Roman" w:cs="Times New Roman"/>
-                <w:i/>
-                <w:iCs/>
-                <w:color w:val="EE0000"/>
-                <w:kern w:val="0"/>
-                <w:lang w:val="en-US" w:eastAsia="en-US" w:bidi="ar-SA"/>
+                <w:i/>
+                <w:iCs/>
+                <w:color w:val="EE0000"/>
               </w:rPr>
               <w:t>1.0000</w:t>
             </w:r>
@@ -1980,19 +1753,14 @@
       </w:tr>
       <w:tr>
         <w:trPr>
-          <w:trHeight w:val="1002" w:hRule="atLeast"/>
+          <w:trHeight w:val="1002"/>
         </w:trPr>
         <w:tc>
           <w:tcPr>
             <w:tcW w:w="1814" w:type="dxa"/>
-            <w:tcBorders/>
           </w:tcPr>
           <w:p>
             <w:pPr>
-              <w:pStyle w:val="Normal"/>
-              <w:widowControl/>
-              <w:spacing w:before="0" w:after="0"/>
-              <w:jc w:val="start"/>
               <w:rPr>
                 <w:i/>
                 <w:iCs/>
@@ -2001,12 +1769,9 @@
             </w:pPr>
             <w:r>
               <w:rPr>
-                <w:rFonts w:eastAsia="Times New Roman" w:cs="Times New Roman"/>
-                <w:i/>
-                <w:iCs/>
-                <w:color w:val="EE0000"/>
-                <w:kern w:val="0"/>
-                <w:lang w:val="en-US" w:eastAsia="en-US" w:bidi="ar-SA"/>
+                <w:i/>
+                <w:iCs/>
+                <w:color w:val="EE0000"/>
               </w:rPr>
               <w:t>1,000</w:t>
             </w:r>
@@ -2015,14 +1780,9 @@
         <w:tc>
           <w:tcPr>
             <w:tcW w:w="1814" w:type="dxa"/>
-            <w:tcBorders/>
           </w:tcPr>
           <w:p>
             <w:pPr>
-              <w:pStyle w:val="Normal"/>
-              <w:widowControl/>
-              <w:spacing w:before="0" w:after="0"/>
-              <w:jc w:val="start"/>
               <w:rPr>
                 <w:i/>
                 <w:iCs/>
@@ -2031,12 +1791,9 @@
             </w:pPr>
             <w:r>
               <w:rPr>
-                <w:rFonts w:eastAsia="Times New Roman" w:cs="Times New Roman"/>
-                <w:i/>
-                <w:iCs/>
-                <w:color w:val="EE0000"/>
-                <w:kern w:val="0"/>
-                <w:lang w:val="en-US" w:eastAsia="en-US" w:bidi="ar-SA"/>
+                <w:i/>
+                <w:iCs/>
+                <w:color w:val="EE0000"/>
               </w:rPr>
               <w:t>0.9920</w:t>
             </w:r>
@@ -2045,14 +1802,9 @@
         <w:tc>
           <w:tcPr>
             <w:tcW w:w="1815" w:type="dxa"/>
-            <w:tcBorders/>
           </w:tcPr>
           <w:p>
             <w:pPr>
-              <w:pStyle w:val="Normal"/>
-              <w:widowControl/>
-              <w:spacing w:before="0" w:after="0"/>
-              <w:jc w:val="start"/>
               <w:rPr>
                 <w:i/>
                 <w:iCs/>
@@ -2061,12 +1813,9 @@
             </w:pPr>
             <w:r>
               <w:rPr>
-                <w:rFonts w:eastAsia="Times New Roman" w:cs="Times New Roman"/>
-                <w:i/>
-                <w:iCs/>
-                <w:color w:val="EE0000"/>
-                <w:kern w:val="0"/>
-                <w:lang w:val="en-US" w:eastAsia="en-US" w:bidi="ar-SA"/>
+                <w:i/>
+                <w:iCs/>
+                <w:color w:val="EE0000"/>
               </w:rPr>
               <w:t>1.0000</w:t>
             </w:r>
@@ -2075,19 +1824,14 @@
       </w:tr>
       <w:tr>
         <w:trPr>
-          <w:trHeight w:val="1002" w:hRule="atLeast"/>
+          <w:trHeight w:val="1002"/>
         </w:trPr>
         <w:tc>
           <w:tcPr>
             <w:tcW w:w="1814" w:type="dxa"/>
-            <w:tcBorders/>
           </w:tcPr>
           <w:p>
             <w:pPr>
-              <w:pStyle w:val="Normal"/>
-              <w:widowControl/>
-              <w:spacing w:before="0" w:after="0"/>
-              <w:jc w:val="start"/>
               <w:rPr>
                 <w:i/>
                 <w:iCs/>
@@ -2096,12 +1840,9 @@
             </w:pPr>
             <w:r>
               <w:rPr>
-                <w:rFonts w:eastAsia="Times New Roman" w:cs="Times New Roman"/>
-                <w:i/>
-                <w:iCs/>
-                <w:color w:val="EE0000"/>
-                <w:kern w:val="0"/>
-                <w:lang w:val="en-US" w:eastAsia="en-US" w:bidi="ar-SA"/>
+                <w:i/>
+                <w:iCs/>
+                <w:color w:val="EE0000"/>
               </w:rPr>
               <w:t>10,000</w:t>
             </w:r>
@@ -2110,14 +1851,9 @@
         <w:tc>
           <w:tcPr>
             <w:tcW w:w="1814" w:type="dxa"/>
-            <w:tcBorders/>
           </w:tcPr>
           <w:p>
             <w:pPr>
-              <w:pStyle w:val="Normal"/>
-              <w:widowControl/>
-              <w:spacing w:before="0" w:after="0"/>
-              <w:jc w:val="start"/>
               <w:rPr>
                 <w:i/>
                 <w:iCs/>
@@ -2126,12 +1862,9 @@
             </w:pPr>
             <w:r>
               <w:rPr>
-                <w:rFonts w:eastAsia="Times New Roman" w:cs="Times New Roman"/>
-                <w:i/>
-                <w:iCs/>
-                <w:color w:val="EE0000"/>
-                <w:kern w:val="0"/>
-                <w:lang w:val="en-US" w:eastAsia="en-US" w:bidi="ar-SA"/>
+                <w:i/>
+                <w:iCs/>
+                <w:color w:val="EE0000"/>
               </w:rPr>
               <w:t>1.0000</w:t>
             </w:r>
@@ -2140,14 +1873,9 @@
         <w:tc>
           <w:tcPr>
             <w:tcW w:w="1815" w:type="dxa"/>
-            <w:tcBorders/>
           </w:tcPr>
           <w:p>
             <w:pPr>
-              <w:pStyle w:val="Normal"/>
-              <w:widowControl/>
-              <w:spacing w:before="0" w:after="0"/>
-              <w:jc w:val="start"/>
               <w:rPr>
                 <w:i/>
                 <w:iCs/>
@@ -2156,12 +1884,9 @@
             </w:pPr>
             <w:r>
               <w:rPr>
-                <w:rFonts w:eastAsia="Times New Roman" w:cs="Times New Roman"/>
-                <w:i/>
-                <w:iCs/>
-                <w:color w:val="EE0000"/>
-                <w:kern w:val="0"/>
-                <w:lang w:val="en-US" w:eastAsia="en-US" w:bidi="ar-SA"/>
+                <w:i/>
+                <w:iCs/>
+                <w:color w:val="EE0000"/>
               </w:rPr>
               <w:t>1.0000</w:t>
             </w:r>
@@ -2171,41 +1896,24 @@
     </w:tbl>
     <w:p>
       <w:pPr>
-        <w:pStyle w:val="Normal"/>
-        <w:rPr>
-          <w:i/>
-          <w:iCs/>
-          <w:color w:val="EE0000"/>
-        </w:rPr>
-      </w:pPr>
-      <w:r>
-        <w:rPr>
-          <w:i/>
-          <w:iCs/>
-          <w:color w:val="EE0000"/>
-        </w:rPr>
-      </w:r>
-    </w:p>
-    <w:p>
-      <w:pPr>
-        <w:pStyle w:val="Normal"/>
-        <w:rPr>
-          <w:i/>
-          <w:iCs/>
-          <w:color w:val="EE0000"/>
-        </w:rPr>
-      </w:pPr>
-      <w:r>
-        <w:rPr>
-          <w:i/>
-          <w:iCs/>
-          <w:color w:val="EE0000"/>
-        </w:rPr>
-      </w:r>
-    </w:p>
-    <w:p>
-      <w:pPr>
-        <w:pStyle w:val="Normal"/>
+        <w:rPr>
+          <w:i/>
+          <w:iCs/>
+          <w:color w:val="EE0000"/>
+        </w:rPr>
+      </w:pPr>
+    </w:p>
+    <w:p>
+      <w:pPr>
+        <w:rPr>
+          <w:i/>
+          <w:iCs/>
+          <w:color w:val="EE0000"/>
+        </w:rPr>
+      </w:pPr>
+    </w:p>
+    <w:p>
+      <w:pPr>
         <w:rPr>
           <w:i/>
           <w:iCs/>
@@ -2225,16 +1933,8 @@
       <w:tblPr>
         <w:tblStyle w:val="TableGrid"/>
         <w:tblW w:w="10375" w:type="dxa"/>
-        <w:jc w:val="start"/>
-        <w:tblInd w:w="0" w:type="dxa"/>
         <w:tblLayout w:type="fixed"/>
-        <w:tblCellMar>
-          <w:top w:w="0" w:type="dxa"/>
-          <w:start w:w="108" w:type="dxa"/>
-          <w:bottom w:w="0" w:type="dxa"/>
-          <w:end w:w="108" w:type="dxa"/>
-        </w:tblCellMar>
-        <w:tblLook w:noHBand="0" w:noVBand="1" w:firstColumn="1" w:lastRow="0" w:lastColumn="0" w:firstRow="1" w:val="04a0"/>
+        <w:tblLook w:val="04A0" w:firstRow="1" w:lastRow="0" w:firstColumn="1" w:lastColumn="0" w:noHBand="0" w:noVBand="1"/>
       </w:tblPr>
       <w:tblGrid>
         <w:gridCol w:w="3385"/>
@@ -2243,19 +1943,14 @@
       </w:tblGrid>
       <w:tr>
         <w:trPr>
-          <w:trHeight w:val="64" w:hRule="atLeast"/>
+          <w:trHeight w:val="64"/>
         </w:trPr>
         <w:tc>
           <w:tcPr>
             <w:tcW w:w="3385" w:type="dxa"/>
-            <w:tcBorders/>
           </w:tcPr>
           <w:p>
             <w:pPr>
-              <w:pStyle w:val="Normal"/>
-              <w:widowControl/>
-              <w:spacing w:before="0" w:after="0"/>
-              <w:jc w:val="start"/>
               <w:rPr>
                 <w:i/>
                 <w:iCs/>
@@ -2264,12 +1959,9 @@
             </w:pPr>
             <w:r>
               <w:rPr>
-                <w:rFonts w:eastAsia="Times New Roman" w:cs="Times New Roman"/>
-                <w:i/>
-                <w:iCs/>
-                <w:color w:val="EE0000"/>
-                <w:kern w:val="0"/>
-                <w:lang w:val="en-US" w:eastAsia="en-US" w:bidi="ar-SA"/>
+                <w:i/>
+                <w:iCs/>
+                <w:color w:val="EE0000"/>
               </w:rPr>
               <w:t>Number of genes</w:t>
             </w:r>
@@ -2278,14 +1970,9 @@
         <w:tc>
           <w:tcPr>
             <w:tcW w:w="3359" w:type="dxa"/>
-            <w:tcBorders/>
           </w:tcPr>
           <w:p>
             <w:pPr>
-              <w:pStyle w:val="Normal"/>
-              <w:widowControl/>
-              <w:spacing w:before="0" w:after="0"/>
-              <w:jc w:val="start"/>
               <w:rPr>
                 <w:i/>
                 <w:iCs/>
@@ -2294,12 +1981,9 @@
             </w:pPr>
             <w:r>
               <w:rPr>
-                <w:rFonts w:eastAsia="Times New Roman" w:cs="Times New Roman"/>
-                <w:i/>
-                <w:iCs/>
-                <w:color w:val="EE0000"/>
-                <w:kern w:val="0"/>
-                <w:lang w:val="en-US" w:eastAsia="en-US" w:bidi="ar-SA"/>
+                <w:i/>
+                <w:iCs/>
+                <w:color w:val="EE0000"/>
               </w:rPr>
               <w:t>Accuracy</w:t>
             </w:r>
@@ -2308,14 +1992,9 @@
         <w:tc>
           <w:tcPr>
             <w:tcW w:w="3631" w:type="dxa"/>
-            <w:tcBorders/>
           </w:tcPr>
           <w:p>
             <w:pPr>
-              <w:pStyle w:val="Normal"/>
-              <w:widowControl/>
-              <w:spacing w:before="0" w:after="0"/>
-              <w:jc w:val="start"/>
               <w:rPr>
                 <w:i/>
                 <w:iCs/>
@@ -2324,12 +2003,9 @@
             </w:pPr>
             <w:r>
               <w:rPr>
-                <w:rFonts w:eastAsia="Times New Roman" w:cs="Times New Roman"/>
-                <w:i/>
-                <w:iCs/>
-                <w:color w:val="EE0000"/>
-                <w:kern w:val="0"/>
-                <w:lang w:val="en-US" w:eastAsia="en-US" w:bidi="ar-SA"/>
+                <w:i/>
+                <w:iCs/>
+                <w:color w:val="EE0000"/>
               </w:rPr>
               <w:t>AUC-ROC</w:t>
             </w:r>
@@ -2338,19 +2014,14 @@
       </w:tr>
       <w:tr>
         <w:trPr>
-          <w:trHeight w:val="64" w:hRule="atLeast"/>
+          <w:trHeight w:val="64"/>
         </w:trPr>
         <w:tc>
           <w:tcPr>
             <w:tcW w:w="3385" w:type="dxa"/>
-            <w:tcBorders/>
           </w:tcPr>
           <w:p>
             <w:pPr>
-              <w:pStyle w:val="Normal"/>
-              <w:widowControl/>
-              <w:spacing w:before="0" w:after="0"/>
-              <w:jc w:val="start"/>
               <w:rPr>
                 <w:i/>
                 <w:iCs/>
@@ -2359,12 +2030,9 @@
             </w:pPr>
             <w:r>
               <w:rPr>
-                <w:rFonts w:eastAsia="Times New Roman" w:cs="Times New Roman"/>
-                <w:i/>
-                <w:iCs/>
-                <w:color w:val="EE0000"/>
-                <w:kern w:val="0"/>
-                <w:lang w:val="en-US" w:eastAsia="en-US" w:bidi="ar-SA"/>
+                <w:i/>
+                <w:iCs/>
+                <w:color w:val="EE0000"/>
               </w:rPr>
               <w:t>10</w:t>
             </w:r>
@@ -2373,14 +2041,9 @@
         <w:tc>
           <w:tcPr>
             <w:tcW w:w="3359" w:type="dxa"/>
-            <w:tcBorders/>
           </w:tcPr>
           <w:p>
             <w:pPr>
-              <w:pStyle w:val="Normal"/>
-              <w:widowControl/>
-              <w:spacing w:before="0" w:after="0"/>
-              <w:jc w:val="start"/>
               <w:rPr>
                 <w:i/>
                 <w:iCs/>
@@ -2389,12 +2052,9 @@
             </w:pPr>
             <w:r>
               <w:rPr>
-                <w:rFonts w:eastAsia="Times New Roman" w:cs="Times New Roman"/>
-                <w:i/>
-                <w:iCs/>
-                <w:color w:val="EE0000"/>
-                <w:kern w:val="0"/>
-                <w:lang w:val="en-US" w:eastAsia="en-US" w:bidi="ar-SA"/>
+                <w:i/>
+                <w:iCs/>
+                <w:color w:val="EE0000"/>
               </w:rPr>
               <w:t>0.9329268292682927</w:t>
             </w:r>
@@ -2403,14 +2063,9 @@
         <w:tc>
           <w:tcPr>
             <w:tcW w:w="3631" w:type="dxa"/>
-            <w:tcBorders/>
           </w:tcPr>
           <w:p>
             <w:pPr>
-              <w:pStyle w:val="Normal"/>
-              <w:widowControl/>
-              <w:spacing w:before="0" w:after="0"/>
-              <w:jc w:val="start"/>
               <w:rPr>
                 <w:i/>
                 <w:iCs/>
@@ -2419,12 +2074,9 @@
             </w:pPr>
             <w:r>
               <w:rPr>
-                <w:rFonts w:eastAsia="Times New Roman" w:cs="Times New Roman"/>
-                <w:i/>
-                <w:iCs/>
-                <w:color w:val="EE0000"/>
-                <w:kern w:val="0"/>
-                <w:lang w:val="en-US" w:eastAsia="en-US" w:bidi="ar-SA"/>
+                <w:i/>
+                <w:iCs/>
+                <w:color w:val="EE0000"/>
               </w:rPr>
               <w:t>0.9668903803131991</w:t>
             </w:r>
@@ -2433,19 +2085,14 @@
       </w:tr>
       <w:tr>
         <w:trPr>
-          <w:trHeight w:val="64" w:hRule="atLeast"/>
+          <w:trHeight w:val="64"/>
         </w:trPr>
         <w:tc>
           <w:tcPr>
             <w:tcW w:w="3385" w:type="dxa"/>
-            <w:tcBorders/>
           </w:tcPr>
           <w:p>
             <w:pPr>
-              <w:pStyle w:val="Normal"/>
-              <w:widowControl/>
-              <w:spacing w:before="0" w:after="0"/>
-              <w:jc w:val="start"/>
               <w:rPr>
                 <w:i/>
                 <w:iCs/>
@@ -2454,12 +2101,9 @@
             </w:pPr>
             <w:r>
               <w:rPr>
-                <w:rFonts w:eastAsia="Times New Roman" w:cs="Times New Roman"/>
-                <w:i/>
-                <w:iCs/>
-                <w:color w:val="EE0000"/>
-                <w:kern w:val="0"/>
-                <w:lang w:val="en-US" w:eastAsia="en-US" w:bidi="ar-SA"/>
+                <w:i/>
+                <w:iCs/>
+                <w:color w:val="EE0000"/>
               </w:rPr>
               <w:t>100</w:t>
             </w:r>
@@ -2468,14 +2112,9 @@
         <w:tc>
           <w:tcPr>
             <w:tcW w:w="3359" w:type="dxa"/>
-            <w:tcBorders/>
           </w:tcPr>
           <w:p>
             <w:pPr>
-              <w:pStyle w:val="Normal"/>
-              <w:widowControl/>
-              <w:spacing w:before="0" w:after="0"/>
-              <w:jc w:val="start"/>
               <w:rPr>
                 <w:i/>
                 <w:iCs/>
@@ -2484,12 +2123,9 @@
             </w:pPr>
             <w:r>
               <w:rPr>
-                <w:rFonts w:eastAsia="Times New Roman" w:cs="Times New Roman"/>
-                <w:i/>
-                <w:iCs/>
-                <w:color w:val="EE0000"/>
-                <w:kern w:val="0"/>
-                <w:lang w:val="en-US" w:eastAsia="en-US" w:bidi="ar-SA"/>
+                <w:i/>
+                <w:iCs/>
+                <w:color w:val="EE0000"/>
               </w:rPr>
               <w:t>0.9451219512195121</w:t>
             </w:r>
@@ -2498,14 +2134,9 @@
         <w:tc>
           <w:tcPr>
             <w:tcW w:w="3631" w:type="dxa"/>
-            <w:tcBorders/>
           </w:tcPr>
           <w:p>
             <w:pPr>
-              <w:pStyle w:val="Normal"/>
-              <w:widowControl/>
-              <w:spacing w:before="0" w:after="0"/>
-              <w:jc w:val="start"/>
               <w:rPr>
                 <w:i/>
                 <w:iCs/>
@@ -2514,44 +2145,25 @@
             </w:pPr>
             <w:r>
               <w:rPr>
-                <w:rFonts w:eastAsia="Times New Roman" w:cs="Times New Roman"/>
-                <w:i/>
-                <w:iCs/>
-                <w:color w:val="EE0000"/>
-                <w:kern w:val="0"/>
-                <w:lang w:val="en-US" w:eastAsia="en-US" w:bidi="ar-SA"/>
-              </w:rPr>
-              <w:t xml:space="preserve"> </w:t>
-            </w:r>
-            <w:r>
-              <w:rPr>
-                <w:rFonts w:eastAsia="Times New Roman" w:cs="Times New Roman"/>
-                <w:i/>
-                <w:iCs/>
-                <w:color w:val="EE0000"/>
-                <w:kern w:val="0"/>
-                <w:lang w:val="en-US" w:eastAsia="en-US" w:bidi="ar-SA"/>
-              </w:rPr>
-              <w:t>0.9939597315436242</w:t>
+                <w:i/>
+                <w:iCs/>
+                <w:color w:val="EE0000"/>
+              </w:rPr>
+              <w:t xml:space="preserve"> 0.9939597315436242</w:t>
             </w:r>
           </w:p>
         </w:tc>
       </w:tr>
       <w:tr>
         <w:trPr>
-          <w:trHeight w:val="64" w:hRule="atLeast"/>
+          <w:trHeight w:val="64"/>
         </w:trPr>
         <w:tc>
           <w:tcPr>
             <w:tcW w:w="3385" w:type="dxa"/>
-            <w:tcBorders/>
           </w:tcPr>
           <w:p>
             <w:pPr>
-              <w:pStyle w:val="Normal"/>
-              <w:widowControl/>
-              <w:spacing w:before="0" w:after="0"/>
-              <w:jc w:val="start"/>
               <w:rPr>
                 <w:i/>
                 <w:iCs/>
@@ -2560,12 +2172,9 @@
             </w:pPr>
             <w:r>
               <w:rPr>
-                <w:rFonts w:eastAsia="Times New Roman" w:cs="Times New Roman"/>
-                <w:i/>
-                <w:iCs/>
-                <w:color w:val="EE0000"/>
-                <w:kern w:val="0"/>
-                <w:lang w:val="en-US" w:eastAsia="en-US" w:bidi="ar-SA"/>
+                <w:i/>
+                <w:iCs/>
+                <w:color w:val="EE0000"/>
               </w:rPr>
               <w:t>1,000</w:t>
             </w:r>
@@ -2574,14 +2183,9 @@
         <w:tc>
           <w:tcPr>
             <w:tcW w:w="3359" w:type="dxa"/>
-            <w:tcBorders/>
           </w:tcPr>
           <w:p>
             <w:pPr>
-              <w:pStyle w:val="Normal"/>
-              <w:widowControl/>
-              <w:spacing w:before="0" w:after="0"/>
-              <w:jc w:val="start"/>
               <w:rPr>
                 <w:i/>
                 <w:iCs/>
@@ -2590,12 +2194,9 @@
             </w:pPr>
             <w:r>
               <w:rPr>
-                <w:rFonts w:eastAsia="Times New Roman" w:cs="Times New Roman"/>
-                <w:i/>
-                <w:iCs/>
-                <w:color w:val="EE0000"/>
-                <w:kern w:val="0"/>
-                <w:lang w:val="en-US" w:eastAsia="en-US" w:bidi="ar-SA"/>
+                <w:i/>
+                <w:iCs/>
+                <w:color w:val="EE0000"/>
               </w:rPr>
               <w:t>0.9390243902439024</w:t>
             </w:r>
@@ -2604,14 +2205,9 @@
         <w:tc>
           <w:tcPr>
             <w:tcW w:w="3631" w:type="dxa"/>
-            <w:tcBorders/>
           </w:tcPr>
           <w:p>
             <w:pPr>
-              <w:pStyle w:val="Normal"/>
-              <w:widowControl/>
-              <w:spacing w:before="0" w:after="0"/>
-              <w:jc w:val="start"/>
               <w:rPr>
                 <w:i/>
                 <w:iCs/>
@@ -2620,12 +2216,9 @@
             </w:pPr>
             <w:r>
               <w:rPr>
-                <w:rFonts w:eastAsia="Times New Roman" w:cs="Times New Roman"/>
-                <w:i/>
-                <w:iCs/>
-                <w:color w:val="EE0000"/>
-                <w:kern w:val="0"/>
-                <w:lang w:val="en-US" w:eastAsia="en-US" w:bidi="ar-SA"/>
+                <w:i/>
+                <w:iCs/>
+                <w:color w:val="EE0000"/>
               </w:rPr>
               <w:t>0.9939597315436242</w:t>
             </w:r>
@@ -2634,19 +2227,14 @@
       </w:tr>
       <w:tr>
         <w:trPr>
-          <w:trHeight w:val="64" w:hRule="atLeast"/>
+          <w:trHeight w:val="64"/>
         </w:trPr>
         <w:tc>
           <w:tcPr>
             <w:tcW w:w="3385" w:type="dxa"/>
-            <w:tcBorders/>
           </w:tcPr>
           <w:p>
             <w:pPr>
-              <w:pStyle w:val="Normal"/>
-              <w:widowControl/>
-              <w:spacing w:before="0" w:after="0"/>
-              <w:jc w:val="start"/>
               <w:rPr>
                 <w:i/>
                 <w:iCs/>
@@ -2655,12 +2243,9 @@
             </w:pPr>
             <w:r>
               <w:rPr>
-                <w:rFonts w:eastAsia="Times New Roman" w:cs="Times New Roman"/>
-                <w:i/>
-                <w:iCs/>
-                <w:color w:val="EE0000"/>
-                <w:kern w:val="0"/>
-                <w:lang w:val="en-US" w:eastAsia="en-US" w:bidi="ar-SA"/>
+                <w:i/>
+                <w:iCs/>
+                <w:color w:val="EE0000"/>
               </w:rPr>
               <w:t>10,000</w:t>
             </w:r>
@@ -2669,14 +2254,9 @@
         <w:tc>
           <w:tcPr>
             <w:tcW w:w="3359" w:type="dxa"/>
-            <w:tcBorders/>
           </w:tcPr>
           <w:p>
             <w:pPr>
-              <w:pStyle w:val="Normal"/>
-              <w:widowControl/>
-              <w:spacing w:before="0" w:after="0"/>
-              <w:jc w:val="start"/>
               <w:rPr>
                 <w:i/>
                 <w:iCs/>
@@ -2685,12 +2265,9 @@
             </w:pPr>
             <w:r>
               <w:rPr>
-                <w:rFonts w:eastAsia="Times New Roman" w:cs="Times New Roman"/>
-                <w:i/>
-                <w:iCs/>
-                <w:color w:val="EE0000"/>
-                <w:kern w:val="0"/>
-                <w:lang w:val="en-US" w:eastAsia="en-US" w:bidi="ar-SA"/>
+                <w:i/>
+                <w:iCs/>
+                <w:color w:val="EE0000"/>
               </w:rPr>
               <w:t>0.9207317073170732</w:t>
             </w:r>
@@ -2699,14 +2276,9 @@
         <w:tc>
           <w:tcPr>
             <w:tcW w:w="3631" w:type="dxa"/>
-            <w:tcBorders/>
           </w:tcPr>
           <w:p>
             <w:pPr>
-              <w:pStyle w:val="Normal"/>
-              <w:widowControl/>
-              <w:spacing w:before="0" w:after="0"/>
-              <w:jc w:val="start"/>
               <w:rPr>
                 <w:i/>
                 <w:iCs/>
@@ -2715,12 +2287,9 @@
             </w:pPr>
             <w:r>
               <w:rPr>
-                <w:rFonts w:eastAsia="Times New Roman" w:cs="Times New Roman"/>
-                <w:i/>
-                <w:iCs/>
-                <w:color w:val="EE0000"/>
-                <w:kern w:val="0"/>
-                <w:lang w:val="en-US" w:eastAsia="en-US" w:bidi="ar-SA"/>
+                <w:i/>
+                <w:iCs/>
+                <w:color w:val="EE0000"/>
               </w:rPr>
               <w:t>0.9682326621923938</w:t>
             </w:r>
@@ -2730,20 +2299,12 @@
     </w:tbl>
     <w:p>
       <w:pPr>
-        <w:pStyle w:val="Normal"/>
-        <w:rPr>
-          <w:i/>
-          <w:iCs/>
-          <w:color w:val="EE0000"/>
-        </w:rPr>
-      </w:pPr>
-      <w:r>
-        <w:rPr>
-          <w:i/>
-          <w:iCs/>
-          <w:color w:val="EE0000"/>
-        </w:rPr>
-      </w:r>
+        <w:rPr>
+          <w:i/>
+          <w:iCs/>
+          <w:color w:val="EE0000"/>
+        </w:rPr>
+      </w:pPr>
     </w:p>
     <w:p>
       <w:pPr>
@@ -2769,7 +2330,6 @@
     </w:p>
     <w:p>
       <w:pPr>
-        <w:pStyle w:val="Normal"/>
         <w:rPr>
           <w:i/>
           <w:iCs/>
@@ -2787,24 +2347,15 @@
     </w:p>
     <w:p>
       <w:pPr>
-        <w:pStyle w:val="Normal"/>
-        <w:rPr>
-          <w:i/>
-          <w:iCs/>
-          <w:color w:val="EE0000"/>
-        </w:rPr>
-      </w:pPr>
-      <w:r>
-        <w:rPr>
-          <w:i/>
-          <w:iCs/>
-          <w:color w:val="EE0000"/>
-        </w:rPr>
-      </w:r>
-    </w:p>
-    <w:p>
-      <w:pPr>
-        <w:pStyle w:val="Normal"/>
+        <w:rPr>
+          <w:i/>
+          <w:iCs/>
+          <w:color w:val="EE0000"/>
+        </w:rPr>
+      </w:pPr>
+    </w:p>
+    <w:p>
+      <w:pPr>
         <w:rPr>
           <w:i/>
           <w:iCs/>
@@ -2839,6 +2390,7 @@
           <w:iCs/>
           <w:color w:val="064462"/>
         </w:rPr>
+        <w:lastRenderedPageBreak/>
         <w:t>Heatmaps and Dendrograms</w:t>
       </w:r>
     </w:p>
@@ -2932,7 +2484,6 @@
     </w:p>
     <w:p>
       <w:pPr>
-        <w:pStyle w:val="Normal"/>
         <w:spacing w:beforeAutospacing="1" w:afterAutospacing="1"/>
         <w:rPr>
           <w:rFonts w:ascii="Times New Roman" w:hAnsi="Times New Roman"/>
@@ -2940,12 +2491,16 @@
         </w:rPr>
       </w:pPr>
       <w:r>
-        <w:rPr/>
+        <w:rPr>
+          <w:rFonts w:ascii="Times New Roman" w:hAnsi="Times New Roman"/>
+          <w:noProof/>
+          <w:sz w:val="24"/>
+        </w:rPr>
         <w:drawing>
-          <wp:inline distT="0" distB="0" distL="0" distR="0">
-            <wp:extent cx="6858000" cy="5373370"/>
+          <wp:inline distT="0" distB="0" distL="0" distR="0" wp14:anchorId="18FBE7B1" wp14:editId="120FA9F6">
+            <wp:extent cx="6858000" cy="5385435"/>
             <wp:effectExtent l="0" t="0" r="0" b="0"/>
-            <wp:docPr id="3" name="Picture 3"/>
+            <wp:docPr id="1988224284" name="Picture 3" descr="A screenshot of a data analysis&#10;&#10;Description automatically generated"/>
             <wp:cNvGraphicFramePr>
               <a:graphicFrameLocks xmlns:a="http://schemas.openxmlformats.org/drawingml/2006/main" noChangeAspect="1"/>
             </wp:cNvGraphicFramePr>
@@ -2953,26 +2508,29 @@
               <a:graphicData uri="http://schemas.openxmlformats.org/drawingml/2006/picture">
                 <pic:pic xmlns:pic="http://schemas.openxmlformats.org/drawingml/2006/picture">
                   <pic:nvPicPr>
-                    <pic:cNvPr id="3" name="Picture 3"/>
-                    <pic:cNvPicPr>
-                      <a:picLocks noChangeAspect="1" noChangeArrowheads="1"/>
-                    </pic:cNvPicPr>
+                    <pic:cNvPr id="1988224284" name="Picture 3" descr="A screenshot of a data analysis&#10;&#10;Description automatically generated"/>
+                    <pic:cNvPicPr/>
                   </pic:nvPicPr>
                   <pic:blipFill>
-                    <a:blip r:embed="rId7"/>
+                    <a:blip r:embed="rId13">
+                      <a:extLst>
+                        <a:ext uri="{28A0092B-C50C-407E-A947-70E740481C1C}">
+                          <a14:useLocalDpi xmlns:a14="http://schemas.microsoft.com/office/drawing/2010/main" val="0"/>
+                        </a:ext>
+                      </a:extLst>
+                    </a:blip>
                     <a:stretch>
                       <a:fillRect/>
                     </a:stretch>
                   </pic:blipFill>
-                  <pic:spPr bwMode="auto">
+                  <pic:spPr>
                     <a:xfrm>
                       <a:off x="0" y="0"/>
-                      <a:ext cx="6858000" cy="5373370"/>
+                      <a:ext cx="6858000" cy="5385435"/>
                     </a:xfrm>
                     <a:prstGeom prst="rect">
                       <a:avLst/>
                     </a:prstGeom>
-                    <a:noFill/>
                   </pic:spPr>
                 </pic:pic>
               </a:graphicData>
@@ -2983,24 +2541,15 @@
     </w:p>
     <w:p>
       <w:pPr>
-        <w:pStyle w:val="Normal"/>
-        <w:rPr>
-          <w:i/>
-          <w:iCs/>
-          <w:color w:val="064462"/>
-        </w:rPr>
-      </w:pPr>
-      <w:r>
-        <w:rPr>
-          <w:i/>
-          <w:iCs/>
-          <w:color w:val="064462"/>
-        </w:rPr>
-      </w:r>
-    </w:p>
-    <w:p>
-      <w:pPr>
-        <w:pStyle w:val="Normal"/>
+        <w:rPr>
+          <w:i/>
+          <w:iCs/>
+          <w:color w:val="064462"/>
+        </w:rPr>
+      </w:pPr>
+    </w:p>
+    <w:p>
+      <w:pPr>
         <w:rPr>
           <w:i/>
           <w:iCs/>
@@ -3018,20 +2567,12 @@
     </w:p>
     <w:p>
       <w:pPr>
-        <w:pStyle w:val="Normal"/>
-        <w:rPr>
-          <w:i/>
-          <w:iCs/>
-          <w:color w:val="EE0000"/>
-        </w:rPr>
-      </w:pPr>
-      <w:r>
-        <w:rPr>
-          <w:i/>
-          <w:iCs/>
-          <w:color w:val="EE0000"/>
-        </w:rPr>
-      </w:r>
+        <w:rPr>
+          <w:i/>
+          <w:iCs/>
+          <w:color w:val="EE0000"/>
+        </w:rPr>
+      </w:pPr>
     </w:p>
     <w:p>
       <w:pPr>
@@ -3086,46 +2627,52 @@
           <w:color w:val="064462"/>
         </w:rPr>
       </w:pPr>
-      <w:r>
-        <w:rPr>
-          <w:i/>
-          <w:iCs/>
-          <w:color w:val="064462"/>
-        </w:rPr>
-      </w:r>
     </w:p>
     <w:sectPr>
-      <w:footerReference w:type="even" r:id="rId8"/>
-      <w:footerReference w:type="default" r:id="rId9"/>
-      <w:footerReference w:type="first" r:id="rId10"/>
-      <w:type w:val="nextPage"/>
+      <w:footerReference w:type="even" r:id="rId14"/>
+      <w:footerReference w:type="default" r:id="rId15"/>
+      <w:footerReference w:type="first" r:id="rId16"/>
       <w:pgSz w:w="12240" w:h="15840"/>
-      <w:pgMar w:left="720" w:right="720" w:gutter="0" w:header="0" w:top="720" w:footer="720" w:bottom="777"/>
-      <w:pgNumType w:fmt="decimal"/>
-      <w:formProt w:val="false"/>
-      <w:textDirection w:val="lrTb"/>
-      <w:docGrid w:type="default" w:linePitch="360" w:charSpace="0"/>
+      <w:pgMar w:top="720" w:right="720" w:bottom="777" w:left="720" w:header="0" w:footer="720" w:gutter="0"/>
+      <w:cols w:space="720"/>
+      <w:formProt w:val="0"/>
+      <w:docGrid w:linePitch="360"/>
     </w:sectPr>
   </w:body>
 </w:document>
 </file>
 
+<file path=word/endnotes.xml><?xml version="1.0" encoding="utf-8"?>
+<w:endnotes xmlns:wpc="http://schemas.microsoft.com/office/word/2010/wordprocessingCanvas" xmlns:cx="http://schemas.microsoft.com/office/drawing/2014/chartex" xmlns:cx1="http://schemas.microsoft.com/office/drawing/2015/9/8/chartex" xmlns:cx2="http://schemas.microsoft.com/office/drawing/2015/10/21/chartex" xmlns:cx3="http://schemas.microsoft.com/office/drawing/2016/5/9/chartex" xmlns:cx4="http://schemas.microsoft.com/office/drawing/2016/5/10/chartex" xmlns:cx5="http://schemas.microsoft.com/office/drawing/2016/5/11/chartex" xmlns:cx6="http://schemas.microsoft.com/office/drawing/2016/5/12/chartex" xmlns:cx7="http://schemas.microsoft.com/office/drawing/2016/5/13/chartex" xmlns:cx8="http://schemas.microsoft.com/office/drawing/2016/5/14/chartex" xmlns:mc="http://schemas.openxmlformats.org/markup-compatibility/2006" xmlns:aink="http://schemas.microsoft.com/office/drawing/2016/ink" xmlns:am3d="http://schemas.microsoft.com/office/drawing/2017/model3d" xmlns:o="urn:schemas-microsoft-com:office:office" xmlns:oel="http://schemas.microsoft.com/office/2019/extlst" xmlns:r="http://schemas.openxmlformats.org/officeDocument/2006/relationships" xmlns:m="http://schemas.openxmlformats.org/officeDocument/2006/math" xmlns:v="urn:schemas-microsoft-com:vml" xmlns:wp14="http://schemas.microsoft.com/office/word/2010/wordprocessingDrawing" xmlns:wp="http://schemas.openxmlformats.org/drawingml/2006/wordprocessingDrawing" xmlns:w10="urn:schemas-microsoft-com:office:word" xmlns:w="http://schemas.openxmlformats.org/wordprocessingml/2006/main" xmlns:w14="http://schemas.microsoft.com/office/word/2010/wordml" xmlns:w15="http://schemas.microsoft.com/office/word/2012/wordml" xmlns:w16cex="http://schemas.microsoft.com/office/word/2018/wordml/cex" xmlns:w16cid="http://schemas.microsoft.com/office/word/2016/wordml/cid" xmlns:w16="http://schemas.microsoft.com/office/word/2018/wordml" xmlns:w16du="http://schemas.microsoft.com/office/word/2023/wordml/word16du" xmlns:w16sdtdh="http://schemas.microsoft.com/office/word/2020/wordml/sdtdatahash" xmlns:w16se="http://schemas.microsoft.com/office/word/2015/wordml/symex" xmlns:wpg="http://schemas.microsoft.com/office/word/2010/wordprocessingGroup" xmlns:wpi="http://schemas.microsoft.com/office/word/2010/wordprocessingInk" xmlns:wne="http://schemas.microsoft.com/office/word/2006/wordml" xmlns:wps="http://schemas.microsoft.com/office/word/2010/wordprocessingShape" mc:Ignorable="w14 w15 w16se w16cid w16 w16cex w16sdtdh w16du wp14">
+  <w:endnote w:type="separator" w:id="-1">
+    <w:p>
+      <w:r>
+        <w:separator/>
+      </w:r>
+    </w:p>
+  </w:endnote>
+  <w:endnote w:type="continuationSeparator" w:id="0">
+    <w:p>
+      <w:r>
+        <w:continuationSeparator/>
+      </w:r>
+    </w:p>
+  </w:endnote>
+</w:endnotes>
+</file>
+
 <file path=word/footer1.xml><?xml version="1.0" encoding="utf-8"?>
-<w:ftr xmlns:o="urn:schemas-microsoft-com:office:office" xmlns:r="http://schemas.openxmlformats.org/officeDocument/2006/relationships" xmlns:v="urn:schemas-microsoft-com:vml" xmlns:w="http://schemas.openxmlformats.org/wordprocessingml/2006/main" xmlns:w10="urn:schemas-microsoft-com:office:word" xmlns:wp="http://schemas.openxmlformats.org/drawingml/2006/wordprocessingDrawing" xmlns:pic="http://schemas.openxmlformats.org/drawingml/2006/picture" xmlns:wps="http://schemas.microsoft.com/office/word/2010/wordprocessingShape" xmlns:wpg="http://schemas.microsoft.com/office/word/2010/wordprocessingGroup" xmlns:mc="http://schemas.openxmlformats.org/markup-compatibility/2006" xmlns:wp14="http://schemas.microsoft.com/office/word/2010/wordprocessingDrawing" xmlns:w14="http://schemas.microsoft.com/office/word/2010/wordml" xmlns:w15="http://schemas.microsoft.com/office/word/2012/wordml" mc:Ignorable="w14 wp14 w15">
+<w:ftr xmlns:wpc="http://schemas.microsoft.com/office/word/2010/wordprocessingCanvas" xmlns:cx="http://schemas.microsoft.com/office/drawing/2014/chartex" xmlns:cx1="http://schemas.microsoft.com/office/drawing/2015/9/8/chartex" xmlns:cx2="http://schemas.microsoft.com/office/drawing/2015/10/21/chartex" xmlns:cx3="http://schemas.microsoft.com/office/drawing/2016/5/9/chartex" xmlns:cx4="http://schemas.microsoft.com/office/drawing/2016/5/10/chartex" xmlns:cx5="http://schemas.microsoft.com/office/drawing/2016/5/11/chartex" xmlns:cx6="http://schemas.microsoft.com/office/drawing/2016/5/12/chartex" xmlns:cx7="http://schemas.microsoft.com/office/drawing/2016/5/13/chartex" xmlns:cx8="http://schemas.microsoft.com/office/drawing/2016/5/14/chartex" xmlns:mc="http://schemas.openxmlformats.org/markup-compatibility/2006" xmlns:aink="http://schemas.microsoft.com/office/drawing/2016/ink" xmlns:am3d="http://schemas.microsoft.com/office/drawing/2017/model3d" xmlns:o="urn:schemas-microsoft-com:office:office" xmlns:oel="http://schemas.microsoft.com/office/2019/extlst" xmlns:r="http://schemas.openxmlformats.org/officeDocument/2006/relationships" xmlns:m="http://schemas.openxmlformats.org/officeDocument/2006/math" xmlns:v="urn:schemas-microsoft-com:vml" xmlns:wp14="http://schemas.microsoft.com/office/word/2010/wordprocessingDrawing" xmlns:wp="http://schemas.openxmlformats.org/drawingml/2006/wordprocessingDrawing" xmlns:w10="urn:schemas-microsoft-com:office:word" xmlns:w="http://schemas.openxmlformats.org/wordprocessingml/2006/main" xmlns:w14="http://schemas.microsoft.com/office/word/2010/wordml" xmlns:w15="http://schemas.microsoft.com/office/word/2012/wordml" xmlns:w16cex="http://schemas.microsoft.com/office/word/2018/wordml/cex" xmlns:w16cid="http://schemas.microsoft.com/office/word/2016/wordml/cid" xmlns:w16="http://schemas.microsoft.com/office/word/2018/wordml" xmlns:w16du="http://schemas.microsoft.com/office/word/2023/wordml/word16du" xmlns:w16sdtdh="http://schemas.microsoft.com/office/word/2020/wordml/sdtdatahash" xmlns:w16se="http://schemas.microsoft.com/office/word/2015/wordml/symex" xmlns:wpg="http://schemas.microsoft.com/office/word/2010/wordprocessingGroup" xmlns:wpi="http://schemas.microsoft.com/office/word/2010/wordprocessingInk" xmlns:wne="http://schemas.microsoft.com/office/word/2006/wordml" xmlns:wps="http://schemas.microsoft.com/office/word/2010/wordprocessingShape" mc:Ignorable="w14 w15 w16se w16cid w16 w16cex w16sdtdh w16du wp14">
   <w:p>
     <w:pPr>
       <w:pStyle w:val="Footer"/>
-      <w:rPr/>
     </w:pPr>
-    <w:r>
-      <w:rPr/>
-    </w:r>
   </w:p>
 </w:ftr>
 </file>
 
 <file path=word/footer2.xml><?xml version="1.0" encoding="utf-8"?>
-<w:ftr xmlns:o="urn:schemas-microsoft-com:office:office" xmlns:r="http://schemas.openxmlformats.org/officeDocument/2006/relationships" xmlns:v="urn:schemas-microsoft-com:vml" xmlns:w="http://schemas.openxmlformats.org/wordprocessingml/2006/main" xmlns:w10="urn:schemas-microsoft-com:office:word" xmlns:wp="http://schemas.openxmlformats.org/drawingml/2006/wordprocessingDrawing" xmlns:pic="http://schemas.openxmlformats.org/drawingml/2006/picture" xmlns:wps="http://schemas.microsoft.com/office/word/2010/wordprocessingShape" xmlns:wpg="http://schemas.microsoft.com/office/word/2010/wordprocessingGroup" xmlns:mc="http://schemas.openxmlformats.org/markup-compatibility/2006" xmlns:wp14="http://schemas.microsoft.com/office/word/2010/wordprocessingDrawing" xmlns:w14="http://schemas.microsoft.com/office/word/2010/wordml" xmlns:w15="http://schemas.microsoft.com/office/word/2012/wordml" mc:Ignorable="w14 wp14 w15">
+<w:ftr xmlns:wpc="http://schemas.microsoft.com/office/word/2010/wordprocessingCanvas" xmlns:cx="http://schemas.microsoft.com/office/drawing/2014/chartex" xmlns:cx1="http://schemas.microsoft.com/office/drawing/2015/9/8/chartex" xmlns:cx2="http://schemas.microsoft.com/office/drawing/2015/10/21/chartex" xmlns:cx3="http://schemas.microsoft.com/office/drawing/2016/5/9/chartex" xmlns:cx4="http://schemas.microsoft.com/office/drawing/2016/5/10/chartex" xmlns:cx5="http://schemas.microsoft.com/office/drawing/2016/5/11/chartex" xmlns:cx6="http://schemas.microsoft.com/office/drawing/2016/5/12/chartex" xmlns:cx7="http://schemas.microsoft.com/office/drawing/2016/5/13/chartex" xmlns:cx8="http://schemas.microsoft.com/office/drawing/2016/5/14/chartex" xmlns:mc="http://schemas.openxmlformats.org/markup-compatibility/2006" xmlns:aink="http://schemas.microsoft.com/office/drawing/2016/ink" xmlns:am3d="http://schemas.microsoft.com/office/drawing/2017/model3d" xmlns:o="urn:schemas-microsoft-com:office:office" xmlns:oel="http://schemas.microsoft.com/office/2019/extlst" xmlns:r="http://schemas.openxmlformats.org/officeDocument/2006/relationships" xmlns:m="http://schemas.openxmlformats.org/officeDocument/2006/math" xmlns:v="urn:schemas-microsoft-com:vml" xmlns:wp14="http://schemas.microsoft.com/office/word/2010/wordprocessingDrawing" xmlns:wp="http://schemas.openxmlformats.org/drawingml/2006/wordprocessingDrawing" xmlns:w10="urn:schemas-microsoft-com:office:word" xmlns:w="http://schemas.openxmlformats.org/wordprocessingml/2006/main" xmlns:w14="http://schemas.microsoft.com/office/word/2010/wordml" xmlns:w15="http://schemas.microsoft.com/office/word/2012/wordml" xmlns:w16cex="http://schemas.microsoft.com/office/word/2018/wordml/cex" xmlns:w16cid="http://schemas.microsoft.com/office/word/2016/wordml/cid" xmlns:w16="http://schemas.microsoft.com/office/word/2018/wordml" xmlns:w16du="http://schemas.microsoft.com/office/word/2023/wordml/word16du" xmlns:w16sdtdh="http://schemas.microsoft.com/office/word/2020/wordml/sdtdatahash" xmlns:w16se="http://schemas.microsoft.com/office/word/2015/wordml/symex" xmlns:wpg="http://schemas.microsoft.com/office/word/2010/wordprocessingGroup" xmlns:wpi="http://schemas.microsoft.com/office/word/2010/wordprocessingInk" xmlns:wne="http://schemas.microsoft.com/office/word/2006/wordml" xmlns:wps="http://schemas.microsoft.com/office/word/2010/wordprocessingShape" mc:Ignorable="w14 w15 w16se w16cid w16 w16cex w16sdtdh w16du wp14">
   <w:p>
     <w:pPr>
       <w:pStyle w:val="Footer"/>
@@ -3144,7 +2691,23 @@
         <w:sz w:val="20"/>
       </w:rPr>
       <w:t>Bioinformatics, CGS 4144</w:t>
+    </w:r>
+    <w:r>
+      <w:rPr>
+        <w:b/>
+        <w:i/>
+        <w:color w:val="054361"/>
+        <w:sz w:val="20"/>
+      </w:rPr>
       <w:tab/>
+    </w:r>
+    <w:r>
+      <w:rPr>
+        <w:b/>
+        <w:i/>
+        <w:color w:val="054361"/>
+        <w:sz w:val="20"/>
+      </w:rPr>
       <w:tab/>
       <w:t xml:space="preserve">Page </w:t>
     </w:r>
@@ -3211,14 +2774,34 @@
         <w:color w:val="054361"/>
         <w:sz w:val="20"/>
       </w:rPr>
-      <w:t>Kiley Graim, Fall 2026</w:t>
+      <w:t xml:space="preserve">Kiley </w:t>
+    </w:r>
+    <w:proofErr w:type="spellStart"/>
+    <w:r>
+      <w:rPr>
+        <w:b/>
+        <w:i/>
+        <w:color w:val="054361"/>
+        <w:sz w:val="20"/>
+      </w:rPr>
+      <w:t>Graim</w:t>
+    </w:r>
+    <w:proofErr w:type="spellEnd"/>
+    <w:r>
+      <w:rPr>
+        <w:b/>
+        <w:i/>
+        <w:color w:val="054361"/>
+        <w:sz w:val="20"/>
+      </w:rPr>
+      <w:t>, Fall 2026</w:t>
     </w:r>
   </w:p>
 </w:ftr>
 </file>
 
 <file path=word/footer3.xml><?xml version="1.0" encoding="utf-8"?>
-<w:ftr xmlns:o="urn:schemas-microsoft-com:office:office" xmlns:r="http://schemas.openxmlformats.org/officeDocument/2006/relationships" xmlns:v="urn:schemas-microsoft-com:vml" xmlns:w="http://schemas.openxmlformats.org/wordprocessingml/2006/main" xmlns:w10="urn:schemas-microsoft-com:office:word" xmlns:wp="http://schemas.openxmlformats.org/drawingml/2006/wordprocessingDrawing" xmlns:pic="http://schemas.openxmlformats.org/drawingml/2006/picture" xmlns:wps="http://schemas.microsoft.com/office/word/2010/wordprocessingShape" xmlns:wpg="http://schemas.microsoft.com/office/word/2010/wordprocessingGroup" xmlns:mc="http://schemas.openxmlformats.org/markup-compatibility/2006" xmlns:wp14="http://schemas.microsoft.com/office/word/2010/wordprocessingDrawing" xmlns:w14="http://schemas.microsoft.com/office/word/2010/wordml" xmlns:w15="http://schemas.microsoft.com/office/word/2012/wordml" mc:Ignorable="w14 wp14 w15">
+<w:ftr xmlns:wpc="http://schemas.microsoft.com/office/word/2010/wordprocessingCanvas" xmlns:cx="http://schemas.microsoft.com/office/drawing/2014/chartex" xmlns:cx1="http://schemas.microsoft.com/office/drawing/2015/9/8/chartex" xmlns:cx2="http://schemas.microsoft.com/office/drawing/2015/10/21/chartex" xmlns:cx3="http://schemas.microsoft.com/office/drawing/2016/5/9/chartex" xmlns:cx4="http://schemas.microsoft.com/office/drawing/2016/5/10/chartex" xmlns:cx5="http://schemas.microsoft.com/office/drawing/2016/5/11/chartex" xmlns:cx6="http://schemas.microsoft.com/office/drawing/2016/5/12/chartex" xmlns:cx7="http://schemas.microsoft.com/office/drawing/2016/5/13/chartex" xmlns:cx8="http://schemas.microsoft.com/office/drawing/2016/5/14/chartex" xmlns:mc="http://schemas.openxmlformats.org/markup-compatibility/2006" xmlns:aink="http://schemas.microsoft.com/office/drawing/2016/ink" xmlns:am3d="http://schemas.microsoft.com/office/drawing/2017/model3d" xmlns:o="urn:schemas-microsoft-com:office:office" xmlns:oel="http://schemas.microsoft.com/office/2019/extlst" xmlns:r="http://schemas.openxmlformats.org/officeDocument/2006/relationships" xmlns:m="http://schemas.openxmlformats.org/officeDocument/2006/math" xmlns:v="urn:schemas-microsoft-com:vml" xmlns:wp14="http://schemas.microsoft.com/office/word/2010/wordprocessingDrawing" xmlns:wp="http://schemas.openxmlformats.org/drawingml/2006/wordprocessingDrawing" xmlns:w10="urn:schemas-microsoft-com:office:word" xmlns:w="http://schemas.openxmlformats.org/wordprocessingml/2006/main" xmlns:w14="http://schemas.microsoft.com/office/word/2010/wordml" xmlns:w15="http://schemas.microsoft.com/office/word/2012/wordml" xmlns:w16cex="http://schemas.microsoft.com/office/word/2018/wordml/cex" xmlns:w16cid="http://schemas.microsoft.com/office/word/2016/wordml/cid" xmlns:w16="http://schemas.microsoft.com/office/word/2018/wordml" xmlns:w16du="http://schemas.microsoft.com/office/word/2023/wordml/word16du" xmlns:w16sdtdh="http://schemas.microsoft.com/office/word/2020/wordml/sdtdatahash" xmlns:w16se="http://schemas.microsoft.com/office/word/2015/wordml/symex" xmlns:wpg="http://schemas.microsoft.com/office/word/2010/wordprocessingGroup" xmlns:wpi="http://schemas.microsoft.com/office/word/2010/wordprocessingInk" xmlns:wne="http://schemas.microsoft.com/office/word/2006/wordml" xmlns:wps="http://schemas.microsoft.com/office/word/2010/wordprocessingShape" mc:Ignorable="w14 w15 w16se w16cid w16 w16cex w16sdtdh w16du wp14">
   <w:p>
     <w:pPr>
       <w:pStyle w:val="Footer"/>
@@ -3237,7 +2820,23 @@
         <w:sz w:val="20"/>
       </w:rPr>
       <w:t>Bioinformatics, CGS 4144</w:t>
+    </w:r>
+    <w:r>
+      <w:rPr>
+        <w:b/>
+        <w:i/>
+        <w:color w:val="054361"/>
+        <w:sz w:val="20"/>
+      </w:rPr>
       <w:tab/>
+    </w:r>
+    <w:r>
+      <w:rPr>
+        <w:b/>
+        <w:i/>
+        <w:color w:val="054361"/>
+        <w:sz w:val="20"/>
+      </w:rPr>
       <w:tab/>
       <w:t xml:space="preserve">Page </w:t>
     </w:r>
@@ -3304,26 +2903,181 @@
         <w:color w:val="054361"/>
         <w:sz w:val="20"/>
       </w:rPr>
-      <w:t>Kiley Graim, Fall 2026</w:t>
+      <w:t xml:space="preserve">Kiley </w:t>
+    </w:r>
+    <w:proofErr w:type="spellStart"/>
+    <w:r>
+      <w:rPr>
+        <w:b/>
+        <w:i/>
+        <w:color w:val="054361"/>
+        <w:sz w:val="20"/>
+      </w:rPr>
+      <w:t>Graim</w:t>
+    </w:r>
+    <w:proofErr w:type="spellEnd"/>
+    <w:r>
+      <w:rPr>
+        <w:b/>
+        <w:i/>
+        <w:color w:val="054361"/>
+        <w:sz w:val="20"/>
+      </w:rPr>
+      <w:t>, Fall 2026</w:t>
     </w:r>
   </w:p>
 </w:ftr>
 </file>
 
+<file path=word/footnotes.xml><?xml version="1.0" encoding="utf-8"?>
+<w:footnotes xmlns:wpc="http://schemas.microsoft.com/office/word/2010/wordprocessingCanvas" xmlns:cx="http://schemas.microsoft.com/office/drawing/2014/chartex" xmlns:cx1="http://schemas.microsoft.com/office/drawing/2015/9/8/chartex" xmlns:cx2="http://schemas.microsoft.com/office/drawing/2015/10/21/chartex" xmlns:cx3="http://schemas.microsoft.com/office/drawing/2016/5/9/chartex" xmlns:cx4="http://schemas.microsoft.com/office/drawing/2016/5/10/chartex" xmlns:cx5="http://schemas.microsoft.com/office/drawing/2016/5/11/chartex" xmlns:cx6="http://schemas.microsoft.com/office/drawing/2016/5/12/chartex" xmlns:cx7="http://schemas.microsoft.com/office/drawing/2016/5/13/chartex" xmlns:cx8="http://schemas.microsoft.com/office/drawing/2016/5/14/chartex" xmlns:mc="http://schemas.openxmlformats.org/markup-compatibility/2006" xmlns:aink="http://schemas.microsoft.com/office/drawing/2016/ink" xmlns:am3d="http://schemas.microsoft.com/office/drawing/2017/model3d" xmlns:o="urn:schemas-microsoft-com:office:office" xmlns:oel="http://schemas.microsoft.com/office/2019/extlst" xmlns:r="http://schemas.openxmlformats.org/officeDocument/2006/relationships" xmlns:m="http://schemas.openxmlformats.org/officeDocument/2006/math" xmlns:v="urn:schemas-microsoft-com:vml" xmlns:wp14="http://schemas.microsoft.com/office/word/2010/wordprocessingDrawing" xmlns:wp="http://schemas.openxmlformats.org/drawingml/2006/wordprocessingDrawing" xmlns:w10="urn:schemas-microsoft-com:office:word" xmlns:w="http://schemas.openxmlformats.org/wordprocessingml/2006/main" xmlns:w14="http://schemas.microsoft.com/office/word/2010/wordml" xmlns:w15="http://schemas.microsoft.com/office/word/2012/wordml" xmlns:w16cex="http://schemas.microsoft.com/office/word/2018/wordml/cex" xmlns:w16cid="http://schemas.microsoft.com/office/word/2016/wordml/cid" xmlns:w16="http://schemas.microsoft.com/office/word/2018/wordml" xmlns:w16du="http://schemas.microsoft.com/office/word/2023/wordml/word16du" xmlns:w16sdtdh="http://schemas.microsoft.com/office/word/2020/wordml/sdtdatahash" xmlns:w16se="http://schemas.microsoft.com/office/word/2015/wordml/symex" xmlns:wpg="http://schemas.microsoft.com/office/word/2010/wordprocessingGroup" xmlns:wpi="http://schemas.microsoft.com/office/word/2010/wordprocessingInk" xmlns:wne="http://schemas.microsoft.com/office/word/2006/wordml" xmlns:wps="http://schemas.microsoft.com/office/word/2010/wordprocessingShape" mc:Ignorable="w14 w15 w16se w16cid w16 w16cex w16sdtdh w16du wp14">
+  <w:footnote w:type="separator" w:id="-1">
+    <w:p>
+      <w:r>
+        <w:separator/>
+      </w:r>
+    </w:p>
+  </w:footnote>
+  <w:footnote w:type="continuationSeparator" w:id="0">
+    <w:p>
+      <w:r>
+        <w:continuationSeparator/>
+      </w:r>
+    </w:p>
+  </w:footnote>
+</w:footnotes>
+</file>
+
 <file path=word/numbering.xml><?xml version="1.0" encoding="utf-8"?>
-<w:numbering xmlns:w="http://schemas.openxmlformats.org/wordprocessingml/2006/main" xmlns:o="urn:schemas-microsoft-com:office:office" xmlns:r="http://schemas.openxmlformats.org/officeDocument/2006/relationships" xmlns:v="urn:schemas-microsoft-com:vml" xmlns:mc="http://schemas.openxmlformats.org/markup-compatibility/2006" xmlns:w14="http://schemas.microsoft.com/office/word/2010/wordml" mc:Ignorable="w14">
-  <w:abstractNum w:abstractNumId="1">
+<w:numbering xmlns:wpc="http://schemas.microsoft.com/office/word/2010/wordprocessingCanvas" xmlns:cx="http://schemas.microsoft.com/office/drawing/2014/chartex" xmlns:cx1="http://schemas.microsoft.com/office/drawing/2015/9/8/chartex" xmlns:cx2="http://schemas.microsoft.com/office/drawing/2015/10/21/chartex" xmlns:cx3="http://schemas.microsoft.com/office/drawing/2016/5/9/chartex" xmlns:cx4="http://schemas.microsoft.com/office/drawing/2016/5/10/chartex" xmlns:cx5="http://schemas.microsoft.com/office/drawing/2016/5/11/chartex" xmlns:cx6="http://schemas.microsoft.com/office/drawing/2016/5/12/chartex" xmlns:cx7="http://schemas.microsoft.com/office/drawing/2016/5/13/chartex" xmlns:cx8="http://schemas.microsoft.com/office/drawing/2016/5/14/chartex" xmlns:mc="http://schemas.openxmlformats.org/markup-compatibility/2006" xmlns:aink="http://schemas.microsoft.com/office/drawing/2016/ink" xmlns:am3d="http://schemas.microsoft.com/office/drawing/2017/model3d" xmlns:o="urn:schemas-microsoft-com:office:office" xmlns:oel="http://schemas.microsoft.com/office/2019/extlst" xmlns:r="http://schemas.openxmlformats.org/officeDocument/2006/relationships" xmlns:m="http://schemas.openxmlformats.org/officeDocument/2006/math" xmlns:v="urn:schemas-microsoft-com:vml" xmlns:wp14="http://schemas.microsoft.com/office/word/2010/wordprocessingDrawing" xmlns:wp="http://schemas.openxmlformats.org/drawingml/2006/wordprocessingDrawing" xmlns:w10="urn:schemas-microsoft-com:office:word" xmlns:w="http://schemas.openxmlformats.org/wordprocessingml/2006/main" xmlns:w14="http://schemas.microsoft.com/office/word/2010/wordml" xmlns:w15="http://schemas.microsoft.com/office/word/2012/wordml" xmlns:w16cex="http://schemas.microsoft.com/office/word/2018/wordml/cex" xmlns:w16cid="http://schemas.microsoft.com/office/word/2016/wordml/cid" xmlns:w16="http://schemas.microsoft.com/office/word/2018/wordml" xmlns:w16du="http://schemas.microsoft.com/office/word/2023/wordml/word16du" xmlns:w16sdtdh="http://schemas.microsoft.com/office/word/2020/wordml/sdtdatahash" xmlns:w16se="http://schemas.microsoft.com/office/word/2015/wordml/symex" xmlns:wpg="http://schemas.microsoft.com/office/word/2010/wordprocessingGroup" xmlns:wpi="http://schemas.microsoft.com/office/word/2010/wordprocessingInk" xmlns:wne="http://schemas.microsoft.com/office/word/2006/wordml" xmlns:wps="http://schemas.microsoft.com/office/word/2010/wordprocessingShape" mc:Ignorable="w14 w15 w16se w16cid w16 w16cex w16sdtdh w16du wp14">
+  <w:abstractNum w:abstractNumId="0" w15:restartNumberingAfterBreak="0">
+    <w:nsid w:val="1B3C1059"/>
+    <w:multiLevelType w:val="multilevel"/>
+    <w:tmpl w:val="A5DC9826"/>
+    <w:lvl w:ilvl="0">
+      <w:start w:val="1"/>
+      <w:numFmt w:val="decimal"/>
+      <w:lvlText w:val="%1."/>
+      <w:lvlJc w:val="left"/>
+      <w:pPr>
+        <w:tabs>
+          <w:tab w:val="num" w:pos="0"/>
+        </w:tabs>
+        <w:ind w:left="720" w:hanging="360"/>
+      </w:pPr>
+    </w:lvl>
+    <w:lvl w:ilvl="1">
+      <w:start w:val="1"/>
+      <w:numFmt w:val="lowerLetter"/>
+      <w:lvlText w:val="%2."/>
+      <w:lvlJc w:val="left"/>
+      <w:pPr>
+        <w:tabs>
+          <w:tab w:val="num" w:pos="0"/>
+        </w:tabs>
+        <w:ind w:left="1440" w:hanging="360"/>
+      </w:pPr>
+    </w:lvl>
+    <w:lvl w:ilvl="2">
+      <w:start w:val="1"/>
+      <w:numFmt w:val="lowerRoman"/>
+      <w:lvlText w:val="%3."/>
+      <w:lvlJc w:val="right"/>
+      <w:pPr>
+        <w:tabs>
+          <w:tab w:val="num" w:pos="0"/>
+        </w:tabs>
+        <w:ind w:left="2160" w:hanging="180"/>
+      </w:pPr>
+    </w:lvl>
+    <w:lvl w:ilvl="3">
+      <w:start w:val="1"/>
+      <w:numFmt w:val="decimal"/>
+      <w:lvlText w:val="%4."/>
+      <w:lvlJc w:val="left"/>
+      <w:pPr>
+        <w:tabs>
+          <w:tab w:val="num" w:pos="0"/>
+        </w:tabs>
+        <w:ind w:left="2880" w:hanging="360"/>
+      </w:pPr>
+    </w:lvl>
+    <w:lvl w:ilvl="4">
+      <w:start w:val="1"/>
+      <w:numFmt w:val="lowerLetter"/>
+      <w:lvlText w:val="%5."/>
+      <w:lvlJc w:val="left"/>
+      <w:pPr>
+        <w:tabs>
+          <w:tab w:val="num" w:pos="0"/>
+        </w:tabs>
+        <w:ind w:left="3600" w:hanging="360"/>
+      </w:pPr>
+    </w:lvl>
+    <w:lvl w:ilvl="5">
+      <w:start w:val="1"/>
+      <w:numFmt w:val="lowerRoman"/>
+      <w:lvlText w:val="%6."/>
+      <w:lvlJc w:val="right"/>
+      <w:pPr>
+        <w:tabs>
+          <w:tab w:val="num" w:pos="0"/>
+        </w:tabs>
+        <w:ind w:left="4320" w:hanging="180"/>
+      </w:pPr>
+    </w:lvl>
+    <w:lvl w:ilvl="6">
+      <w:start w:val="1"/>
+      <w:numFmt w:val="decimal"/>
+      <w:lvlText w:val="%7."/>
+      <w:lvlJc w:val="left"/>
+      <w:pPr>
+        <w:tabs>
+          <w:tab w:val="num" w:pos="0"/>
+        </w:tabs>
+        <w:ind w:left="5040" w:hanging="360"/>
+      </w:pPr>
+    </w:lvl>
+    <w:lvl w:ilvl="7">
+      <w:start w:val="1"/>
+      <w:numFmt w:val="lowerLetter"/>
+      <w:lvlText w:val="%8."/>
+      <w:lvlJc w:val="left"/>
+      <w:pPr>
+        <w:tabs>
+          <w:tab w:val="num" w:pos="0"/>
+        </w:tabs>
+        <w:ind w:left="5760" w:hanging="360"/>
+      </w:pPr>
+    </w:lvl>
+    <w:lvl w:ilvl="8">
+      <w:start w:val="1"/>
+      <w:numFmt w:val="lowerRoman"/>
+      <w:lvlText w:val="%9."/>
+      <w:lvlJc w:val="right"/>
+      <w:pPr>
+        <w:tabs>
+          <w:tab w:val="num" w:pos="0"/>
+        </w:tabs>
+        <w:ind w:left="6480" w:hanging="180"/>
+      </w:pPr>
+    </w:lvl>
+  </w:abstractNum>
+  <w:abstractNum w:abstractNumId="1" w15:restartNumberingAfterBreak="0">
+    <w:nsid w:val="1BCD3034"/>
+    <w:multiLevelType w:val="multilevel"/>
+    <w:tmpl w:val="CCEAB45C"/>
     <w:lvl w:ilvl="0">
       <w:start w:val="1"/>
       <w:numFmt w:val="none"/>
       <w:suff w:val="nothing"/>
       <w:lvlText w:val=""/>
-      <w:lvlJc w:val="start"/>
+      <w:lvlJc w:val="left"/>
       <w:pPr>
         <w:tabs>
           <w:tab w:val="num" w:pos="0"/>
         </w:tabs>
-        <w:ind w:start="0" w:hanging="0"/>
+        <w:ind w:left="0" w:firstLine="0"/>
       </w:pPr>
     </w:lvl>
     <w:lvl w:ilvl="1">
@@ -3331,12 +3085,12 @@
       <w:numFmt w:val="none"/>
       <w:suff w:val="nothing"/>
       <w:lvlText w:val=""/>
-      <w:lvlJc w:val="start"/>
+      <w:lvlJc w:val="left"/>
       <w:pPr>
         <w:tabs>
           <w:tab w:val="num" w:pos="0"/>
         </w:tabs>
-        <w:ind w:start="0" w:hanging="0"/>
+        <w:ind w:left="0" w:firstLine="0"/>
       </w:pPr>
     </w:lvl>
     <w:lvl w:ilvl="2">
@@ -3344,12 +3098,12 @@
       <w:numFmt w:val="none"/>
       <w:suff w:val="nothing"/>
       <w:lvlText w:val=""/>
-      <w:lvlJc w:val="start"/>
+      <w:lvlJc w:val="left"/>
       <w:pPr>
         <w:tabs>
           <w:tab w:val="num" w:pos="0"/>
         </w:tabs>
-        <w:ind w:start="0" w:hanging="0"/>
+        <w:ind w:left="0" w:firstLine="0"/>
       </w:pPr>
     </w:lvl>
     <w:lvl w:ilvl="3">
@@ -3357,12 +3111,12 @@
       <w:numFmt w:val="none"/>
       <w:suff w:val="nothing"/>
       <w:lvlText w:val=""/>
-      <w:lvlJc w:val="start"/>
+      <w:lvlJc w:val="left"/>
       <w:pPr>
         <w:tabs>
           <w:tab w:val="num" w:pos="0"/>
         </w:tabs>
-        <w:ind w:start="0" w:hanging="0"/>
+        <w:ind w:left="0" w:firstLine="0"/>
       </w:pPr>
     </w:lvl>
     <w:lvl w:ilvl="4">
@@ -3370,12 +3124,12 @@
       <w:numFmt w:val="none"/>
       <w:suff w:val="nothing"/>
       <w:lvlText w:val=""/>
-      <w:lvlJc w:val="start"/>
+      <w:lvlJc w:val="left"/>
       <w:pPr>
         <w:tabs>
           <w:tab w:val="num" w:pos="0"/>
         </w:tabs>
-        <w:ind w:start="0" w:hanging="0"/>
+        <w:ind w:left="0" w:firstLine="0"/>
       </w:pPr>
     </w:lvl>
     <w:lvl w:ilvl="5">
@@ -3383,12 +3137,12 @@
       <w:numFmt w:val="none"/>
       <w:suff w:val="nothing"/>
       <w:lvlText w:val=""/>
-      <w:lvlJc w:val="start"/>
+      <w:lvlJc w:val="left"/>
       <w:pPr>
         <w:tabs>
           <w:tab w:val="num" w:pos="0"/>
         </w:tabs>
-        <w:ind w:start="0" w:hanging="0"/>
+        <w:ind w:left="0" w:firstLine="0"/>
       </w:pPr>
     </w:lvl>
     <w:lvl w:ilvl="6">
@@ -3396,12 +3150,12 @@
       <w:numFmt w:val="none"/>
       <w:suff w:val="nothing"/>
       <w:lvlText w:val=""/>
-      <w:lvlJc w:val="start"/>
+      <w:lvlJc w:val="left"/>
       <w:pPr>
         <w:tabs>
           <w:tab w:val="num" w:pos="0"/>
         </w:tabs>
-        <w:ind w:start="0" w:hanging="0"/>
+        <w:ind w:left="0" w:firstLine="0"/>
       </w:pPr>
     </w:lvl>
     <w:lvl w:ilvl="7">
@@ -3409,12 +3163,12 @@
       <w:numFmt w:val="none"/>
       <w:suff w:val="nothing"/>
       <w:lvlText w:val=""/>
-      <w:lvlJc w:val="start"/>
+      <w:lvlJc w:val="left"/>
       <w:pPr>
         <w:tabs>
           <w:tab w:val="num" w:pos="0"/>
         </w:tabs>
-        <w:ind w:start="0" w:hanging="0"/>
+        <w:ind w:left="0" w:firstLine="0"/>
       </w:pPr>
     </w:lvl>
     <w:lvl w:ilvl="8">
@@ -3422,155 +3176,36 @@
       <w:numFmt w:val="none"/>
       <w:suff w:val="nothing"/>
       <w:lvlText w:val=""/>
-      <w:lvlJc w:val="start"/>
+      <w:lvlJc w:val="left"/>
       <w:pPr>
         <w:tabs>
           <w:tab w:val="num" w:pos="0"/>
         </w:tabs>
-        <w:ind w:start="0" w:hanging="0"/>
+        <w:ind w:left="0" w:firstLine="0"/>
       </w:pPr>
     </w:lvl>
   </w:abstractNum>
-  <w:abstractNum w:abstractNumId="2">
-    <w:lvl w:ilvl="0">
-      <w:start w:val="1"/>
-      <w:numFmt w:val="decimal"/>
-      <w:lvlText w:val="%1."/>
-      <w:lvlJc w:val="start"/>
-      <w:pPr>
-        <w:tabs>
-          <w:tab w:val="num" w:pos="0"/>
-        </w:tabs>
-        <w:ind w:start="720" w:hanging="360"/>
-      </w:pPr>
-      <w:rPr/>
-    </w:lvl>
-    <w:lvl w:ilvl="1">
-      <w:start w:val="1"/>
-      <w:numFmt w:val="lowerLetter"/>
-      <w:lvlText w:val="%2."/>
-      <w:lvlJc w:val="start"/>
-      <w:pPr>
-        <w:tabs>
-          <w:tab w:val="num" w:pos="0"/>
-        </w:tabs>
-        <w:ind w:start="1440" w:hanging="360"/>
-      </w:pPr>
-      <w:rPr/>
-    </w:lvl>
-    <w:lvl w:ilvl="2">
-      <w:start w:val="1"/>
-      <w:numFmt w:val="lowerRoman"/>
-      <w:lvlText w:val="%3."/>
-      <w:lvlJc w:val="end"/>
-      <w:pPr>
-        <w:tabs>
-          <w:tab w:val="num" w:pos="0"/>
-        </w:tabs>
-        <w:ind w:start="2160" w:hanging="180"/>
-      </w:pPr>
-      <w:rPr/>
-    </w:lvl>
-    <w:lvl w:ilvl="3">
-      <w:start w:val="1"/>
-      <w:numFmt w:val="decimal"/>
-      <w:lvlText w:val="%4."/>
-      <w:lvlJc w:val="start"/>
-      <w:pPr>
-        <w:tabs>
-          <w:tab w:val="num" w:pos="0"/>
-        </w:tabs>
-        <w:ind w:start="2880" w:hanging="360"/>
-      </w:pPr>
-      <w:rPr/>
-    </w:lvl>
-    <w:lvl w:ilvl="4">
-      <w:start w:val="1"/>
-      <w:numFmt w:val="lowerLetter"/>
-      <w:lvlText w:val="%5."/>
-      <w:lvlJc w:val="start"/>
-      <w:pPr>
-        <w:tabs>
-          <w:tab w:val="num" w:pos="0"/>
-        </w:tabs>
-        <w:ind w:start="3600" w:hanging="360"/>
-      </w:pPr>
-      <w:rPr/>
-    </w:lvl>
-    <w:lvl w:ilvl="5">
-      <w:start w:val="1"/>
-      <w:numFmt w:val="lowerRoman"/>
-      <w:lvlText w:val="%6."/>
-      <w:lvlJc w:val="end"/>
-      <w:pPr>
-        <w:tabs>
-          <w:tab w:val="num" w:pos="0"/>
-        </w:tabs>
-        <w:ind w:start="4320" w:hanging="180"/>
-      </w:pPr>
-      <w:rPr/>
-    </w:lvl>
-    <w:lvl w:ilvl="6">
-      <w:start w:val="1"/>
-      <w:numFmt w:val="decimal"/>
-      <w:lvlText w:val="%7."/>
-      <w:lvlJc w:val="start"/>
-      <w:pPr>
-        <w:tabs>
-          <w:tab w:val="num" w:pos="0"/>
-        </w:tabs>
-        <w:ind w:start="5040" w:hanging="360"/>
-      </w:pPr>
-      <w:rPr/>
-    </w:lvl>
-    <w:lvl w:ilvl="7">
-      <w:start w:val="1"/>
-      <w:numFmt w:val="lowerLetter"/>
-      <w:lvlText w:val="%8."/>
-      <w:lvlJc w:val="start"/>
-      <w:pPr>
-        <w:tabs>
-          <w:tab w:val="num" w:pos="0"/>
-        </w:tabs>
-        <w:ind w:start="5760" w:hanging="360"/>
-      </w:pPr>
-      <w:rPr/>
-    </w:lvl>
-    <w:lvl w:ilvl="8">
-      <w:start w:val="1"/>
-      <w:numFmt w:val="lowerRoman"/>
-      <w:lvlText w:val="%9."/>
-      <w:lvlJc w:val="end"/>
-      <w:pPr>
-        <w:tabs>
-          <w:tab w:val="num" w:pos="0"/>
-        </w:tabs>
-        <w:ind w:start="6480" w:hanging="180"/>
-      </w:pPr>
-      <w:rPr/>
-    </w:lvl>
-  </w:abstractNum>
-  <w:num w:numId="1">
+  <w:num w:numId="1" w16cid:durableId="674965938">
     <w:abstractNumId w:val="1"/>
   </w:num>
-  <w:num w:numId="2">
-    <w:abstractNumId w:val="2"/>
+  <w:num w:numId="2" w16cid:durableId="2110931633">
+    <w:abstractNumId w:val="0"/>
   </w:num>
 </w:numbering>
 </file>
 
 <file path=word/styles.xml><?xml version="1.0" encoding="utf-8"?>
-<w:styles xmlns:w="http://schemas.openxmlformats.org/wordprocessingml/2006/main" xmlns:w14="http://schemas.microsoft.com/office/word/2010/wordml" xmlns:mc="http://schemas.openxmlformats.org/markup-compatibility/2006" mc:Ignorable="w14">
+<w:styles xmlns:mc="http://schemas.openxmlformats.org/markup-compatibility/2006" xmlns:r="http://schemas.openxmlformats.org/officeDocument/2006/relationships" xmlns:w="http://schemas.openxmlformats.org/wordprocessingml/2006/main" xmlns:w14="http://schemas.microsoft.com/office/word/2010/wordml" xmlns:w15="http://schemas.microsoft.com/office/word/2012/wordml" xmlns:w16cex="http://schemas.microsoft.com/office/word/2018/wordml/cex" xmlns:w16cid="http://schemas.microsoft.com/office/word/2016/wordml/cid" xmlns:w16="http://schemas.microsoft.com/office/word/2018/wordml" xmlns:w16du="http://schemas.microsoft.com/office/word/2023/wordml/word16du" xmlns:w16sdtdh="http://schemas.microsoft.com/office/word/2020/wordml/sdtdatahash" xmlns:w16se="http://schemas.microsoft.com/office/word/2015/wordml/symex" mc:Ignorable="w14 w15 w16se w16cid w16 w16cex w16sdtdh w16du">
   <w:docDefaults>
     <w:rPrDefault>
       <w:rPr>
-        <w:rFonts w:ascii="Times New Roman" w:hAnsi="Times New Roman" w:eastAsia="Times New Roman" w:cs="Times New Roman"/>
+        <w:rFonts w:ascii="Times New Roman" w:eastAsia="Times New Roman" w:hAnsi="Times New Roman" w:cs="Times New Roman"/>
         <w:lang w:val="en-US" w:eastAsia="en-US" w:bidi="ar-SA"/>
       </w:rPr>
     </w:rPrDefault>
     <w:pPrDefault>
       <w:pPr>
-        <w:suppressAutoHyphens w:val="true"/>
+        <w:suppressAutoHyphens/>
       </w:pPr>
     </w:pPrDefault>
   </w:docDefaults>
@@ -3646,7 +3281,7 @@
     <w:lsdException w:name="Table Web 3" w:semiHidden="1" w:unhideWhenUsed="1"/>
     <w:lsdException w:name="Balloon Text" w:semiHidden="1" w:unhideWhenUsed="1"/>
     <w:lsdException w:name="Table Theme" w:semiHidden="1" w:unhideWhenUsed="1"/>
-    <w:lsdException w:name="Placeholder Text" w:uiPriority="99" w:semiHidden="1"/>
+    <w:lsdException w:name="Placeholder Text" w:semiHidden="1" w:uiPriority="99"/>
     <w:lsdException w:name="No Spacing" w:uiPriority="1" w:qFormat="1"/>
     <w:lsdException w:name="Light Shading" w:uiPriority="60"/>
     <w:lsdException w:name="Light List" w:uiPriority="61"/>
@@ -3668,7 +3303,7 @@
     <w:lsdException w:name="Medium Shading 1 Accent 1" w:uiPriority="63"/>
     <w:lsdException w:name="Medium Shading 2 Accent 1" w:uiPriority="64"/>
     <w:lsdException w:name="Medium List 1 Accent 1" w:uiPriority="65"/>
-    <w:lsdException w:name="Revision" w:uiPriority="99" w:semiHidden="1"/>
+    <w:lsdException w:name="Revision" w:semiHidden="1" w:uiPriority="99"/>
     <w:lsdException w:name="List Paragraph" w:uiPriority="34" w:qFormat="1"/>
     <w:lsdException w:name="Quote" w:uiPriority="29" w:qFormat="1"/>
     <w:lsdException w:name="Intense Quote" w:uiPriority="30" w:qFormat="1"/>
@@ -3755,8 +3390,8 @@
     <w:lsdException w:name="Subtle Reference" w:uiPriority="31" w:qFormat="1"/>
     <w:lsdException w:name="Intense Reference" w:uiPriority="32" w:qFormat="1"/>
     <w:lsdException w:name="Book Title" w:uiPriority="33" w:qFormat="1"/>
-    <w:lsdException w:name="Bibliography" w:uiPriority="37" w:semiHidden="1" w:unhideWhenUsed="1"/>
-    <w:lsdException w:name="TOC Heading" w:uiPriority="39" w:semiHidden="1" w:unhideWhenUsed="1" w:qFormat="1"/>
+    <w:lsdException w:name="Bibliography" w:semiHidden="1" w:uiPriority="37" w:unhideWhenUsed="1"/>
+    <w:lsdException w:name="TOC Heading" w:semiHidden="1" w:uiPriority="39" w:unhideWhenUsed="1" w:qFormat="1"/>
     <w:lsdException w:name="Plain Table 1" w:uiPriority="41"/>
     <w:lsdException w:name="Plain Table 2" w:uiPriority="42"/>
     <w:lsdException w:name="Plain Table 3" w:uiPriority="43"/>
@@ -3861,29 +3496,20 @@
     <w:lsdException w:name="List Table 5 Dark Accent 6" w:uiPriority="50"/>
     <w:lsdException w:name="List Table 6 Colorful Accent 6" w:uiPriority="51"/>
     <w:lsdException w:name="List Table 7 Colorful Accent 6" w:uiPriority="52"/>
-    <w:lsdException w:name="Mention" w:uiPriority="99" w:semiHidden="1" w:unhideWhenUsed="1"/>
-    <w:lsdException w:name="Smart Hyperlink" w:uiPriority="99" w:semiHidden="1" w:unhideWhenUsed="1"/>
-    <w:lsdException w:name="Hashtag" w:uiPriority="99" w:semiHidden="1" w:unhideWhenUsed="1"/>
-    <w:lsdException w:name="Unresolved Mention" w:uiPriority="99" w:semiHidden="1" w:unhideWhenUsed="1"/>
-    <w:lsdException w:name="Smart Link" w:uiPriority="99" w:semiHidden="1" w:unhideWhenUsed="1"/>
+    <w:lsdException w:name="Mention" w:semiHidden="1" w:uiPriority="99" w:unhideWhenUsed="1"/>
+    <w:lsdException w:name="Smart Hyperlink" w:semiHidden="1" w:uiPriority="99" w:unhideWhenUsed="1"/>
+    <w:lsdException w:name="Hashtag" w:semiHidden="1" w:uiPriority="99" w:unhideWhenUsed="1"/>
+    <w:lsdException w:name="Unresolved Mention" w:semiHidden="1" w:uiPriority="99" w:unhideWhenUsed="1"/>
+    <w:lsdException w:name="Smart Link" w:semiHidden="1" w:uiPriority="99" w:unhideWhenUsed="1"/>
   </w:latentStyles>
-  <w:style w:type="paragraph" w:styleId="Normal" w:default="1">
+  <w:style w:type="paragraph" w:default="1" w:styleId="Normal">
     <w:name w:val="Normal"/>
     <w:qFormat/>
-    <w:rsid w:val="007800bc"/>
-    <w:pPr>
-      <w:widowControl/>
-      <w:bidi w:val="0"/>
-      <w:spacing w:before="0" w:after="0"/>
-      <w:jc w:val="start"/>
-    </w:pPr>
+    <w:rsid w:val="007800BC"/>
     <w:rPr>
-      <w:rFonts w:ascii="Cambria" w:hAnsi="Cambria" w:eastAsia="Times New Roman" w:cs="Times New Roman"/>
-      <w:color w:val="auto"/>
-      <w:kern w:val="0"/>
+      <w:rFonts w:ascii="Cambria" w:hAnsi="Cambria"/>
       <w:sz w:val="22"/>
       <w:szCs w:val="24"/>
-      <w:lang w:val="en-US" w:eastAsia="en-US" w:bidi="ar-SA"/>
     </w:rPr>
   </w:style>
   <w:style w:type="paragraph" w:styleId="Heading1">
@@ -3892,15 +3518,15 @@
     <w:next w:val="Normal"/>
     <w:link w:val="Heading1Char"/>
     <w:qFormat/>
-    <w:rsid w:val="007800bc"/>
+    <w:rsid w:val="007800BC"/>
     <w:pPr>
-      <w:keepNext w:val="true"/>
+      <w:keepNext/>
       <w:keepLines/>
-      <w:spacing w:before="160" w:after="0"/>
+      <w:spacing w:before="160"/>
       <w:outlineLvl w:val="0"/>
     </w:pPr>
     <w:rPr>
-      <w:rFonts w:eastAsia="" w:cs="" w:cstheme="majorBidi" w:eastAsiaTheme="majorEastAsia"/>
+      <w:rFonts w:eastAsiaTheme="majorEastAsia" w:cstheme="majorBidi"/>
       <w:b/>
       <w:i/>
       <w:szCs w:val="32"/>
@@ -3913,27 +3539,46 @@
     <w:link w:val="Heading2Char"/>
     <w:unhideWhenUsed/>
     <w:qFormat/>
-    <w:rsid w:val="009720b6"/>
+    <w:rsid w:val="009720B6"/>
     <w:pPr>
-      <w:keepNext w:val="true"/>
+      <w:keepNext/>
       <w:keepLines/>
-      <w:spacing w:before="40" w:after="0"/>
+      <w:spacing w:before="40"/>
       <w:outlineLvl w:val="1"/>
     </w:pPr>
     <w:rPr>
-      <w:rFonts w:eastAsia="" w:cs="" w:cstheme="majorBidi" w:eastAsiaTheme="majorEastAsia"/>
-      <w:color w:themeColor="accent1" w:themeShade="bf" w:val="2E74B5"/>
+      <w:rFonts w:eastAsiaTheme="majorEastAsia" w:cstheme="majorBidi"/>
+      <w:color w:val="2E74B5" w:themeColor="accent1" w:themeShade="BF"/>
       <w:sz w:val="26"/>
       <w:szCs w:val="26"/>
     </w:rPr>
   </w:style>
-  <w:style w:type="character" w:styleId="DefaultParagraphFont" w:default="1">
+  <w:style w:type="character" w:default="1" w:styleId="DefaultParagraphFont">
     <w:name w:val="Default Paragraph Font"/>
     <w:uiPriority w:val="1"/>
     <w:semiHidden/>
     <w:unhideWhenUsed/>
-    <w:qFormat/>
-    <w:rPr/>
+  </w:style>
+  <w:style w:type="table" w:default="1" w:styleId="TableNormal">
+    <w:name w:val="Normal Table"/>
+    <w:uiPriority w:val="99"/>
+    <w:semiHidden/>
+    <w:unhideWhenUsed/>
+    <w:tblPr>
+      <w:tblInd w:w="0" w:type="dxa"/>
+      <w:tblCellMar>
+        <w:top w:w="0" w:type="dxa"/>
+        <w:left w:w="108" w:type="dxa"/>
+        <w:bottom w:w="0" w:type="dxa"/>
+        <w:right w:w="108" w:type="dxa"/>
+      </w:tblCellMar>
+    </w:tblPr>
+  </w:style>
+  <w:style w:type="numbering" w:default="1" w:styleId="NoList">
+    <w:name w:val="No List"/>
+    <w:uiPriority w:val="99"/>
+    <w:semiHidden/>
+    <w:unhideWhenUsed/>
   </w:style>
   <w:style w:type="character" w:styleId="Hyperlink">
     <w:name w:val="Hyperlink"/>
@@ -3941,25 +3586,25 @@
     <w:unhideWhenUsed/>
     <w:rsid w:val="00005562"/>
     <w:rPr>
-      <w:color w:themeColor="accent1" w:themeShade="bf" w:val="2E74B5"/>
+      <w:color w:val="2E74B5" w:themeColor="accent1" w:themeShade="BF"/>
       <w:u w:val="single"/>
     </w:rPr>
   </w:style>
-  <w:style w:type="character" w:styleId="HeaderChar" w:customStyle="1">
+  <w:style w:type="character" w:customStyle="1" w:styleId="HeaderChar">
     <w:name w:val="Header Char"/>
     <w:link w:val="Header"/>
     <w:qFormat/>
-    <w:rsid w:val="00be1628"/>
+    <w:rsid w:val="00BE1628"/>
     <w:rPr>
       <w:sz w:val="24"/>
       <w:szCs w:val="24"/>
     </w:rPr>
   </w:style>
-  <w:style w:type="character" w:styleId="FooterChar" w:customStyle="1">
+  <w:style w:type="character" w:customStyle="1" w:styleId="FooterChar">
     <w:name w:val="Footer Char"/>
     <w:link w:val="Footer"/>
     <w:qFormat/>
-    <w:rsid w:val="00be1628"/>
+    <w:rsid w:val="00BE1628"/>
     <w:rPr>
       <w:sz w:val="24"/>
       <w:szCs w:val="24"/>
@@ -3967,17 +3612,17 @@
   </w:style>
   <w:style w:type="character" w:styleId="FollowedHyperlink">
     <w:name w:val="FollowedHyperlink"/>
-    <w:rsid w:val="00640af7"/>
+    <w:rsid w:val="00640AF7"/>
     <w:rPr>
       <w:color w:val="800080"/>
       <w:u w:val="single"/>
     </w:rPr>
   </w:style>
-  <w:style w:type="character" w:styleId="BalloonTextChar" w:customStyle="1">
+  <w:style w:type="character" w:customStyle="1" w:styleId="BalloonTextChar">
     <w:name w:val="Balloon Text Char"/>
     <w:link w:val="BalloonText"/>
     <w:qFormat/>
-    <w:rsid w:val="004f04f2"/>
+    <w:rsid w:val="004F04F2"/>
     <w:rPr>
       <w:rFonts w:ascii="Tahoma" w:hAnsi="Tahoma" w:cs="Tahoma"/>
       <w:sz w:val="16"/>
@@ -3988,30 +3633,30 @@
     <w:name w:val="annotation reference"/>
     <w:basedOn w:val="DefaultParagraphFont"/>
     <w:qFormat/>
-    <w:rsid w:val="001b26b3"/>
+    <w:rsid w:val="001B26B3"/>
     <w:rPr>
       <w:sz w:val="18"/>
       <w:szCs w:val="18"/>
     </w:rPr>
   </w:style>
-  <w:style w:type="character" w:styleId="CommentTextChar" w:customStyle="1">
+  <w:style w:type="character" w:customStyle="1" w:styleId="CommentTextChar">
     <w:name w:val="Comment Text Char"/>
     <w:basedOn w:val="DefaultParagraphFont"/>
     <w:link w:val="CommentText"/>
     <w:qFormat/>
-    <w:rsid w:val="001b26b3"/>
+    <w:rsid w:val="001B26B3"/>
     <w:rPr>
       <w:rFonts w:ascii="Cambria" w:hAnsi="Cambria"/>
       <w:sz w:val="24"/>
       <w:szCs w:val="24"/>
     </w:rPr>
   </w:style>
-  <w:style w:type="character" w:styleId="CommentSubjectChar" w:customStyle="1">
+  <w:style w:type="character" w:customStyle="1" w:styleId="CommentSubjectChar">
     <w:name w:val="Comment Subject Char"/>
     <w:basedOn w:val="CommentTextChar"/>
-    <w:link w:val="annotationsubject"/>
+    <w:link w:val="CommentSubject"/>
     <w:qFormat/>
-    <w:rsid w:val="001b26b3"/>
+    <w:rsid w:val="001B26B3"/>
     <w:rPr>
       <w:rFonts w:ascii="Cambria" w:hAnsi="Cambria"/>
       <w:b/>
@@ -4020,42 +3665,42 @@
       <w:szCs w:val="24"/>
     </w:rPr>
   </w:style>
-  <w:style w:type="character" w:styleId="PlainTextChar" w:customStyle="1">
+  <w:style w:type="character" w:customStyle="1" w:styleId="PlainTextChar">
     <w:name w:val="Plain Text Char"/>
     <w:basedOn w:val="DefaultParagraphFont"/>
     <w:link w:val="PlainText"/>
     <w:uiPriority w:val="99"/>
     <w:qFormat/>
-    <w:rsid w:val="0065446b"/>
+    <w:rsid w:val="0065446B"/>
     <w:rPr>
-      <w:rFonts w:ascii="Calibri" w:hAnsi="Calibri" w:cs="" w:cstheme="minorBidi"/>
+      <w:rFonts w:ascii="Calibri" w:hAnsi="Calibri" w:cstheme="minorBidi"/>
       <w:sz w:val="22"/>
       <w:szCs w:val="21"/>
     </w:rPr>
   </w:style>
-  <w:style w:type="character" w:styleId="Heading1Char" w:customStyle="1">
+  <w:style w:type="character" w:customStyle="1" w:styleId="Heading1Char">
     <w:name w:val="Heading 1 Char"/>
     <w:basedOn w:val="DefaultParagraphFont"/>
     <w:link w:val="Heading1"/>
     <w:qFormat/>
-    <w:rsid w:val="007800bc"/>
+    <w:rsid w:val="007800BC"/>
     <w:rPr>
-      <w:rFonts w:ascii="Cambria" w:hAnsi="Cambria" w:eastAsia="" w:cs="" w:cstheme="majorBidi" w:eastAsiaTheme="majorEastAsia"/>
+      <w:rFonts w:ascii="Cambria" w:eastAsiaTheme="majorEastAsia" w:hAnsi="Cambria" w:cstheme="majorBidi"/>
       <w:b/>
       <w:i/>
       <w:sz w:val="22"/>
       <w:szCs w:val="32"/>
     </w:rPr>
   </w:style>
-  <w:style w:type="character" w:styleId="Heading2Char" w:customStyle="1">
+  <w:style w:type="character" w:customStyle="1" w:styleId="Heading2Char">
     <w:name w:val="Heading 2 Char"/>
     <w:basedOn w:val="DefaultParagraphFont"/>
     <w:link w:val="Heading2"/>
     <w:qFormat/>
-    <w:rsid w:val="009720b6"/>
+    <w:rsid w:val="009720B6"/>
     <w:rPr>
-      <w:rFonts w:ascii="Cambria" w:hAnsi="Cambria" w:eastAsia="" w:cs="" w:cstheme="majorBidi" w:eastAsiaTheme="majorEastAsia"/>
-      <w:color w:themeColor="accent1" w:themeShade="bf" w:val="2E74B5"/>
+      <w:rFonts w:ascii="Cambria" w:eastAsiaTheme="majorEastAsia" w:hAnsi="Cambria" w:cstheme="majorBidi"/>
+      <w:color w:val="2E74B5" w:themeColor="accent1" w:themeShade="BF"/>
       <w:sz w:val="26"/>
       <w:szCs w:val="26"/>
     </w:rPr>
@@ -4067,23 +3712,23 @@
     <w:semiHidden/>
     <w:unhideWhenUsed/>
     <w:qFormat/>
-    <w:rsid w:val="005a37ac"/>
+    <w:rsid w:val="005A37AC"/>
     <w:rPr>
       <w:color w:val="605E5C"/>
-      <w:shd w:fill="E1DFDD" w:val="clear"/>
+      <w:shd w:val="clear" w:color="auto" w:fill="E1DFDD"/>
     </w:rPr>
   </w:style>
-  <w:style w:type="paragraph" w:styleId="Heading">
+  <w:style w:type="paragraph" w:customStyle="1" w:styleId="Heading">
     <w:name w:val="Heading"/>
     <w:basedOn w:val="Normal"/>
     <w:next w:val="BodyText"/>
     <w:qFormat/>
     <w:pPr>
-      <w:keepNext w:val="true"/>
+      <w:keepNext/>
       <w:spacing w:before="240" w:after="120"/>
     </w:pPr>
     <w:rPr>
-      <w:rFonts w:ascii="Liberation Sans" w:hAnsi="Liberation Sans" w:eastAsia="Noto Sans CJK SC" w:cs="Noto Sans Devanagari"/>
+      <w:rFonts w:ascii="Liberation Sans" w:eastAsia="Noto Sans CJK SC" w:hAnsi="Liberation Sans" w:cs="Noto Sans Devanagari"/>
       <w:sz w:val="28"/>
       <w:szCs w:val="28"/>
     </w:rPr>
@@ -4091,10 +3736,10 @@
   <w:style w:type="paragraph" w:styleId="BodyText">
     <w:name w:val="Body Text"/>
     <w:basedOn w:val="Normal"/>
-    <w:rsid w:val="00b927dd"/>
+    <w:rsid w:val="00B927DD"/>
     <w:pPr>
-      <w:widowControl w:val="false"/>
-      <w:spacing w:before="0" w:after="120"/>
+      <w:widowControl w:val="0"/>
+      <w:spacing w:after="120"/>
       <w:jc w:val="both"/>
     </w:pPr>
     <w:rPr>
@@ -4105,7 +3750,6 @@
   <w:style w:type="paragraph" w:styleId="List">
     <w:name w:val="List"/>
     <w:basedOn w:val="BodyText"/>
-    <w:pPr/>
     <w:rPr>
       <w:rFonts w:cs="Noto Sans Devanagari"/>
     </w:rPr>
@@ -4123,10 +3767,9 @@
       <w:i/>
       <w:iCs/>
       <w:sz w:val="24"/>
-      <w:szCs w:val="24"/>
     </w:rPr>
   </w:style>
-  <w:style w:type="paragraph" w:styleId="Index">
+  <w:style w:type="paragraph" w:customStyle="1" w:styleId="Index">
     <w:name w:val="Index"/>
     <w:basedOn w:val="Normal"/>
     <w:qFormat/>
@@ -4137,59 +3780,51 @@
       <w:rFonts w:cs="Noto Sans Devanagari"/>
     </w:rPr>
   </w:style>
-  <w:style w:type="paragraph" w:styleId="HeaderandFooter">
+  <w:style w:type="paragraph" w:customStyle="1" w:styleId="HeaderandFooter">
     <w:name w:val="Header and Footer"/>
     <w:basedOn w:val="Normal"/>
     <w:qFormat/>
-    <w:pPr/>
-    <w:rPr/>
   </w:style>
   <w:style w:type="paragraph" w:styleId="Header">
     <w:name w:val="header"/>
     <w:basedOn w:val="Normal"/>
     <w:link w:val="HeaderChar"/>
-    <w:rsid w:val="00be1628"/>
+    <w:rsid w:val="00BE1628"/>
     <w:pPr>
       <w:tabs>
-        <w:tab w:val="clear" w:pos="720"/>
-        <w:tab w:val="center" w:pos="4680" w:leader="none"/>
-        <w:tab w:val="right" w:pos="9360" w:leader="none"/>
+        <w:tab w:val="center" w:pos="4680"/>
+        <w:tab w:val="right" w:pos="9360"/>
       </w:tabs>
     </w:pPr>
-    <w:rPr/>
   </w:style>
   <w:style w:type="paragraph" w:styleId="Footer">
     <w:name w:val="footer"/>
     <w:basedOn w:val="Normal"/>
     <w:link w:val="FooterChar"/>
-    <w:rsid w:val="00be1628"/>
+    <w:rsid w:val="00BE1628"/>
     <w:pPr>
       <w:tabs>
-        <w:tab w:val="clear" w:pos="720"/>
-        <w:tab w:val="center" w:pos="4680" w:leader="none"/>
-        <w:tab w:val="right" w:pos="9360" w:leader="none"/>
+        <w:tab w:val="center" w:pos="4680"/>
+        <w:tab w:val="right" w:pos="9360"/>
       </w:tabs>
     </w:pPr>
-    <w:rPr/>
   </w:style>
-  <w:style w:type="paragraph" w:styleId="ColorfulList-Accent11" w:customStyle="1">
+  <w:style w:type="paragraph" w:customStyle="1" w:styleId="ColorfulList-Accent11">
     <w:name w:val="Colorful List - Accent 11"/>
     <w:basedOn w:val="Normal"/>
     <w:uiPriority w:val="34"/>
     <w:qFormat/>
-    <w:rsid w:val="005e6e52"/>
+    <w:rsid w:val="005E6E52"/>
     <w:pPr>
-      <w:ind w:start="720"/>
+      <w:ind w:left="720"/>
     </w:pPr>
-    <w:rPr/>
   </w:style>
   <w:style w:type="paragraph" w:styleId="BalloonText">
     <w:name w:val="Balloon Text"/>
     <w:basedOn w:val="Normal"/>
     <w:link w:val="BalloonTextChar"/>
     <w:qFormat/>
-    <w:rsid w:val="004f04f2"/>
-    <w:pPr/>
+    <w:rsid w:val="004F04F2"/>
     <w:rPr>
       <w:rFonts w:ascii="Tahoma" w:hAnsi="Tahoma" w:cs="Tahoma"/>
       <w:sz w:val="16"/>
@@ -4203,49 +3838,36 @@
     <w:qFormat/>
     <w:rsid w:val="00955689"/>
     <w:pPr>
-      <w:spacing w:before="0" w:after="0"/>
-      <w:ind w:start="720"/>
+      <w:ind w:left="720"/>
       <w:contextualSpacing/>
     </w:pPr>
-    <w:rPr/>
   </w:style>
-  <w:style w:type="paragraph" w:styleId="Default" w:customStyle="1">
+  <w:style w:type="paragraph" w:customStyle="1" w:styleId="Default">
     <w:name w:val="Default"/>
     <w:qFormat/>
-    <w:rsid w:val="006e7fc7"/>
-    <w:pPr>
-      <w:widowControl/>
-      <w:bidi w:val="0"/>
-      <w:spacing w:before="0" w:after="0"/>
-      <w:jc w:val="start"/>
-    </w:pPr>
+    <w:rsid w:val="006E7FC7"/>
     <w:rPr>
-      <w:rFonts w:ascii="Times New Roman" w:hAnsi="Times New Roman" w:eastAsia="Times New Roman" w:cs="Times New Roman"/>
       <w:color w:val="000000"/>
-      <w:kern w:val="0"/>
       <w:sz w:val="24"/>
       <w:szCs w:val="24"/>
-      <w:lang w:val="en-US" w:eastAsia="en-US" w:bidi="ar-SA"/>
     </w:rPr>
   </w:style>
   <w:style w:type="paragraph" w:styleId="CommentText">
     <w:name w:val="annotation text"/>
     <w:basedOn w:val="Normal"/>
     <w:link w:val="CommentTextChar"/>
-    <w:rsid w:val="001b26b3"/>
-    <w:pPr/>
+    <w:rsid w:val="001B26B3"/>
     <w:rPr>
       <w:sz w:val="24"/>
     </w:rPr>
   </w:style>
-  <w:style w:type="paragraph" w:styleId="annotationsubject">
+  <w:style w:type="paragraph" w:styleId="CommentSubject">
     <w:name w:val="annotation subject"/>
     <w:basedOn w:val="CommentText"/>
     <w:next w:val="CommentText"/>
     <w:link w:val="CommentSubjectChar"/>
     <w:qFormat/>
-    <w:rsid w:val="001b26b3"/>
-    <w:pPr/>
+    <w:rsid w:val="001B26B3"/>
     <w:rPr>
       <w:b/>
       <w:bCs/>
@@ -4260,10 +3882,9 @@
     <w:uiPriority w:val="99"/>
     <w:unhideWhenUsed/>
     <w:qFormat/>
-    <w:rsid w:val="0065446b"/>
-    <w:pPr/>
+    <w:rsid w:val="0065446B"/>
     <w:rPr>
-      <w:rFonts w:ascii="Calibri" w:hAnsi="Calibri" w:cs="" w:cstheme="minorBidi"/>
+      <w:rFonts w:ascii="Calibri" w:hAnsi="Calibri" w:cstheme="minorBidi"/>
       <w:szCs w:val="21"/>
     </w:rPr>
   </w:style>
@@ -4272,46 +3893,24 @@
     <w:basedOn w:val="Normal"/>
     <w:uiPriority w:val="99"/>
     <w:qFormat/>
-    <w:rsid w:val="00a64310"/>
-    <w:pPr/>
+    <w:rsid w:val="00A64310"/>
     <w:rPr>
       <w:rFonts w:ascii="Times New Roman" w:hAnsi="Times New Roman"/>
       <w:sz w:val="24"/>
     </w:rPr>
   </w:style>
-  <w:style w:type="numbering" w:styleId="NoList" w:default="1">
-    <w:name w:val="No List"/>
-    <w:uiPriority w:val="99"/>
-    <w:semiHidden/>
-    <w:unhideWhenUsed/>
-    <w:qFormat/>
-  </w:style>
-  <w:style w:type="table" w:default="1" w:styleId="TableNormal">
-    <w:name w:val="Normal Table"/>
-    <w:uiPriority w:val="99"/>
-    <w:semiHidden/>
-    <w:unhideWhenUsed/>
-    <w:tblPr>
-      <w:tblCellMar>
-        <w:top w:w="0" w:type="dxa"/>
-        <w:left w:w="108" w:type="dxa"/>
-        <w:bottom w:w="0" w:type="dxa"/>
-        <w:right w:w="108" w:type="dxa"/>
-      </w:tblCellMar>
-    </w:tblPr>
-  </w:style>
   <w:style w:type="table" w:styleId="TableGrid">
     <w:name w:val="Table Grid"/>
     <w:basedOn w:val="TableNormal"/>
-    <w:rsid w:val="006e7fc7"/>
+    <w:rsid w:val="006E7FC7"/>
     <w:tblPr>
       <w:tblBorders>
-        <w:top w:val="single" w:color="auto" w:sz="4" w:space="0"/>
-        <w:left w:val="single" w:color="auto" w:sz="4" w:space="0"/>
-        <w:bottom w:val="single" w:color="auto" w:sz="4" w:space="0"/>
-        <w:right w:val="single" w:color="auto" w:sz="4" w:space="0"/>
-        <w:insideH w:val="single" w:color="auto" w:sz="4" w:space="0"/>
-        <w:insideV w:val="single" w:color="auto" w:sz="4" w:space="0"/>
+        <w:top w:val="single" w:sz="4" w:space="0" w:color="auto"/>
+        <w:left w:val="single" w:sz="4" w:space="0" w:color="auto"/>
+        <w:bottom w:val="single" w:sz="4" w:space="0" w:color="auto"/>
+        <w:right w:val="single" w:sz="4" w:space="0" w:color="auto"/>
+        <w:insideH w:val="single" w:sz="4" w:space="0" w:color="auto"/>
+        <w:insideV w:val="single" w:sz="4" w:space="0" w:color="auto"/>
       </w:tblBorders>
     </w:tblPr>
   </w:style>
@@ -4319,17 +3918,17 @@
     <w:name w:val="Plain Table 1"/>
     <w:basedOn w:val="TableNormal"/>
     <w:uiPriority w:val="41"/>
-    <w:rsid w:val="00fc354c"/>
+    <w:rsid w:val="00FC354C"/>
     <w:tblPr>
       <w:tblStyleRowBandSize w:val="1"/>
       <w:tblStyleColBandSize w:val="1"/>
       <w:tblBorders>
-        <w:top w:val="single" w:color="BFBFBF" w:themeColor="background1" w:themeShade="bf" w:sz="4" w:space="0"/>
-        <w:left w:val="single" w:color="BFBFBF" w:themeColor="background1" w:themeShade="bf" w:sz="4" w:space="0"/>
-        <w:bottom w:val="single" w:color="BFBFBF" w:themeColor="background1" w:themeShade="bf" w:sz="4" w:space="0"/>
-        <w:right w:val="single" w:color="BFBFBF" w:themeColor="background1" w:themeShade="bf" w:sz="4" w:space="0"/>
-        <w:insideH w:val="single" w:color="BFBFBF" w:themeColor="background1" w:themeShade="bf" w:sz="4" w:space="0"/>
-        <w:insideV w:val="single" w:color="BFBFBF" w:themeColor="background1" w:themeShade="bf" w:sz="4" w:space="0"/>
+        <w:top w:val="single" w:sz="4" w:space="0" w:color="BFBFBF" w:themeColor="background1" w:themeShade="BF"/>
+        <w:left w:val="single" w:sz="4" w:space="0" w:color="BFBFBF" w:themeColor="background1" w:themeShade="BF"/>
+        <w:bottom w:val="single" w:sz="4" w:space="0" w:color="BFBFBF" w:themeColor="background1" w:themeShade="BF"/>
+        <w:right w:val="single" w:sz="4" w:space="0" w:color="BFBFBF" w:themeColor="background1" w:themeShade="BF"/>
+        <w:insideH w:val="single" w:sz="4" w:space="0" w:color="BFBFBF" w:themeColor="background1" w:themeShade="BF"/>
+        <w:insideV w:val="single" w:sz="4" w:space="0" w:color="BFBFBF" w:themeColor="background1" w:themeShade="BF"/>
       </w:tblBorders>
     </w:tblPr>
     <w:tblStylePr w:type="firstRow">
@@ -4337,7 +3936,6 @@
         <w:b/>
         <w:bCs/>
       </w:rPr>
-      <w:tblPr/>
     </w:tblStylePr>
     <w:tblStylePr w:type="lastRow">
       <w:rPr>
@@ -4347,7 +3945,7 @@
       <w:tblPr/>
       <w:tcPr>
         <w:tcBorders>
-          <w:top w:val="double" w:color="BFBFBF" w:themeColor="background1" w:sz="4" w:space="0"/>
+          <w:top w:val="double" w:sz="4" w:space="0" w:color="FFFFFF" w:themeColor="background1"/>
         </w:tcBorders>
       </w:tcPr>
     </w:tblStylePr>
@@ -4356,25 +3954,23 @@
         <w:b/>
         <w:bCs/>
       </w:rPr>
-      <w:tblPr/>
     </w:tblStylePr>
     <w:tblStylePr w:type="lastCol">
       <w:rPr>
         <w:b/>
         <w:bCs/>
       </w:rPr>
-      <w:tblPr/>
     </w:tblStylePr>
     <w:tblStylePr w:type="band1Vert">
       <w:tblPr/>
       <w:tcPr>
-        <w:shd w:val="clear" w:color="auto" w:fill="F2F2F2" w:themeFill="background1" w:themeFillShade="f2"/>
+        <w:shd w:val="clear" w:color="auto" w:fill="F2F2F2" w:themeFill="background1" w:themeFillShade="F2"/>
       </w:tcPr>
     </w:tblStylePr>
     <w:tblStylePr w:type="band1Horz">
       <w:tblPr/>
       <w:tcPr>
-        <w:shd w:val="clear" w:color="auto" w:fill="F2F2F2" w:themeFill="background1" w:themeFillShade="f2"/>
+        <w:shd w:val="clear" w:color="auto" w:fill="F2F2F2" w:themeFill="background1" w:themeFillShade="F2"/>
       </w:tcPr>
     </w:tblStylePr>
   </w:style>
@@ -4382,7 +3978,7 @@
 </file>
 
 <file path=word/theme/theme1.xml><?xml version="1.0" encoding="utf-8"?>
-<a:theme xmlns:a="http://schemas.openxmlformats.org/drawingml/2006/main" xmlns:r="http://schemas.openxmlformats.org/officeDocument/2006/relationships" name="Office Theme">
+<a:theme xmlns:a="http://schemas.openxmlformats.org/drawingml/2006/main" name="Office Theme">
   <a:themeElements>
     <a:clrScheme name="Office">
       <a:dk1>
@@ -4424,12 +4020,12 @@
     </a:clrScheme>
     <a:fontScheme name="Office">
       <a:majorFont>
-        <a:latin typeface="Calibri Light" panose="020F0302020204030204" pitchFamily="0" charset="1"/>
+        <a:latin typeface="Calibri Light" panose="020F0302020204030204"/>
         <a:ea typeface=""/>
         <a:cs typeface=""/>
       </a:majorFont>
       <a:minorFont>
-        <a:latin typeface="Calibri" panose="020F0502020204030204" pitchFamily="0" charset="1"/>
+        <a:latin typeface="Calibri" panose="020F0502020204030204"/>
         <a:ea typeface=""/>
         <a:cs typeface=""/>
       </a:minorFont>
@@ -4461,7 +4057,7 @@
             </a:gs>
           </a:gsLst>
           <a:lin ang="5400000" scaled="0"/>
-          <a:tileRect l="0" t="0" r="0" b="0"/>
+          <a:tileRect/>
         </a:gradFill>
         <a:gradFill>
           <a:gsLst>
@@ -4485,7 +4081,7 @@
             </a:gs>
           </a:gsLst>
           <a:lin ang="5400000" scaled="0"/>
-          <a:tileRect l="0" t="0" r="0" b="0"/>
+          <a:tileRect/>
         </a:gradFill>
       </a:fillStyleLst>
       <a:lnStyleLst>
@@ -4545,11 +4141,13 @@
             </a:gs>
           </a:gsLst>
           <a:lin ang="5400000" scaled="0"/>
-          <a:tileRect l="0" t="0" r="0" b="0"/>
+          <a:tileRect/>
         </a:gradFill>
       </a:bgFillStyleLst>
     </a:fmtScheme>
   </a:themeElements>
+  <a:objectDefaults/>
+  <a:extraClrSchemeLst/>
 </a:theme>
 </file>
 

</xml_diff>

<commit_message>
Assignment 4: updated docx, uses 2 clusters instead of 3 now
</commit_message>
<xml_diff>
--- a/Assignment-4/CGS4144_Assn4.docx
+++ b/Assignment-4/CGS4144_Assn4.docx
@@ -1150,7 +1150,31 @@
         <w:rPr>
           <w:color w:val="EE0000"/>
         </w:rPr>
-        <w:t xml:space="preserve">For Random Forest, I used three clusters from Gaussian Mixture and got a 98.17% accuracy when it used 80% of samples for training and the remaining 20 for testing. This high accuracy suggests that Random Forest </w:t>
+        <w:t xml:space="preserve">For Random Forest, I used </w:t>
+      </w:r>
+      <w:r>
+        <w:rPr>
+          <w:color w:val="EE0000"/>
+        </w:rPr>
+        <w:t>2</w:t>
+      </w:r>
+      <w:r>
+        <w:rPr>
+          <w:color w:val="EE0000"/>
+        </w:rPr>
+        <w:t xml:space="preserve"> clusters from Gaussian Mixture and got a </w:t>
+      </w:r>
+      <w:r>
+        <w:rPr>
+          <w:color w:val="EE0000"/>
+        </w:rPr>
+        <w:t>100</w:t>
+      </w:r>
+      <w:r>
+        <w:rPr>
+          <w:color w:val="EE0000"/>
+        </w:rPr>
+        <w:t xml:space="preserve">% accuracy when it used 80% of samples for training and the remaining 20 for testing. This high accuracy suggests that Random Forest </w:t>
       </w:r>
       <w:proofErr w:type="gramStart"/>
       <w:r>
@@ -1165,6 +1189,12 @@
           <w:color w:val="EE0000"/>
         </w:rPr>
         <w:t xml:space="preserve"> reproduce the clusters from gaussian Mixture. </w:t>
+      </w:r>
+      <w:r>
+        <w:rPr>
+          <w:color w:val="EE0000"/>
+        </w:rPr>
+        <w:t>However, this does not mean it was able to correctly distinguish between TB and Healthy or any meaningful separation, as the silhouette score was only 0.0453,</w:t>
       </w:r>
     </w:p>
     <w:p>
@@ -1380,6 +1410,32 @@
     </w:p>
     <w:p>
       <w:pPr>
+        <w:rPr>
+          <w:i/>
+          <w:iCs/>
+          <w:color w:val="EE0000"/>
+        </w:rPr>
+      </w:pPr>
+      <w:r>
+        <w:rPr>
+          <w:i/>
+          <w:iCs/>
+          <w:color w:val="EE0000"/>
+        </w:rPr>
+        <w:t xml:space="preserve">Random Forest was used to predict the 2 Gaussian Mixture clusters. The model predicted that of the 164 samples, 70 belonged to cluster 0 and 94 samples in cluster 1.  The model correctly predicted all 164 clusters as the accuracy was 100%. </w:t>
+      </w:r>
+    </w:p>
+    <w:p>
+      <w:pPr>
+        <w:rPr>
+          <w:i/>
+          <w:iCs/>
+          <w:color w:val="EE0000"/>
+        </w:rPr>
+      </w:pPr>
+    </w:p>
+    <w:p>
+      <w:pPr>
         <w:pStyle w:val="ListParagraph"/>
         <w:numPr>
           <w:ilvl w:val="1"/>
@@ -1414,7 +1470,16 @@
           <w:iCs/>
           <w:color w:val="EE0000"/>
         </w:rPr>
-        <w:t xml:space="preserve">To evaluate prediction stability, we generated disease and cluster predictions for the same 164 test samples using logistic regression. The predictions were saved so they could be compared with the other supervised learning methods. Once all models are combined, we will calculate the proportion of models agreeing on each sample's disease and cluster labels. Spearman's correlation test will then be used to determine whether disease prediction stability correlates with cluster prediction stability. If multiple statistical tests are performed, p-values will be adjusted using the </w:t>
+        <w:t xml:space="preserve">To evaluate prediction stability, we generated disease and cluster predictions for the same 164 test samples using logistic regression. The predictions were saved so they could be compared with the other supervised learning methods. Once all models are combined, we will calculate the proportion of models agreeing on each sample's disease and cluster labels. Spearman's correlation test will then be used to determine whether disease prediction stability </w:t>
+      </w:r>
+      <w:r>
+        <w:rPr>
+          <w:i/>
+          <w:iCs/>
+          <w:color w:val="EE0000"/>
+        </w:rPr>
+        <w:lastRenderedPageBreak/>
+        <w:t xml:space="preserve">correlates with cluster prediction stability. If multiple statistical tests are performed, p-values will be adjusted using the </w:t>
       </w:r>
       <w:proofErr w:type="spellStart"/>
       <w:r>
@@ -1496,7 +1561,6 @@
           <w:iCs/>
           <w:color w:val="064462"/>
         </w:rPr>
-        <w:lastRenderedPageBreak/>
         <w:t xml:space="preserve">How did the number of genes affect the results? </w:t>
       </w:r>
     </w:p>
@@ -2342,7 +2406,16 @@
           <w:iCs/>
           <w:color w:val="EE0000"/>
         </w:rPr>
-        <w:t>For disease classification, the AUC increased from 0.8336 with 10 genes to 0.9911 with 100 genes, 0.9920 with 1,000 genes, and 1.0000 with 10,000 genes. For cluster classification, the AUC increased from 0.7791 with 10 genes to 1.0000 with 100 genes and remained at 1.0000 for both 1,000 and 10,000 genes. These results show that increasing the number of genes generally improved AUC, although the improvement became smaller as more genes were included. Despite the high AUC values, classification accuracy did not consistently increase, indicating that additional genes did not always improve predictions at the default classification threshold.</w:t>
+        <w:t xml:space="preserve">For disease classification, the AUC increased from 0.8336 with 10 genes to 0.9911 with 100 genes, 0.9920 with 1,000 genes, and 1.0000 with 10,000 genes. For cluster classification, the AUC increased from 0.7791 with 10 genes to 1.0000 with 100 genes and remained at 1.0000 for both 1,000 and 10,000 genes. These results show that increasing the number of genes generally improved AUC, although the improvement became smaller as more genes were included. </w:t>
+      </w:r>
+      <w:r>
+        <w:rPr>
+          <w:i/>
+          <w:iCs/>
+          <w:color w:val="EE0000"/>
+        </w:rPr>
+        <w:lastRenderedPageBreak/>
+        <w:t>Despite the high AUC values, classification accuracy did not consistently increase, indicating that additional genes did not always improve predictions at the default classification threshold.</w:t>
       </w:r>
     </w:p>
     <w:p>
@@ -2390,7 +2463,6 @@
           <w:iCs/>
           <w:color w:val="064462"/>
         </w:rPr>
-        <w:lastRenderedPageBreak/>
         <w:t>Heatmaps and Dendrograms</w:t>
       </w:r>
     </w:p>
@@ -2562,7 +2634,16 @@
           <w:iCs/>
           <w:color w:val="EE0000"/>
         </w:rPr>
-        <w:t>A heatmap was generated using the 50 genes with the largest absolute coefficients from the disease classification logistic regression model. Gene expression values were log2-transformed and standardized using Z-scores to compare expression patterns across samples. Samples were annotated according to their original disease groups, tuberculosis subjects and healthy controls. Hierarchical clustering was applied to both genes and samples, producing row and column dendrograms to visualize similarities in gene expression patterns. The heatmap includes a legend for the sample groups and standardized expression values.</w:t>
+        <w:t xml:space="preserve">A heatmap was generated using the 50 genes with the largest absolute coefficients from the disease classification logistic regression model. Gene expression values were log2-transformed and standardized using Z-scores to compare expression patterns across samples. Samples were annotated according to their original disease groups, tuberculosis subjects and healthy controls. Hierarchical clustering was applied to both genes and samples, producing row and </w:t>
+      </w:r>
+      <w:r>
+        <w:rPr>
+          <w:i/>
+          <w:iCs/>
+          <w:color w:val="EE0000"/>
+        </w:rPr>
+        <w:lastRenderedPageBreak/>
+        <w:t>column dendrograms to visualize similarities in gene expression patterns. The heatmap includes a legend for the sample groups and standardized expression values.</w:t>
       </w:r>
     </w:p>
     <w:p>

</xml_diff>

<commit_message>
Finished the Naive Bayes implementation and finished answering the questions in the document.
</commit_message>
<xml_diff>
--- a/Assignment-4/CGS4144_Assn4.docx
+++ b/Assignment-4/CGS4144_Assn4.docx
@@ -20,51 +20,6 @@
           <w:szCs w:val="24"/>
         </w:rPr>
         <w:t>CGS4144 Bioinformatics - Assignment 4</w:t>
-      </w:r>
-    </w:p>
-    <w:p>
-      <w:pPr>
-        <w:pStyle w:val="Normal"/>
-        <w:rPr/>
-      </w:pPr>
-      <w:r>
-        <w:rPr/>
-      </w:r>
-    </w:p>
-    <w:p>
-      <w:pPr>
-        <w:pStyle w:val="Heading1"/>
-        <w:rPr>
-          <w:b w:val="false"/>
-          <w:bCs/>
-          <w:color w:val="054361"/>
-        </w:rPr>
-      </w:pPr>
-      <w:r>
-        <w:rPr/>
-        <w:t>Directions:</w:t>
-      </w:r>
-      <w:r>
-        <w:rPr>
-          <w:b w:val="false"/>
-          <w:bCs/>
-          <w:color w:val="054361"/>
-        </w:rPr>
-        <w:t xml:space="preserve"> Following the directions below, analyze your data. Save the images and write a short summary of how they were made and what you discovered. </w:t>
-      </w:r>
-      <w:r>
-        <w:rPr>
-          <w:color w:val="054361"/>
-        </w:rPr>
-        <w:t>Work and submit as a team.</w:t>
-      </w:r>
-      <w:r>
-        <w:rPr>
-          <w:b w:val="false"/>
-          <w:bCs/>
-          <w:color w:val="054361"/>
-        </w:rPr>
-        <w:t xml:space="preserve"> Create a work document with your teammates names at the top followed by your results, to be submitted on Canvas. </w:t>
       </w:r>
     </w:p>
     <w:p>
@@ -166,20 +121,6 @@
         <w:t xml:space="preserve"> </w:t>
       </w:r>
     </w:p>
-    <w:p>
-      <w:pPr>
-        <w:pStyle w:val="Normal"/>
-        <w:rPr>
-          <w:color w:val="044361"/>
-        </w:rPr>
-      </w:pPr>
-      <w:r>
-        <w:rPr>
-          <w:color w:val="044361"/>
-        </w:rPr>
-        <w:t>Add the full names, email addresses, and GitHub handles for each team member (1-3 people total) to this table:</w:t>
-      </w:r>
-    </w:p>
     <w:tbl>
       <w:tblPr>
         <w:tblStyle w:val="TableGrid"/>
@@ -362,7 +303,7 @@
                 <w:kern w:val="0"/>
                 <w:lang w:val="en-US" w:eastAsia="en-US" w:bidi="ar-SA"/>
               </w:rPr>
-              <w:t xml:space="preserve">                </w:t>
+              <w:t xml:space="preserve">             </w:t>
             </w:r>
             <w:r>
               <w:rPr>
@@ -573,12 +514,15 @@
         <w:rPr/>
         <w:t xml:space="preserve"> </w:t>
       </w:r>
-      <w:r>
-        <w:rPr>
-          <w:color w:val="054361"/>
-        </w:rPr>
-        <w:t>&lt;Link to your dataset &gt;</w:t>
-      </w:r>
+      <w:hyperlink r:id="rId3">
+        <w:r>
+          <w:rPr>
+            <w:rStyle w:val="Hyperlink"/>
+            <w:color w:val="054361"/>
+          </w:rPr>
+          <w:t>https://www.refine.bio/dataset/31f09143-bf06-4a05-adcf-6c9c0e1d892f</w:t>
+        </w:r>
+      </w:hyperlink>
     </w:p>
     <w:p>
       <w:pPr>
@@ -611,7 +555,7 @@
         <w:rPr>
           <w:color w:val="054361"/>
         </w:rPr>
-        <w:t>&lt; Question you will answer using the data you’ve selected &gt;</w:t>
+        <w:t>Can gene expression patterns in blood distinguish tuberculosis patients who have different treatment outcomes?</w:t>
       </w:r>
     </w:p>
     <w:p>
@@ -639,12 +583,15 @@
         <w:rPr/>
         <w:t xml:space="preserve"> </w:t>
       </w:r>
-      <w:r>
-        <w:rPr>
-          <w:color w:val="054361"/>
-        </w:rPr>
-        <w:t>&lt; Link to your team GitHub repository &gt;</w:t>
-      </w:r>
+      <w:hyperlink r:id="rId4">
+        <w:r>
+          <w:rPr>
+            <w:rStyle w:val="Hyperlink"/>
+            <w:color w:val="054361"/>
+          </w:rPr>
+          <w:t>https://github.com/E53klasky/CGS4144</w:t>
+        </w:r>
+      </w:hyperlink>
     </w:p>
     <w:p>
       <w:pPr>
@@ -1009,7 +956,7 @@
           <w:color w:val="064462"/>
         </w:rPr>
       </w:pPr>
-      <w:hyperlink r:id="rId3">
+      <w:hyperlink r:id="rId5">
         <w:r>
           <w:rPr>
             <w:rStyle w:val="Hyperlink"/>
@@ -1033,7 +980,7 @@
           <w:color w:val="064462"/>
         </w:rPr>
       </w:pPr>
-      <w:hyperlink r:id="rId4">
+      <w:hyperlink r:id="rId6">
         <w:r>
           <w:rPr>
             <w:rStyle w:val="Hyperlink"/>
@@ -1065,7 +1012,7 @@
           <w:color w:val="064462"/>
         </w:rPr>
       </w:pPr>
-      <w:hyperlink r:id="rId5">
+      <w:hyperlink r:id="rId7">
         <w:r>
           <w:rPr>
             <w:rStyle w:val="Hyperlink"/>
@@ -1097,7 +1044,7 @@
           <w:color w:val="064462"/>
         </w:rPr>
       </w:pPr>
-      <w:hyperlink r:id="rId6">
+      <w:hyperlink r:id="rId8">
         <w:r>
           <w:rPr>
             <w:rStyle w:val="Hyperlink"/>
@@ -2494,8 +2441,8 @@
       </w:tblPr>
       <w:tblGrid>
         <w:gridCol w:w="3385"/>
-        <w:gridCol w:w="3356"/>
-        <w:gridCol w:w="3634"/>
+        <w:gridCol w:w="3354"/>
+        <w:gridCol w:w="3636"/>
       </w:tblGrid>
       <w:tr>
         <w:trPr>
@@ -2534,7 +2481,7 @@
         </w:tc>
         <w:tc>
           <w:tcPr>
-            <w:tcW w:w="3356" w:type="dxa"/>
+            <w:tcW w:w="3354" w:type="dxa"/>
             <w:tcBorders/>
           </w:tcPr>
           <w:p>
@@ -2565,7 +2512,7 @@
         </w:tc>
         <w:tc>
           <w:tcPr>
-            <w:tcW w:w="3634" w:type="dxa"/>
+            <w:tcW w:w="3636" w:type="dxa"/>
             <w:tcBorders/>
           </w:tcPr>
           <w:p>
@@ -2632,7 +2579,7 @@
         </w:tc>
         <w:tc>
           <w:tcPr>
-            <w:tcW w:w="3356" w:type="dxa"/>
+            <w:tcW w:w="3354" w:type="dxa"/>
             <w:tcBorders/>
           </w:tcPr>
           <w:p>
@@ -2663,7 +2610,7 @@
         </w:tc>
         <w:tc>
           <w:tcPr>
-            <w:tcW w:w="3634" w:type="dxa"/>
+            <w:tcW w:w="3636" w:type="dxa"/>
             <w:tcBorders/>
           </w:tcPr>
           <w:p>
@@ -2730,7 +2677,7 @@
         </w:tc>
         <w:tc>
           <w:tcPr>
-            <w:tcW w:w="3356" w:type="dxa"/>
+            <w:tcW w:w="3354" w:type="dxa"/>
             <w:tcBorders/>
           </w:tcPr>
           <w:p>
@@ -2761,7 +2708,7 @@
         </w:tc>
         <w:tc>
           <w:tcPr>
-            <w:tcW w:w="3634" w:type="dxa"/>
+            <w:tcW w:w="3636" w:type="dxa"/>
             <w:tcBorders/>
           </w:tcPr>
           <w:p>
@@ -2839,7 +2786,7 @@
         </w:tc>
         <w:tc>
           <w:tcPr>
-            <w:tcW w:w="3356" w:type="dxa"/>
+            <w:tcW w:w="3354" w:type="dxa"/>
             <w:tcBorders/>
           </w:tcPr>
           <w:p>
@@ -2870,7 +2817,7 @@
         </w:tc>
         <w:tc>
           <w:tcPr>
-            <w:tcW w:w="3634" w:type="dxa"/>
+            <w:tcW w:w="3636" w:type="dxa"/>
             <w:tcBorders/>
           </w:tcPr>
           <w:p>
@@ -2937,7 +2884,7 @@
         </w:tc>
         <w:tc>
           <w:tcPr>
-            <w:tcW w:w="3356" w:type="dxa"/>
+            <w:tcW w:w="3354" w:type="dxa"/>
             <w:tcBorders/>
           </w:tcPr>
           <w:p>
@@ -2968,7 +2915,7 @@
         </w:tc>
         <w:tc>
           <w:tcPr>
-            <w:tcW w:w="3634" w:type="dxa"/>
+            <w:tcW w:w="3636" w:type="dxa"/>
             <w:tcBorders/>
           </w:tcPr>
           <w:p>
@@ -4229,7 +4176,7 @@
                     </pic:cNvPicPr>
                   </pic:nvPicPr>
                   <pic:blipFill>
-                    <a:blip r:embed="rId7"/>
+                    <a:blip r:embed="rId9"/>
                     <a:stretch>
                       <a:fillRect/>
                     </a:stretch>
@@ -4283,7 +4230,7 @@
           <w:iCs/>
           <w:color w:val="EE0000"/>
         </w:rPr>
-        <w:t>A heatmap was generated using the 50 genes with the largest absolute coefficients from the disease classification logistic regression model. Gene expression values were log2-transformed and standardized using Z-scores to compare expression patterns across samples. Samples were annotated according to their original disease groups, tuberculosis subjects and healthy controls. Hierarchical clustering was applied to both genes and samples, producing row and column dendrograms to visualize similarities in gene expression patterns. The heatmap includes a legend for the sample groups and standardized expression values.</w:t>
+        <w:t>A heatmap was generated using the top 50 genes from each method. For the Logistic Regression method we ranked by largest absolute coefficients, for the Random Forest method we ranked by feature importance, and for the Naive Bayes method we ranked by absolute standardized mean. Gene expression values were log2-transformed and standardized using Z-scores to compare expression patterns across samples. Samples were annotated according to their original disease groups, tuberculosis subjects and healthy controls. Hierarchical clustering was applied to both genes and samples, producing row and column dendrograms to visualize similarities in gene expression patterns. The heatmap includes a legend for the sample groups and standardized expression values.</w:t>
       </w:r>
     </w:p>
     <w:p>
@@ -4347,27 +4294,10 @@
         <w:t xml:space="preserve">Combine all results into a single file, submit on Canvas. Only one student on the team needs to submit. Make sure that all your code and results are added to your GitHub repository. </w:t>
       </w:r>
     </w:p>
-    <w:p>
-      <w:pPr>
-        <w:pStyle w:val="ListParagraph"/>
-        <w:rPr>
-          <w:i/>
-          <w:iCs/>
-          <w:color w:val="064462"/>
-        </w:rPr>
-      </w:pPr>
-      <w:r>
-        <w:rPr>
-          <w:i/>
-          <w:iCs/>
-          <w:color w:val="064462"/>
-        </w:rPr>
-      </w:r>
-    </w:p>
     <w:sectPr>
-      <w:footerReference w:type="even" r:id="rId8"/>
-      <w:footerReference w:type="default" r:id="rId9"/>
-      <w:footerReference w:type="first" r:id="rId10"/>
+      <w:footerReference w:type="even" r:id="rId10"/>
+      <w:footerReference w:type="default" r:id="rId11"/>
+      <w:footerReference w:type="first" r:id="rId12"/>
       <w:type w:val="nextPage"/>
       <w:pgSz w:w="12240" w:h="15840"/>
       <w:pgMar w:left="720" w:right="720" w:gutter="0" w:header="0" w:top="720" w:footer="720" w:bottom="777"/>

</xml_diff>